<commit_message>
Update documentation: month-on-month, licence renewals, SharePoint classification, one-off mode, saved-client edit/delete
Co-Authored-By: Claude Sonnet 5.5 <noreply@anthropic.com>
</commit_message>
<xml_diff>
--- a/docs/Intune_Report_Architecture.docx
+++ b/docs/Intune_Report_Architecture.docx
@@ -108,7 +108,7 @@
                 <w:sz w:val="18"/>
                 <w:szCs w:val="18"/>
               </w:rPr>
-              <w:t xml:space="preserve">September 2026</w:t>
+              <w:t>October 2026</w:t>
             </w:r>
           </w:p>
         </w:tc>
@@ -158,7 +158,7 @@
           <w:sz w:val="19"/>
           <w:szCs w:val="19"/>
         </w:rPr>
-        <w:t xml:space="preserve">The Integricity MSP Report Builder is a web application that generates monthly IT health reports for client Microsoft 365 and Intune tenants. It runs entirely on Netlify — a single-page front end plus five serverless functions — and calls the Microsoft Graph API directly from the server side using per-session, per-tenant credentials (browser wizard) or stored per-client credentials (report-hub integration).</w:t>
+        <w:t>The Integricity MSP Report Builder is a web application that generates monthly IT health reports for client Microsoft 365 and Intune tenants. It runs entirely on Netlify — a single-page front end plus six serverless functions — and calls the Microsoft Graph API directly from the server side using per-tenant credentials entered in the browser wizard (never stored on the server) or stored per-client credentials (report-hub integration). A small Netlify Blobs store keeps summary figures from each report so the next one can show month-on-month changes.</w:t>
       </w:r>
     </w:p>
     <w:p>
@@ -558,7 +558,7 @@
                 <w:sz w:val="18"/>
                 <w:szCs w:val="18"/>
               </w:rPr>
-              <w:t xml:space="preserve">Five Netlify serverless functions (Node.js)</w:t>
+              <w:t>Six Netlify serverless functions (Node.js)</w:t>
             </w:r>
           </w:p>
         </w:tc>
@@ -786,7 +786,83 @@
                 <w:sz w:val="18"/>
                 <w:szCs w:val="18"/>
               </w:rPr>
-              <w:t xml:space="preserve">Browser wizard: none, session memory only. Report-hub integration: server-side, via the INTUNE_CLIENTS_JSON environment variable</w:t>
+              <w:t>Browser wizard: never stored on the server; optionally saved by the user in that browser’s own local storage (secret in plain text) until deleted. Report-hub integration: server-side, via the INTUNE_CLIENTS_JSON environment variable</w:t>
+            </w:r>
+          </w:p>
+        </w:tc>
+      </w:tr>
+      <w:tr>
+        <w:tc>
+          <w:tcPr>
+            <w:tcW w:type="dxa" w:w="2995"/>
+            <w:tcBorders>
+              <w:top w:val="single" w:color="E5E7EB" w:sz="4"/>
+              <w:left w:val="single" w:color="E5E7EB" w:sz="4"/>
+              <w:bottom w:val="single" w:color="E5E7EB" w:sz="4"/>
+              <w:right w:val="single" w:color="E5E7EB" w:sz="4"/>
+            </w:tcBorders>
+            <w:shd w:fill="F9FAFB" w:val="clear"/>
+            <w:tcMar>
+              <w:top w:type="dxa" w:w="80"/>
+              <w:left w:type="dxa" w:w="120"/>
+              <w:bottom w:type="dxa" w:w="80"/>
+              <w:right w:type="dxa" w:w="120"/>
+            </w:tcMar>
+          </w:tcPr>
+          <w:p>
+            <w:pPr>
+              <w:spacing w:after="0" w:before="0"/>
+              <w:jc w:val="left"/>
+            </w:pPr>
+            <w:r>
+              <w:rPr>
+                <w:rFonts w:ascii="Calibri" w:cs="Calibri" w:eastAsia="Calibri" w:hAnsi="Calibri"/>
+                <w:b/>
+                <w:bCs/>
+                <w:i w:val="false"/>
+                <w:iCs w:val="false"/>
+                <w:color w:val="1F2937"/>
+                <w:sz w:val="18"/>
+                <w:szCs w:val="18"/>
+              </w:rPr>
+              <w:t>Metrics archive</w:t>
+            </w:r>
+          </w:p>
+        </w:tc>
+        <w:tc>
+          <w:tcPr>
+            <w:tcW w:type="dxa" w:w="6365"/>
+            <w:tcBorders>
+              <w:top w:val="single" w:color="E5E7EB" w:sz="4"/>
+              <w:left w:val="single" w:color="E5E7EB" w:sz="4"/>
+              <w:bottom w:val="single" w:color="E5E7EB" w:sz="4"/>
+              <w:right w:val="single" w:color="E5E7EB" w:sz="4"/>
+            </w:tcBorders>
+            <w:shd w:fill="F9FAFB" w:val="clear"/>
+            <w:tcMar>
+              <w:top w:type="dxa" w:w="80"/>
+              <w:left w:type="dxa" w:w="120"/>
+              <w:bottom w:type="dxa" w:w="80"/>
+              <w:right w:type="dxa" w:w="120"/>
+            </w:tcMar>
+          </w:tcPr>
+          <w:p>
+            <w:pPr>
+              <w:spacing w:after="0" w:before="0"/>
+              <w:jc w:val="left"/>
+            </w:pPr>
+            <w:r>
+              <w:rPr>
+                <w:rFonts w:ascii="Calibri" w:cs="Calibri" w:eastAsia="Calibri" w:hAnsi="Calibri"/>
+                <w:b w:val="false"/>
+                <w:bCs w:val="false"/>
+                <w:i w:val="false"/>
+                <w:iCs w:val="false"/>
+                <w:color w:val="6B7280"/>
+                <w:sz w:val="18"/>
+                <w:szCs w:val="18"/>
+              </w:rPr>
+              <w:t>Netlify Blobs store msp-report-metrics — summary figures only (no raw tenant data, no credentials), keyed by tenant ID and month, rolling 13-month retention</w:t>
             </w:r>
           </w:p>
         </w:tc>
@@ -836,7 +912,7 @@
           <w:sz w:val="19"/>
           <w:szCs w:val="19"/>
         </w:rPr>
-        <w:t xml:space="preserve">Data flows left to right: the account manager enters tenant credentials into the browser app, which calls Microsoft Graph on the server side, reads data from the client tenant, and renders both an on-screen report and a Word/PDF export. A second, parallel path (top of diagram) shows report-hub — a separate consumer application — reaching the same Netlify app through clients.js and report-data.js, using credentials held server-side in lib/clients-store.js rather than the browser wizard's session-only credentials.</w:t>
+        <w:t>Data flows left to right: the account manager enters tenant credentials into the browser app, which calls Microsoft Graph on the server side, reads data from the client tenant, and renders both an on-screen report and a Word/PDF export. A second, parallel path (top of diagram) shows report-hub — a separate consumer application — reaching the same Netlify app through clients.js and report-data.js, using credentials held server-side in lib/clients-store.js rather than credentials entered in the browser wizard. A Netlify Blobs store (bottom left) holds the month-on-month summary figures that intune.js reads and writes.</w:t>
       </w:r>
     </w:p>
     <w:p>
@@ -971,7 +1047,7 @@
           <w:sz w:val="19"/>
           <w:szCs w:val="19"/>
         </w:rPr>
-        <w:t xml:space="preserve">Page 1 — select a saved credential set or enter new Tenant ID / Client ID / Client Secret</w:t>
+        <w:t>Page 1 — select a saved client or enter a new Tenant ID / Client ID / Client Secret. Each saved client has a pencil (edit) and bin (delete) button; saved clients live in the browser’s local storage (secret in plain text), never on the server</w:t>
       </w:r>
     </w:p>
     <w:p>
@@ -994,7 +1070,7 @@
           <w:sz w:val="19"/>
           <w:szCs w:val="19"/>
         </w:rPr>
-        <w:t xml:space="preserve">Page 2 — set the report period and account manager name</w:t>
+        <w:t>Page 2 — set the report period (defaults to the previous full calendar month) and account manager name, optionally tick One-off report (skips, and deletes, the tenant’s month-on-month history), then pull data (triggers the intune function)</w:t>
       </w:r>
     </w:p>
     <w:p>
@@ -1017,7 +1093,7 @@
           <w:sz w:val="19"/>
           <w:szCs w:val="19"/>
         </w:rPr>
-        <w:t xml:space="preserve">Page 3 — pull data (triggers the intune function), review KPIs, add manual commentary</w:t>
+        <w:t>Page 3 — review the auto-pulled KPIs (including a review-only Site templates detected table) and add manual commentary</w:t>
       </w:r>
     </w:p>
     <w:p>
@@ -1040,70 +1116,7 @@
           <w:sz w:val="19"/>
           <w:szCs w:val="19"/>
         </w:rPr>
-        <w:t xml:space="preserve">Page 4 — full on-screen report, with Export to Word and browser print-to-PDF</w:t>
-      </w:r>
-    </w:p>
-    <w:p>
-      <w:pPr>
-        <w:spacing w:after="120" w:before="0"/>
-        <w:jc w:val="left"/>
-      </w:pPr>
-    </w:p>
-    <w:p>
-      <w:pPr>
-        <w:pStyle w:val="Heading2"/>
-        <w:spacing w:after="80" w:before="240"/>
-      </w:pPr>
-      <w:r>
-        <w:rPr>
-          <w:rFonts w:ascii="Calibri" w:cs="Calibri" w:eastAsia="Calibri" w:hAnsi="Calibri"/>
-          <w:b/>
-          <w:bCs/>
-          <w:i w:val="false"/>
-          <w:iCs w:val="false"/>
-          <w:color w:val="1F2937"/>
-          <w:sz w:val="24"/>
-          <w:szCs w:val="24"/>
-        </w:rPr>
-        <w:t xml:space="preserve">3.2 Back end — Netlify Functions</w:t>
-      </w:r>
-    </w:p>
-    <w:p>
-      <w:pPr>
-        <w:pStyle w:val="Heading3"/>
-        <w:spacing w:after="60" w:before="180"/>
-      </w:pPr>
-      <w:r>
-        <w:rPr>
-          <w:rFonts w:ascii="Calibri" w:cs="Calibri" w:eastAsia="Calibri" w:hAnsi="Calibri"/>
-          <w:b/>
-          <w:bCs/>
-          <w:i w:val="false"/>
-          <w:iCs w:val="false"/>
-          <w:color w:val="1F2937"/>
-          <w:sz w:val="21"/>
-          <w:szCs w:val="21"/>
-        </w:rPr>
-        <w:t xml:space="preserve">netlify/functions/intune.js</w:t>
-      </w:r>
-    </w:p>
-    <w:p>
-      <w:pPr>
-        <w:spacing w:after="120" w:before="0"/>
-        <w:jc w:val="left"/>
-      </w:pPr>
-      <w:r>
-        <w:rPr>
-          <w:rFonts w:ascii="Calibri" w:cs="Calibri" w:eastAsia="Calibri" w:hAnsi="Calibri"/>
-          <w:b w:val="false"/>
-          <w:bCs w:val="false"/>
-          <w:i w:val="false"/>
-          <w:iCs w:val="false"/>
-          <w:color w:val="1F2937"/>
-          <w:sz w:val="19"/>
-          <w:szCs w:val="19"/>
-        </w:rPr>
-        <w:t xml:space="preserve">The data-gathering function. Accepts tenant credentials and a date range, authenticates against Microsoft Entra ID using the client credentials flow, then issues 16 parallel Graph API calls in a first batch, followed by 2 more parallel sign-in-log calls (full-period and half-period fallback) in a second batch — 18 real Graph API calls in total — to build a single structured JSON payload of 50+ metrics.</w:t>
+        <w:t>Page 4 — full on-screen report, with Export to Word and browser print-to-PDF; the header text links back to the start page</w:t>
       </w:r>
     </w:p>
     <w:p>
@@ -1126,7 +1139,70 @@
           <w:sz w:val="19"/>
           <w:szCs w:val="19"/>
         </w:rPr>
-        <w:t xml:space="preserve">Sign-in log queries (full period + half-period fallback) run as their own parallel batch after the first 16 calls complete — the half-period result is used only if the full-period query errors or times out</w:t>
+        <w:t>index.html renders its on-screen report with its own code (renderPreview for the review step, buildReport for the final report), separate from export-docx.js and export-pdf.js — any report-content change must be made in all four places</w:t>
+      </w:r>
+    </w:p>
+    <w:p>
+      <w:pPr>
+        <w:spacing w:after="120" w:before="0"/>
+        <w:jc w:val="left"/>
+      </w:pPr>
+    </w:p>
+    <w:p>
+      <w:pPr>
+        <w:pStyle w:val="Heading2"/>
+        <w:spacing w:after="80" w:before="240"/>
+      </w:pPr>
+      <w:r>
+        <w:rPr>
+          <w:rFonts w:ascii="Calibri" w:cs="Calibri" w:eastAsia="Calibri" w:hAnsi="Calibri"/>
+          <w:b/>
+          <w:bCs/>
+          <w:i w:val="false"/>
+          <w:iCs w:val="false"/>
+          <w:color w:val="1F2937"/>
+          <w:sz w:val="24"/>
+          <w:szCs w:val="24"/>
+        </w:rPr>
+        <w:t xml:space="preserve">3.2 Back end — Netlify Functions</w:t>
+      </w:r>
+    </w:p>
+    <w:p>
+      <w:pPr>
+        <w:pStyle w:val="Heading3"/>
+        <w:spacing w:after="60" w:before="180"/>
+      </w:pPr>
+      <w:r>
+        <w:rPr>
+          <w:rFonts w:ascii="Calibri" w:cs="Calibri" w:eastAsia="Calibri" w:hAnsi="Calibri"/>
+          <w:b/>
+          <w:bCs/>
+          <w:i w:val="false"/>
+          <w:iCs w:val="false"/>
+          <w:color w:val="1F2937"/>
+          <w:sz w:val="21"/>
+          <w:szCs w:val="21"/>
+        </w:rPr>
+        <w:t xml:space="preserve">netlify/functions/intune.js</w:t>
+      </w:r>
+    </w:p>
+    <w:p>
+      <w:pPr>
+        <w:spacing w:after="120" w:before="0"/>
+        <w:jc w:val="left"/>
+      </w:pPr>
+      <w:r>
+        <w:rPr>
+          <w:rFonts w:ascii="Calibri" w:cs="Calibri" w:eastAsia="Calibri" w:hAnsi="Calibri"/>
+          <w:b w:val="false"/>
+          <w:bCs w:val="false"/>
+          <w:i w:val="false"/>
+          <w:iCs w:val="false"/>
+          <w:color w:val="1F2937"/>
+          <w:sz w:val="19"/>
+          <w:szCs w:val="19"/>
+        </w:rPr>
+        <w:t>The data-gathering function. Accepts tenant credentials and a date range, authenticates against Microsoft Entra ID using the client credentials flow, then issues 17 parallel Graph API calls in a first batch, followed by 2 more parallel sign-in-log calls (full-period and half-period fallback) in a second batch — 19 real Graph API calls in total — to build a single structured JSON payload of 50+ metrics.</w:t>
       </w:r>
     </w:p>
     <w:p>
@@ -1149,7 +1225,7 @@
           <w:sz w:val="19"/>
           <w:szCs w:val="19"/>
         </w:rPr>
-        <w:t xml:space="preserve">Per-IP rate limit: 10 requests / 5 minutes (in-memory, resets on cold start)</w:t>
+        <w:t>Sign-in log queries (full period + half-period fallback) run as their own parallel batch after the first 17 calls complete — the half-period result is used only if the full-period query errors or times out</w:t>
       </w:r>
     </w:p>
     <w:p>
@@ -1172,51 +1248,7 @@
           <w:sz w:val="19"/>
           <w:szCs w:val="19"/>
         </w:rPr>
-        <w:t xml:space="preserve">Typical response time: 3-8 seconds depending on tenant size</w:t>
-      </w:r>
-    </w:p>
-    <w:p>
-      <w:pPr>
-        <w:spacing w:after="120" w:before="0"/>
-        <w:jc w:val="left"/>
-      </w:pPr>
-    </w:p>
-    <w:p>
-      <w:pPr>
-        <w:pStyle w:val="Heading3"/>
-        <w:spacing w:after="60" w:before="180"/>
-      </w:pPr>
-      <w:r>
-        <w:rPr>
-          <w:rFonts w:ascii="Calibri" w:cs="Calibri" w:eastAsia="Calibri" w:hAnsi="Calibri"/>
-          <w:b/>
-          <w:bCs/>
-          <w:i w:val="false"/>
-          <w:iCs w:val="false"/>
-          <w:color w:val="1F2937"/>
-          <w:sz w:val="21"/>
-          <w:szCs w:val="21"/>
-        </w:rPr>
-        <w:t xml:space="preserve">netlify/functions/export-docx.js</w:t>
-      </w:r>
-    </w:p>
-    <w:p>
-      <w:pPr>
-        <w:spacing w:after="120" w:before="0"/>
-        <w:jc w:val="left"/>
-      </w:pPr>
-      <w:r>
-        <w:rPr>
-          <w:rFonts w:ascii="Calibri" w:cs="Calibri" w:eastAsia="Calibri" w:hAnsi="Calibri"/>
-          <w:b w:val="false"/>
-          <w:bCs w:val="false"/>
-          <w:i w:val="false"/>
-          <w:iCs w:val="false"/>
-          <w:color w:val="1F2937"/>
-          <w:sz w:val="19"/>
-          <w:szCs w:val="19"/>
-        </w:rPr>
-        <w:t xml:space="preserve">Takes the same structured data plus manual commentary fields and generates a formatted Word document (.docx) using the docx npm package, returned to the browser as base64.</w:t>
+        <w:t xml:space="preserve">Per-IP rate limit: 10 requests / 5 minutes (in-memory, resets on cold start)</w:t>
       </w:r>
     </w:p>
     <w:p>
@@ -1239,7 +1271,7 @@
           <w:sz w:val="19"/>
           <w:szCs w:val="19"/>
         </w:rPr>
-        <w:t xml:space="preserve">Per-IP rate limit: 20 requests / 5 minutes</w:t>
+        <w:t>Month-on-month commentary: after building the payload it reads the previous calendar month’s summary snapshot from Netlify Blobs (lib/report-archive.js), derives deterministic commentary lines (lib/metrics-commentary.js), then saves this month’s snapshot. Soft-fail throughout — any Blobs problem leaves commentary null rather than failing the report</w:t>
       </w:r>
     </w:p>
     <w:p>
@@ -1262,51 +1294,7 @@
           <w:sz w:val="19"/>
           <w:szCs w:val="19"/>
         </w:rPr>
-        <w:t xml:space="preserve">Cover page, nine report sections (Executive Summary, Device &amp; Asset Management, Security Posture, Patch Status, User Data, SharePoint / MS Teams, Ticketing &amp; Support, Recommendations &amp; Opportunities, Security Risk Register), KPI cards, callouts, tables, and an auto-generated risk register all built as native Word tables and paragraphs — not an HTML-to-Word conversion. Executive Summary, Ticketing &amp; Support, and Recommendations &amp; Opportunities are manual-entry sections only, rendered when the account manager fills in the corresponding commentary fields — they carry no Graph-sourced data</w:t>
-      </w:r>
-    </w:p>
-    <w:p>
-      <w:pPr>
-        <w:spacing w:after="200" w:before="0"/>
-        <w:jc w:val="left"/>
-      </w:pPr>
-    </w:p>
-    <w:p>
-      <w:pPr>
-        <w:pStyle w:val="Heading3"/>
-        <w:spacing w:after="60" w:before="180"/>
-      </w:pPr>
-      <w:r>
-        <w:rPr>
-          <w:rFonts w:ascii="Calibri" w:cs="Calibri" w:eastAsia="Calibri" w:hAnsi="Calibri"/>
-          <w:b/>
-          <w:bCs/>
-          <w:i w:val="false"/>
-          <w:iCs w:val="false"/>
-          <w:color w:val="1F2937"/>
-          <w:sz w:val="21"/>
-          <w:szCs w:val="21"/>
-        </w:rPr>
-        <w:t xml:space="preserve">netlify/functions/export-pdf.js</w:t>
-      </w:r>
-    </w:p>
-    <w:p>
-      <w:pPr>
-        <w:spacing w:after="120" w:before="0"/>
-        <w:jc w:val="left"/>
-      </w:pPr>
-      <w:r>
-        <w:rPr>
-          <w:rFonts w:ascii="Calibri" w:cs="Calibri" w:eastAsia="Calibri" w:hAnsi="Calibri"/>
-          <w:b w:val="false"/>
-          <w:bCs w:val="false"/>
-          <w:i w:val="false"/>
-          <w:iCs w:val="false"/>
-          <w:color w:val="1F2937"/>
-          <w:sz w:val="19"/>
-          <w:szCs w:val="19"/>
-        </w:rPr>
-        <w:t xml:space="preserve">A second, PDF-native export path mirroring export-docx.js’s full nine-section structure, accepting the same input shape. Built with the jspdf and jspdf-autotable npm packages, Helvetica font only (no custom font files bundled).</w:t>
+        <w:t>Retention control: request field retainMetrics=false (the wizard’s One-off report box) skips saving and deletes the tenant’s history; the response carries metricsRetained (true only if the snapshot was actually saved) so exports can disclose retention accurately</w:t>
       </w:r>
     </w:p>
     <w:p>
@@ -1329,7 +1317,7 @@
           <w:sz w:val="19"/>
           <w:szCs w:val="19"/>
         </w:rPr>
-        <w:t xml:space="preserve">No per-IP rate limiting (unlike intune.js and export-docx.js)</w:t>
+        <w:t>SharePoint sites are bucketed by Root Web Template using lib/site-templates.js (Group, Communication, Teams sites, Teams channels, Classic, Other); the response includes templateBreakdown (raw value → bucket → sites/GB) for the review step</w:t>
       </w:r>
     </w:p>
     <w:p>
@@ -1352,165 +1340,7 @@
           <w:sz w:val="19"/>
           <w:szCs w:val="19"/>
         </w:rPr>
-        <w:t xml:space="preserve">Dormant from the app’s own perspective — index.html’s wizard does not call it anywhere; page 4 only offers browser print-to-PDF and Export to Word. Exists for a possible future PDF-export button or other consumers, but is not wired into any UI control today.</w:t>
-      </w:r>
-    </w:p>
-    <w:p>
-      <w:pPr>
-        <w:pStyle w:val="Heading3"/>
-        <w:spacing w:after="60" w:before="180"/>
-      </w:pPr>
-      <w:r>
-        <w:rPr>
-          <w:rFonts w:ascii="Calibri" w:cs="Calibri" w:eastAsia="Calibri" w:hAnsi="Calibri"/>
-          <w:b/>
-          <w:bCs/>
-          <w:i w:val="false"/>
-          <w:iCs w:val="false"/>
-          <w:color w:val="1F2937"/>
-          <w:sz w:val="21"/>
-          <w:szCs w:val="21"/>
-        </w:rPr>
-        <w:t xml:space="preserve">netlify/functions/clients.js</w:t>
-      </w:r>
-    </w:p>
-    <w:p>
-      <w:pPr>
-        <w:spacing w:after="120" w:before="0"/>
-        <w:jc w:val="left"/>
-      </w:pPr>
-      <w:r>
-        <w:rPr>
-          <w:rFonts w:ascii="Calibri" w:cs="Calibri" w:eastAsia="Calibri" w:hAnsi="Calibri"/>
-          <w:b w:val="false"/>
-          <w:bCs w:val="false"/>
-          <w:i w:val="false"/>
-          <w:iCs w:val="false"/>
-          <w:color w:val="1F2937"/>
-          <w:sz w:val="19"/>
-          <w:szCs w:val="19"/>
-        </w:rPr>
-        <w:t xml:space="preserve">Serves report-hub — a separate consumer application, not part of this app’s own browser UI — a stripped-down client picker list: id and display name only, no credentials — sourced from the shared credential store below. Requires a valid x-report-hub-key header (checked against the REPORT_HUB_SHARED_KEY environment variable) since 2026-09 — previously unauthenticated, which let anyone enumerate every configured client id (see Security Model).</w:t>
-      </w:r>
-    </w:p>
-    <w:p>
-      <w:pPr>
-        <w:pStyle w:val="Heading3"/>
-        <w:spacing w:after="60" w:before="180"/>
-      </w:pPr>
-      <w:r>
-        <w:rPr>
-          <w:rFonts w:ascii="Calibri" w:cs="Calibri" w:eastAsia="Calibri" w:hAnsi="Calibri"/>
-          <w:b/>
-          <w:bCs/>
-          <w:i w:val="false"/>
-          <w:iCs w:val="false"/>
-          <w:color w:val="1F2937"/>
-          <w:sz w:val="21"/>
-          <w:szCs w:val="21"/>
-        </w:rPr>
-        <w:t xml:space="preserve">netlify/functions/report-data.js</w:t>
-      </w:r>
-    </w:p>
-    <w:p>
-      <w:pPr>
-        <w:spacing w:after="120" w:before="0"/>
-        <w:jc w:val="left"/>
-      </w:pPr>
-      <w:r>
-        <w:rPr>
-          <w:rFonts w:ascii="Calibri" w:cs="Calibri" w:eastAsia="Calibri" w:hAnsi="Calibri"/>
-          <w:b w:val="false"/>
-          <w:bCs w:val="false"/>
-          <w:i w:val="false"/>
-          <w:iCs w:val="false"/>
-          <w:color w:val="1F2937"/>
-          <w:sz w:val="19"/>
-          <w:szCs w:val="19"/>
-        </w:rPr>
-        <w:t xml:space="preserve">A headless data endpoint for report-hub. Takes a clientId (plus optional from/to) query parameter, looks up that client’s stored Entra ID credentials via lib/clients-store.js, and calls intune.js’s exported handler directly and internally with those credentials — passing its response straight through unchanged. intune.js itself required no modification to support this. Also requires the same x-report-hub-key header since 2026-09 — previously unauthenticated, which let anyone pull any configured client’s complete Graph report by guessing or enumerating its clientId (see Security Model).</w:t>
-      </w:r>
-    </w:p>
-    <w:p>
-      <w:pPr>
-        <w:pStyle w:val="Heading3"/>
-        <w:spacing w:after="60" w:before="180"/>
-      </w:pPr>
-      <w:r>
-        <w:rPr>
-          <w:rFonts w:ascii="Calibri" w:cs="Calibri" w:eastAsia="Calibri" w:hAnsi="Calibri"/>
-          <w:b/>
-          <w:bCs/>
-          <w:i w:val="false"/>
-          <w:iCs w:val="false"/>
-          <w:color w:val="1F2937"/>
-          <w:sz w:val="21"/>
-          <w:szCs w:val="21"/>
-        </w:rPr>
-        <w:t xml:space="preserve">netlify/functions/lib/clients-store.js (shared helper, not a Netlify function)</w:t>
-      </w:r>
-    </w:p>
-    <w:p>
-      <w:pPr>
-        <w:spacing w:after="120" w:before="0"/>
-        <w:jc w:val="left"/>
-      </w:pPr>
-      <w:r>
-        <w:rPr>
-          <w:rFonts w:ascii="Calibri" w:cs="Calibri" w:eastAsia="Calibri" w:hAnsi="Calibri"/>
-          <w:b w:val="false"/>
-          <w:bCs w:val="false"/>
-          <w:i w:val="false"/>
-          <w:iCs w:val="false"/>
-          <w:color w:val="1F2937"/>
-          <w:sz w:val="19"/>
-          <w:szCs w:val="19"/>
-        </w:rPr>
-        <w:t xml:space="preserve">Not itself invoked as an HTTP endpoint — a shared internal module used by clients.js and report-data.js. Reads a single Netlify environment variable, INTUNE_CLIENTS_JSON (a JSON array of {id, displayName, tenantId, clientId, clientSecret} objects), and exposes lookup and credential-stripping helpers. This is the only server-side credential storage in the whole application, and it is strictly additive: the browser wizard’s existing per-session, paste-your-own-credentials flow (index.html → intune.js) is completely unaffected and does not require a client to be listed here at all.</w:t>
-      </w:r>
-    </w:p>
-    <w:p>
-      <w:pPr>
-        <w:spacing w:after="200" w:before="0"/>
-        <w:jc w:val="left"/>
-      </w:pPr>
-    </w:p>
-    <w:p>
-      <w:pPr>
-        <w:pStyle w:val="Heading3"/>
-        <w:spacing w:after="60" w:before="180"/>
-      </w:pPr>
-      <w:r>
-        <w:rPr>
-          <w:rFonts w:ascii="Calibri" w:cs="Calibri" w:eastAsia="Calibri" w:hAnsi="Calibri"/>
-          <w:b/>
-          <w:bCs/>
-          <w:i w:val="false"/>
-          <w:iCs w:val="false"/>
-          <w:color w:val="1F2937"/>
-          <w:sz w:val="21"/>
-          <w:szCs w:val="21"/>
-        </w:rPr>
-        <w:t xml:space="preserve">scripts/add-client.js (local dev helper, not deployed)</w:t>
-      </w:r>
-    </w:p>
-    <w:p>
-      <w:pPr>
-        <w:spacing w:after="120" w:before="0"/>
-        <w:jc w:val="left"/>
-      </w:pPr>
-      <w:r>
-        <w:rPr>
-          <w:rFonts w:ascii="Calibri" w:cs="Calibri" w:eastAsia="Calibri" w:hAnsi="Calibri"/>
-          <w:b w:val="false"/>
-          <w:bCs w:val="false"/>
-          <w:i w:val="false"/>
-          <w:iCs w:val="false"/>
-          <w:color w:val="1F2937"/>
-          <w:sz w:val="19"/>
-          <w:szCs w:val="19"/>
-        </w:rPr>
-        <w:t xml:space="preserve">A Node CLI script for safely adding or updating one client entry in the local .env’s INTUNE_CLIENTS_JSON — the same environment variable lib/clients-store.js reads in production. Not a Netlify function and not part of the deployed site; run locally only, via node scripts/add-client.js --id &lt;short-id&gt; --name "&lt;Display Name&gt;" [--tenant] [--client] [--secret].</w:t>
+        <w:t>Upcoming licence renewals come from /directory/subscriptions (Enabled, non-trial subscriptions renewing within 90 days, labelled Monthly or Annual/Multi-year) — the same Organization.Read.All permission as licence counts, no new consent</w:t>
       </w:r>
     </w:p>
     <w:p>
@@ -1533,7 +1363,51 @@
           <w:sz w:val="19"/>
           <w:szCs w:val="19"/>
         </w:rPr>
-        <w:t xml:space="preserve">Omitted --tenant/--client/--secret values are written as a REPLACE_ME placeholder, so the command (and a pasted session transcript) never has to contain a real secret — fill placeholders in by hand afterward</w:t>
+        <w:t xml:space="preserve">Typical response time: 3-8 seconds depending on tenant size</w:t>
+      </w:r>
+    </w:p>
+    <w:p>
+      <w:pPr>
+        <w:spacing w:after="120" w:before="0"/>
+        <w:jc w:val="left"/>
+      </w:pPr>
+    </w:p>
+    <w:p>
+      <w:pPr>
+        <w:pStyle w:val="Heading3"/>
+        <w:spacing w:after="60" w:before="180"/>
+      </w:pPr>
+      <w:r>
+        <w:rPr>
+          <w:rFonts w:ascii="Calibri" w:cs="Calibri" w:eastAsia="Calibri" w:hAnsi="Calibri"/>
+          <w:b/>
+          <w:bCs/>
+          <w:i w:val="false"/>
+          <w:iCs w:val="false"/>
+          <w:color w:val="1F2937"/>
+          <w:sz w:val="21"/>
+          <w:szCs w:val="21"/>
+        </w:rPr>
+        <w:t xml:space="preserve">netlify/functions/export-docx.js</w:t>
+      </w:r>
+    </w:p>
+    <w:p>
+      <w:pPr>
+        <w:spacing w:after="120" w:before="0"/>
+        <w:jc w:val="left"/>
+      </w:pPr>
+      <w:r>
+        <w:rPr>
+          <w:rFonts w:ascii="Calibri" w:cs="Calibri" w:eastAsia="Calibri" w:hAnsi="Calibri"/>
+          <w:b w:val="false"/>
+          <w:bCs w:val="false"/>
+          <w:i w:val="false"/>
+          <w:iCs w:val="false"/>
+          <w:color w:val="1F2937"/>
+          <w:sz w:val="19"/>
+          <w:szCs w:val="19"/>
+        </w:rPr>
+        <w:t xml:space="preserve">Takes the same structured data plus manual commentary fields and generates a formatted Word document (.docx) using the docx npm package, returned to the browser as base64.</w:t>
       </w:r>
     </w:p>
     <w:p>
@@ -1556,7 +1430,7 @@
           <w:sz w:val="19"/>
           <w:szCs w:val="19"/>
         </w:rPr>
-        <w:t xml:space="preserve">Re-running with the same --id updates that entry in place rather than duplicating it</w:t>
+        <w:t xml:space="preserve">Per-IP rate limit: 20 requests / 5 minutes</w:t>
       </w:r>
     </w:p>
     <w:p>
@@ -1579,7 +1453,7 @@
           <w:sz w:val="19"/>
           <w:szCs w:val="19"/>
         </w:rPr>
-        <w:t xml:space="preserve">Only updates the local .env — production’s separate copy of INTUNE_CLIENTS_JSON (Netlify Site settings → Environment variables) must still be updated by hand; the script prints the final JSON specifically so it can be pasted there</w:t>
+        <w:t>Cover page, ten report sections (Executive Summary, Month-on-Month Changes, Device &amp; Asset Management, Security Posture, Patch Status, User Data, SharePoint / MS Teams, Ticketing &amp; Support, Recommendations &amp; Opportunities, Security Risk Register), KPI cards, callouts, tables, and an auto-generated risk register all built as native Word tables and paragraphs — not an HTML-to-Word conversion. Executive Summary, Ticketing &amp; Support, and Recommendations &amp; Opportunities are manual-entry sections only, rendered when the account manager fills in the corresponding commentary fields — they carry no Graph-sourced data. Month-on-Month Changes is auto-generated and only rendered when a prior-month snapshot exists</w:t>
       </w:r>
     </w:p>
     <w:p>
@@ -1590,11 +1464,8 @@
     </w:p>
     <w:p>
       <w:pPr>
-        <w:pStyle w:val="Heading1"/>
-        <w:pBdr>
-          <w:bottom w:val="single" w:color="0D7CC4" w:sz="8"/>
-        </w:pBdr>
-        <w:spacing w:after="120" w:before="360"/>
+        <w:pStyle w:val="Heading3"/>
+        <w:spacing w:after="60" w:before="180"/>
       </w:pPr>
       <w:r>
         <w:rPr>
@@ -1603,11 +1474,30 @@
           <w:bCs/>
           <w:i w:val="false"/>
           <w:iCs w:val="false"/>
-          <w:color w:val="0D7CC4"/>
-          <w:sz w:val="30"/>
-          <w:szCs w:val="30"/>
-        </w:rPr>
-        <w:t xml:space="preserve">4. Data Flow — Step by Step</w:t>
+          <w:color w:val="1F2937"/>
+          <w:sz w:val="21"/>
+          <w:szCs w:val="21"/>
+        </w:rPr>
+        <w:t xml:space="preserve">netlify/functions/export-pdf.js</w:t>
+      </w:r>
+    </w:p>
+    <w:p>
+      <w:pPr>
+        <w:spacing w:after="120" w:before="0"/>
+        <w:jc w:val="left"/>
+      </w:pPr>
+      <w:r>
+        <w:rPr>
+          <w:rFonts w:ascii="Calibri" w:cs="Calibri" w:eastAsia="Calibri" w:hAnsi="Calibri"/>
+          <w:b w:val="false"/>
+          <w:bCs w:val="false"/>
+          <w:i w:val="false"/>
+          <w:iCs w:val="false"/>
+          <w:color w:val="1F2937"/>
+          <w:sz w:val="19"/>
+          <w:szCs w:val="19"/>
+        </w:rPr>
+        <w:t>A second, PDF-native export path mirroring export-docx.js’s full ten-section structure, accepting the same input shape. Built with the jspdf and jspdf-autotable npm packages, Helvetica font only (no custom font files bundled).</w:t>
       </w:r>
     </w:p>
     <w:p>
@@ -1630,7 +1520,7 @@
           <w:sz w:val="19"/>
           <w:szCs w:val="19"/>
         </w:rPr>
-        <w:t xml:space="preserve">1. Account manager enters Tenant ID, Client ID, and Client Secret in the browser</w:t>
+        <w:t xml:space="preserve">No per-IP rate limiting (unlike intune.js and export-docx.js)</w:t>
       </w:r>
     </w:p>
     <w:p>
@@ -1653,7 +1543,7 @@
           <w:sz w:val="19"/>
           <w:szCs w:val="19"/>
         </w:rPr>
-        <w:t xml:space="preserve">2. Browser POSTs credentials + date range to /.netlify/functions/intune</w:t>
+        <w:t>The cover carries a disclaimer whose retention sentence depends on the metricsRetained flag from intune.js: either nothing is retained, or only summary figures are kept for up to 13 months</w:t>
       </w:r>
     </w:p>
     <w:p>
@@ -1676,7 +1566,165 @@
           <w:sz w:val="19"/>
           <w:szCs w:val="19"/>
         </w:rPr>
-        <w:t xml:space="preserve">3. Function requests an OAuth token from https://login.microsoftonline.com/{tenantId}/oauth2/v2.0/token</w:t>
+        <w:t xml:space="preserve">Dormant from the app’s own perspective — index.html’s wizard does not call it anywhere; page 4 only offers browser print-to-PDF and Export to Word. Exists for a possible future PDF-export button or other consumers, but is not wired into any UI control today.</w:t>
+      </w:r>
+    </w:p>
+    <w:p>
+      <w:pPr>
+        <w:pStyle w:val="Heading3"/>
+        <w:spacing w:after="60" w:before="180"/>
+      </w:pPr>
+      <w:r>
+        <w:rPr>
+          <w:rFonts w:ascii="Calibri" w:cs="Calibri" w:eastAsia="Calibri" w:hAnsi="Calibri"/>
+          <w:b/>
+          <w:bCs/>
+          <w:i w:val="false"/>
+          <w:iCs w:val="false"/>
+          <w:color w:val="1F2937"/>
+          <w:sz w:val="21"/>
+          <w:szCs w:val="21"/>
+        </w:rPr>
+        <w:t xml:space="preserve">netlify/functions/clients.js</w:t>
+      </w:r>
+    </w:p>
+    <w:p>
+      <w:pPr>
+        <w:spacing w:after="120" w:before="0"/>
+        <w:jc w:val="left"/>
+      </w:pPr>
+      <w:r>
+        <w:rPr>
+          <w:rFonts w:ascii="Calibri" w:cs="Calibri" w:eastAsia="Calibri" w:hAnsi="Calibri"/>
+          <w:b w:val="false"/>
+          <w:bCs w:val="false"/>
+          <w:i w:val="false"/>
+          <w:iCs w:val="false"/>
+          <w:color w:val="1F2937"/>
+          <w:sz w:val="19"/>
+          <w:szCs w:val="19"/>
+        </w:rPr>
+        <w:t xml:space="preserve">Serves report-hub — a separate consumer application, not part of this app’s own browser UI — a stripped-down client picker list: id and display name only, no credentials — sourced from the shared credential store below. Requires a valid x-report-hub-key header (checked against the REPORT_HUB_SHARED_KEY environment variable) since 2026-09 — previously unauthenticated, which let anyone enumerate every configured client id (see Security Model).</w:t>
+      </w:r>
+    </w:p>
+    <w:p>
+      <w:pPr>
+        <w:pStyle w:val="Heading3"/>
+        <w:spacing w:after="60" w:before="180"/>
+      </w:pPr>
+      <w:r>
+        <w:rPr>
+          <w:rFonts w:ascii="Calibri" w:cs="Calibri" w:eastAsia="Calibri" w:hAnsi="Calibri"/>
+          <w:b/>
+          <w:bCs/>
+          <w:i w:val="false"/>
+          <w:iCs w:val="false"/>
+          <w:color w:val="1F2937"/>
+          <w:sz w:val="21"/>
+          <w:szCs w:val="21"/>
+        </w:rPr>
+        <w:t xml:space="preserve">netlify/functions/report-data.js</w:t>
+      </w:r>
+    </w:p>
+    <w:p>
+      <w:pPr>
+        <w:spacing w:after="120" w:before="0"/>
+        <w:jc w:val="left"/>
+      </w:pPr>
+      <w:r>
+        <w:rPr>
+          <w:rFonts w:ascii="Calibri" w:cs="Calibri" w:eastAsia="Calibri" w:hAnsi="Calibri"/>
+          <w:b w:val="false"/>
+          <w:bCs w:val="false"/>
+          <w:i w:val="false"/>
+          <w:iCs w:val="false"/>
+          <w:color w:val="1F2937"/>
+          <w:sz w:val="19"/>
+          <w:szCs w:val="19"/>
+        </w:rPr>
+        <w:t xml:space="preserve">A headless data endpoint for report-hub. Takes a clientId (plus optional from/to) query parameter, looks up that client’s stored Entra ID credentials via lib/clients-store.js, and calls intune.js’s exported handler directly and internally with those credentials — passing its response straight through unchanged. intune.js itself required no modification to support this. Also requires the same x-report-hub-key header since 2026-09 — previously unauthenticated, which let anyone pull any configured client’s complete Graph report by guessing or enumerating its clientId (see Security Model).</w:t>
+      </w:r>
+    </w:p>
+    <w:p>
+      <w:pPr>
+        <w:pStyle w:val="Heading3"/>
+        <w:spacing w:after="60" w:before="180"/>
+      </w:pPr>
+      <w:r>
+        <w:rPr>
+          <w:rFonts w:ascii="Calibri" w:cs="Calibri" w:eastAsia="Calibri" w:hAnsi="Calibri"/>
+          <w:b/>
+          <w:bCs/>
+          <w:i w:val="false"/>
+          <w:iCs w:val="false"/>
+          <w:color w:val="1F2937"/>
+          <w:sz w:val="21"/>
+          <w:szCs w:val="21"/>
+        </w:rPr>
+        <w:t xml:space="preserve">netlify/functions/lib/clients-store.js (shared helper, not a Netlify function)</w:t>
+      </w:r>
+    </w:p>
+    <w:p>
+      <w:pPr>
+        <w:spacing w:after="120" w:before="0"/>
+        <w:jc w:val="left"/>
+      </w:pPr>
+      <w:r>
+        <w:rPr>
+          <w:rFonts w:ascii="Calibri" w:cs="Calibri" w:eastAsia="Calibri" w:hAnsi="Calibri"/>
+          <w:b w:val="false"/>
+          <w:bCs w:val="false"/>
+          <w:i w:val="false"/>
+          <w:iCs w:val="false"/>
+          <w:color w:val="1F2937"/>
+          <w:sz w:val="19"/>
+          <w:szCs w:val="19"/>
+        </w:rPr>
+        <w:t xml:space="preserve">Not itself invoked as an HTTP endpoint — a shared internal module used by clients.js and report-data.js. Reads a single Netlify environment variable, INTUNE_CLIENTS_JSON (a JSON array of {id, displayName, tenantId, clientId, clientSecret} objects), and exposes lookup and credential-stripping helpers. This is the only server-side credential storage in the whole application, and it is strictly additive: the browser wizard’s existing per-session, paste-your-own-credentials flow (index.html → intune.js) is completely unaffected and does not require a client to be listed here at all.</w:t>
+      </w:r>
+    </w:p>
+    <w:p>
+      <w:pPr>
+        <w:spacing w:after="200" w:before="0"/>
+        <w:jc w:val="left"/>
+      </w:pPr>
+    </w:p>
+    <w:p>
+      <w:pPr>
+        <w:pStyle w:val="Heading3"/>
+        <w:spacing w:after="60" w:before="180"/>
+      </w:pPr>
+      <w:r>
+        <w:rPr>
+          <w:rFonts w:ascii="Calibri" w:cs="Calibri" w:eastAsia="Calibri" w:hAnsi="Calibri"/>
+          <w:b/>
+          <w:bCs/>
+          <w:i w:val="false"/>
+          <w:iCs w:val="false"/>
+          <w:color w:val="1F2937"/>
+          <w:sz w:val="21"/>
+          <w:szCs w:val="21"/>
+        </w:rPr>
+        <w:t xml:space="preserve">scripts/add-client.js (local dev helper, not deployed)</w:t>
+      </w:r>
+    </w:p>
+    <w:p>
+      <w:pPr>
+        <w:spacing w:after="120" w:before="0"/>
+        <w:jc w:val="left"/>
+      </w:pPr>
+      <w:r>
+        <w:rPr>
+          <w:rFonts w:ascii="Calibri" w:cs="Calibri" w:eastAsia="Calibri" w:hAnsi="Calibri"/>
+          <w:b w:val="false"/>
+          <w:bCs w:val="false"/>
+          <w:i w:val="false"/>
+          <w:iCs w:val="false"/>
+          <w:color w:val="1F2937"/>
+          <w:sz w:val="19"/>
+          <w:szCs w:val="19"/>
+        </w:rPr>
+        <w:t xml:space="preserve">A Node CLI script for safely adding or updating one client entry in the local .env’s INTUNE_CLIENTS_JSON — the same environment variable lib/clients-store.js reads in production. Not a Netlify function and not part of the deployed site; run locally only, via node scripts/add-client.js --id &lt;short-id&gt; --name "&lt;Display Name&gt;" [--tenant] [--client] [--secret].</w:t>
       </w:r>
     </w:p>
     <w:p>
@@ -1699,7 +1747,7 @@
           <w:sz w:val="19"/>
           <w:szCs w:val="19"/>
         </w:rPr>
-        <w:t xml:space="preserve">4. Function issues 16 parallel calls to Microsoft Graph (https://graph.microsoft.com/v1.0/...), followed by 2 more parallel sign-in-log calls (18 total)</w:t>
+        <w:t xml:space="preserve">Omitted --tenant/--client/--secret values are written as a REPLACE_ME placeholder, so the command (and a pasted session transcript) never has to contain a real secret — fill placeholders in by hand afterward</w:t>
       </w:r>
     </w:p>
     <w:p>
@@ -1722,7 +1770,341 @@
           <w:sz w:val="19"/>
           <w:szCs w:val="19"/>
         </w:rPr>
-        <w:t xml:space="preserve">5. Function shapes the raw Graph responses into 50+ structured metrics</w:t>
+        <w:t xml:space="preserve">Re-running with the same --id updates that entry in place rather than duplicating it</w:t>
+      </w:r>
+    </w:p>
+    <w:p>
+      <w:pPr>
+        <w:pStyle w:val="ListParagraph"/>
+        <w:numPr>
+          <w:ilvl w:val="0"/>
+          <w:numId w:val="1"/>
+        </w:numPr>
+        <w:spacing w:after="60" w:before="40"/>
+      </w:pPr>
+      <w:r>
+        <w:rPr>
+          <w:rFonts w:ascii="Calibri" w:cs="Calibri" w:eastAsia="Calibri" w:hAnsi="Calibri"/>
+          <w:b w:val="false"/>
+          <w:bCs w:val="false"/>
+          <w:i w:val="false"/>
+          <w:iCs w:val="false"/>
+          <w:color w:val="1F2937"/>
+          <w:sz w:val="19"/>
+          <w:szCs w:val="19"/>
+        </w:rPr>
+        <w:t xml:space="preserve">Only updates the local .env — production’s separate copy of INTUNE_CLIENTS_JSON (Netlify Site settings → Environment variables) must still be updated by hand; the script prints the final JSON specifically so it can be pasted there</w:t>
+      </w:r>
+    </w:p>
+    <w:p>
+      <w:pPr>
+        <w:pStyle w:val="Heading3"/>
+        <w:spacing w:after="60" w:before="180"/>
+      </w:pPr>
+      <w:r>
+        <w:rPr>
+          <w:rFonts w:ascii="Calibri" w:cs="Calibri" w:eastAsia="Calibri" w:hAnsi="Calibri"/>
+          <w:b/>
+          <w:bCs/>
+          <w:i w:val="false"/>
+          <w:iCs w:val="false"/>
+          <w:color w:val="1F2937"/>
+          <w:sz w:val="21"/>
+          <w:szCs w:val="21"/>
+        </w:rPr>
+        <w:t>netlify/functions/delete-client-metrics.js</w:t>
+      </w:r>
+    </w:p>
+    <w:p>
+      <w:pPr>
+        <w:spacing w:after="120" w:before="0"/>
+        <w:jc w:val="left"/>
+      </w:pPr>
+      <w:r>
+        <w:rPr>
+          <w:rFonts w:ascii="Calibri" w:cs="Calibri" w:eastAsia="Calibri" w:hAnsi="Calibri"/>
+          <w:b w:val="false"/>
+          <w:bCs w:val="false"/>
+          <w:i w:val="false"/>
+          <w:iCs w:val="false"/>
+          <w:color w:val="1F2937"/>
+          <w:sz w:val="19"/>
+          <w:szCs w:val="19"/>
+        </w:rPr>
+        <w:t>An admin-only endpoint that deletes every stored month-on-month snapshot for one tenant without running another report — for a client who asks for their history to be removed after the fact, when the app registration that proved tenant ownership has typically already been deleted. POST with an x-admin-key header (checked against ARCHIVE_ADMIN_KEY; every call is refused while that variable is unset) and a tenantId. Not linked from any UI — invoked manually, e.g. with curl.</w:t>
+      </w:r>
+    </w:p>
+    <w:p>
+      <w:pPr>
+        <w:pStyle w:val="Heading3"/>
+        <w:spacing w:after="60" w:before="180"/>
+      </w:pPr>
+      <w:r>
+        <w:rPr>
+          <w:rFonts w:ascii="Calibri" w:cs="Calibri" w:eastAsia="Calibri" w:hAnsi="Calibri"/>
+          <w:b/>
+          <w:bCs/>
+          <w:i w:val="false"/>
+          <w:iCs w:val="false"/>
+          <w:color w:val="1F2937"/>
+          <w:sz w:val="21"/>
+          <w:szCs w:val="21"/>
+        </w:rPr>
+        <w:t>netlify/functions/lib — metrics archive helpers (not Netlify functions)</w:t>
+      </w:r>
+    </w:p>
+    <w:p>
+      <w:pPr>
+        <w:spacing w:after="120" w:before="0"/>
+        <w:jc w:val="left"/>
+      </w:pPr>
+      <w:r>
+        <w:rPr>
+          <w:rFonts w:ascii="Calibri" w:cs="Calibri" w:eastAsia="Calibri" w:hAnsi="Calibri"/>
+          <w:b w:val="false"/>
+          <w:bCs w:val="false"/>
+          <w:i w:val="false"/>
+          <w:iCs w:val="false"/>
+          <w:color w:val="1F2937"/>
+          <w:sz w:val="19"/>
+          <w:szCs w:val="19"/>
+        </w:rPr>
+        <w:t>Shared internal modules:</w:t>
+      </w:r>
+    </w:p>
+    <w:p>
+      <w:pPr>
+        <w:pStyle w:val="ListParagraph"/>
+        <w:numPr>
+          <w:ilvl w:val="0"/>
+          <w:numId w:val="1"/>
+        </w:numPr>
+        <w:spacing w:after="60" w:before="40"/>
+      </w:pPr>
+      <w:r>
+        <w:rPr>
+          <w:rFonts w:ascii="Calibri" w:cs="Calibri" w:eastAsia="Calibri" w:hAnsi="Calibri"/>
+          <w:b w:val="false"/>
+          <w:bCs w:val="false"/>
+          <w:i w:val="false"/>
+          <w:iCs w:val="false"/>
+          <w:color w:val="1F2937"/>
+          <w:sz w:val="19"/>
+          <w:szCs w:val="19"/>
+        </w:rPr>
+        <w:t>report-archive.js — reads, writes, prunes (rolling 13 months) and deletes snapshots in the Netlify Blobs store msp-report-metrics, keyed tenantId/YYYY-MM. Runs inside the Functions runtime with no credentials to manage. Every function is soft-fail</w:t>
+      </w:r>
+    </w:p>
+    <w:p>
+      <w:pPr>
+        <w:pStyle w:val="ListParagraph"/>
+        <w:numPr>
+          <w:ilvl w:val="0"/>
+          <w:numId w:val="1"/>
+        </w:numPr>
+        <w:spacing w:after="60" w:before="40"/>
+      </w:pPr>
+      <w:r>
+        <w:rPr>
+          <w:rFonts w:ascii="Calibri" w:cs="Calibri" w:eastAsia="Calibri" w:hAnsi="Calibri"/>
+          <w:b w:val="false"/>
+          <w:bCs w:val="false"/>
+          <w:i w:val="false"/>
+          <w:iCs w:val="false"/>
+          <w:color w:val="1F2937"/>
+          <w:sz w:val="19"/>
+          <w:szCs w:val="19"/>
+        </w:rPr>
+        <w:t>metrics-commentary.js — snapshot() extracts the tracked figures from a report payload; buildCommentary() compares two snapshots and returns template sentences for changes above a threshold, or null when there is no prior month</w:t>
+      </w:r>
+    </w:p>
+    <w:p>
+      <w:pPr>
+        <w:pStyle w:val="ListParagraph"/>
+        <w:numPr>
+          <w:ilvl w:val="0"/>
+          <w:numId w:val="1"/>
+        </w:numPr>
+        <w:spacing w:after="60" w:before="40"/>
+      </w:pPr>
+      <w:r>
+        <w:rPr>
+          <w:rFonts w:ascii="Calibri" w:cs="Calibri" w:eastAsia="Calibri" w:hAnsi="Calibri"/>
+          <w:b w:val="false"/>
+          <w:bCs w:val="false"/>
+          <w:i w:val="false"/>
+          <w:iCs w:val="false"/>
+          <w:color w:val="1F2937"/>
+          <w:sz w:val="19"/>
+          <w:szCs w:val="19"/>
+        </w:rPr>
+        <w:t>site-templates.js — classifySiteTemplate() buckets a SharePoint site by its Root Web Template value, matching both raw codes (GROUP#0, STS#3, TEAMCHANNEL#1) and friendlier titles</w:t>
+      </w:r>
+    </w:p>
+    <w:p>
+      <w:pPr>
+        <w:pStyle w:val="ListParagraph"/>
+        <w:numPr>
+          <w:ilvl w:val="0"/>
+          <w:numId w:val="1"/>
+        </w:numPr>
+        <w:spacing w:after="60" w:before="40"/>
+      </w:pPr>
+      <w:r>
+        <w:rPr>
+          <w:rFonts w:ascii="Calibri" w:cs="Calibri" w:eastAsia="Calibri" w:hAnsi="Calibri"/>
+          <w:b w:val="false"/>
+          <w:bCs w:val="false"/>
+          <w:i w:val="false"/>
+          <w:iCs w:val="false"/>
+          <w:color w:val="1F2937"/>
+          <w:sz w:val="19"/>
+          <w:szCs w:val="19"/>
+        </w:rPr>
+        <w:t>require-admin-key.js / require-report-hub-key.js — fail-closed shared-secret gates for delete-client-metrics.js and for clients.js / report-data.js respectively</w:t>
+      </w:r>
+    </w:p>
+    <w:p>
+      <w:pPr>
+        <w:spacing w:after="200" w:before="0"/>
+        <w:jc w:val="left"/>
+      </w:pPr>
+    </w:p>
+    <w:p>
+      <w:pPr>
+        <w:pStyle w:val="Heading1"/>
+        <w:pBdr>
+          <w:bottom w:val="single" w:color="0D7CC4" w:sz="8"/>
+        </w:pBdr>
+        <w:spacing w:after="120" w:before="360"/>
+      </w:pPr>
+      <w:r>
+        <w:rPr>
+          <w:rFonts w:ascii="Calibri" w:cs="Calibri" w:eastAsia="Calibri" w:hAnsi="Calibri"/>
+          <w:b/>
+          <w:bCs/>
+          <w:i w:val="false"/>
+          <w:iCs w:val="false"/>
+          <w:color w:val="0D7CC4"/>
+          <w:sz w:val="30"/>
+          <w:szCs w:val="30"/>
+        </w:rPr>
+        <w:t xml:space="preserve">4. Data Flow — Step by Step</w:t>
+      </w:r>
+    </w:p>
+    <w:p>
+      <w:pPr>
+        <w:pStyle w:val="ListParagraph"/>
+        <w:numPr>
+          <w:ilvl w:val="0"/>
+          <w:numId w:val="1"/>
+        </w:numPr>
+        <w:spacing w:after="60" w:before="40"/>
+      </w:pPr>
+      <w:r>
+        <w:rPr>
+          <w:rFonts w:ascii="Calibri" w:cs="Calibri" w:eastAsia="Calibri" w:hAnsi="Calibri"/>
+          <w:b w:val="false"/>
+          <w:bCs w:val="false"/>
+          <w:i w:val="false"/>
+          <w:iCs w:val="false"/>
+          <w:color w:val="1F2937"/>
+          <w:sz w:val="19"/>
+          <w:szCs w:val="19"/>
+        </w:rPr>
+        <w:t xml:space="preserve">1. Account manager enters Tenant ID, Client ID, and Client Secret in the browser</w:t>
+      </w:r>
+    </w:p>
+    <w:p>
+      <w:pPr>
+        <w:pStyle w:val="ListParagraph"/>
+        <w:numPr>
+          <w:ilvl w:val="0"/>
+          <w:numId w:val="1"/>
+        </w:numPr>
+        <w:spacing w:after="60" w:before="40"/>
+      </w:pPr>
+      <w:r>
+        <w:rPr>
+          <w:rFonts w:ascii="Calibri" w:cs="Calibri" w:eastAsia="Calibri" w:hAnsi="Calibri"/>
+          <w:b w:val="false"/>
+          <w:bCs w:val="false"/>
+          <w:i w:val="false"/>
+          <w:iCs w:val="false"/>
+          <w:color w:val="1F2937"/>
+          <w:sz w:val="19"/>
+          <w:szCs w:val="19"/>
+        </w:rPr>
+        <w:t>2. Browser POSTs credentials + date range (and the One-off flag) to /.netlify/functions/intune</w:t>
+      </w:r>
+    </w:p>
+    <w:p>
+      <w:pPr>
+        <w:pStyle w:val="ListParagraph"/>
+        <w:numPr>
+          <w:ilvl w:val="0"/>
+          <w:numId w:val="1"/>
+        </w:numPr>
+        <w:spacing w:after="60" w:before="40"/>
+      </w:pPr>
+      <w:r>
+        <w:rPr>
+          <w:rFonts w:ascii="Calibri" w:cs="Calibri" w:eastAsia="Calibri" w:hAnsi="Calibri"/>
+          <w:b w:val="false"/>
+          <w:bCs w:val="false"/>
+          <w:i w:val="false"/>
+          <w:iCs w:val="false"/>
+          <w:color w:val="1F2937"/>
+          <w:sz w:val="19"/>
+          <w:szCs w:val="19"/>
+        </w:rPr>
+        <w:t xml:space="preserve">3. Function requests an OAuth token from https://login.microsoftonline.com/{tenantId}/oauth2/v2.0/token</w:t>
+      </w:r>
+    </w:p>
+    <w:p>
+      <w:pPr>
+        <w:pStyle w:val="ListParagraph"/>
+        <w:numPr>
+          <w:ilvl w:val="0"/>
+          <w:numId w:val="1"/>
+        </w:numPr>
+        <w:spacing w:after="60" w:before="40"/>
+      </w:pPr>
+      <w:r>
+        <w:rPr>
+          <w:rFonts w:ascii="Calibri" w:cs="Calibri" w:eastAsia="Calibri" w:hAnsi="Calibri"/>
+          <w:b w:val="false"/>
+          <w:bCs w:val="false"/>
+          <w:i w:val="false"/>
+          <w:iCs w:val="false"/>
+          <w:color w:val="1F2937"/>
+          <w:sz w:val="19"/>
+          <w:szCs w:val="19"/>
+        </w:rPr>
+        <w:t>4. Function issues 17 parallel calls to Microsoft Graph (https://graph.microsoft.com/v1.0/...), followed by 2 more parallel sign-in-log calls (19 total)</w:t>
+      </w:r>
+    </w:p>
+    <w:p>
+      <w:pPr>
+        <w:pStyle w:val="ListParagraph"/>
+        <w:numPr>
+          <w:ilvl w:val="0"/>
+          <w:numId w:val="1"/>
+        </w:numPr>
+        <w:spacing w:after="60" w:before="40"/>
+      </w:pPr>
+      <w:r>
+        <w:rPr>
+          <w:rFonts w:ascii="Calibri" w:cs="Calibri" w:eastAsia="Calibri" w:hAnsi="Calibri"/>
+          <w:b w:val="false"/>
+          <w:bCs w:val="false"/>
+          <w:i w:val="false"/>
+          <w:iCs w:val="false"/>
+          <w:color w:val="1F2937"/>
+          <w:sz w:val="19"/>
+          <w:szCs w:val="19"/>
+        </w:rPr>
+        <w:t>5. Function shapes the raw Graph responses into 50+ structured metrics, then (unless One-off) reads last month’s summary snapshot from Netlify Blobs, derives month-on-month commentary and saves this month’s snapshot</w:t>
       </w:r>
     </w:p>
     <w:p>
@@ -2292,7 +2674,7 @@
                 <w:sz w:val="18"/>
                 <w:szCs w:val="18"/>
               </w:rPr>
-              <w:t xml:space="preserve">Tenant ID, Client ID, and Client Secret exist only in browser memory for the session — never written to disk, database, or logs on the server</w:t>
+              <w:t>Tenant ID, Client ID, and Client Secret are entered in the browser and sent to the intune function for each request only — never written to disk, database, or logs on the server. If a user saves a client, its details (secret included, in plain text) are kept in that browser’s local storage until deleted with the bin button; nothing is synced</w:t>
             </w:r>
           </w:p>
         </w:tc>
@@ -2520,7 +2902,7 @@
                 <w:sz w:val="18"/>
                 <w:szCs w:val="18"/>
               </w:rPr>
-              <w:t xml:space="preserve">In-memory per-IP limits on intune.js (10 requests/5 min) and export-docx.js (20 requests/5 min) to reduce abuse risk. export-pdf.js, clients.js, and report-data.js currently have no rate limiting</w:t>
+              <w:t>In-memory per-IP limits on intune.js (10 requests/5 min) and export-docx.js (20 requests/5 min) to reduce abuse risk. export-pdf.js, clients.js, report-data.js, and delete-client-metrics.js currently have no rate limiting</w:t>
             </w:r>
           </w:p>
         </w:tc>
@@ -2749,6 +3131,158 @@
                 <w:szCs w:val="18"/>
               </w:rPr>
               <w:t xml:space="preserve">clients.js and report-data.js require a x-report-hub-key header matching the REPORT_HUB_SHARED_KEY environment variable (added 2026-09). Previously both were fully unauthenticated: clients.js listed every configured client id, and report-data.js would run a full Graph pull for any clientId with no credential of its own — a real vulnerability, fixed by a shared-secret gate rather than per-client secrets</w:t>
+            </w:r>
+          </w:p>
+        </w:tc>
+      </w:tr>
+      <w:tr>
+        <w:tc>
+          <w:tcPr>
+            <w:tcW w:type="dxa" w:w="2995"/>
+            <w:tcBorders>
+              <w:top w:val="single" w:color="E5E7EB" w:sz="4"/>
+              <w:left w:val="single" w:color="E5E7EB" w:sz="4"/>
+              <w:bottom w:val="single" w:color="E5E7EB" w:sz="4"/>
+              <w:right w:val="single" w:color="E5E7EB" w:sz="4"/>
+            </w:tcBorders>
+            <w:shd w:fill="FFFFFF" w:val="clear"/>
+            <w:tcMar>
+              <w:top w:type="dxa" w:w="80"/>
+              <w:left w:type="dxa" w:w="120"/>
+              <w:bottom w:type="dxa" w:w="80"/>
+              <w:right w:type="dxa" w:w="120"/>
+            </w:tcMar>
+          </w:tcPr>
+          <w:p>
+            <w:pPr>
+              <w:spacing w:after="0" w:before="0"/>
+              <w:jc w:val="left"/>
+            </w:pPr>
+            <w:r>
+              <w:rPr>
+                <w:rFonts w:ascii="Calibri" w:cs="Calibri" w:eastAsia="Calibri" w:hAnsi="Calibri"/>
+                <w:b/>
+                <w:bCs/>
+                <w:i w:val="false"/>
+                <w:iCs w:val="false"/>
+                <w:color w:val="1F2937"/>
+                <w:sz w:val="18"/>
+                <w:szCs w:val="18"/>
+              </w:rPr>
+              <w:t>Metrics archive</w:t>
+            </w:r>
+          </w:p>
+        </w:tc>
+        <w:tc>
+          <w:tcPr>
+            <w:tcW w:type="dxa" w:w="6365"/>
+            <w:tcBorders>
+              <w:top w:val="single" w:color="E5E7EB" w:sz="4"/>
+              <w:left w:val="single" w:color="E5E7EB" w:sz="4"/>
+              <w:bottom w:val="single" w:color="E5E7EB" w:sz="4"/>
+              <w:right w:val="single" w:color="E5E7EB" w:sz="4"/>
+            </w:tcBorders>
+            <w:shd w:fill="FFFFFF" w:val="clear"/>
+            <w:tcMar>
+              <w:top w:type="dxa" w:w="80"/>
+              <w:left w:type="dxa" w:w="120"/>
+              <w:bottom w:type="dxa" w:w="80"/>
+              <w:right w:type="dxa" w:w="120"/>
+            </w:tcMar>
+          </w:tcPr>
+          <w:p>
+            <w:pPr>
+              <w:spacing w:after="0" w:before="0"/>
+              <w:jc w:val="left"/>
+            </w:pPr>
+            <w:r>
+              <w:rPr>
+                <w:rFonts w:ascii="Calibri" w:cs="Calibri" w:eastAsia="Calibri" w:hAnsi="Calibri"/>
+                <w:b w:val="false"/>
+                <w:bCs w:val="false"/>
+                <w:i w:val="false"/>
+                <w:iCs w:val="false"/>
+                <w:color w:val="6B7280"/>
+                <w:sz w:val="18"/>
+                <w:szCs w:val="18"/>
+              </w:rPr>
+              <w:t>Netlify Blobs store msp-report-metrics, scoped to this site by the Functions runtime (no separate credentials to create or leak), encrypted at rest and in transit. Holds summary figures only — no raw tenant data, no credentials — keyed tenantId/YYYY-MM, rolling 13-month retention, pruned after each save</w:t>
+            </w:r>
+          </w:p>
+        </w:tc>
+      </w:tr>
+      <w:tr>
+        <w:tc>
+          <w:tcPr>
+            <w:tcW w:type="dxa" w:w="2995"/>
+            <w:tcBorders>
+              <w:top w:val="single" w:color="E5E7EB" w:sz="4"/>
+              <w:left w:val="single" w:color="E5E7EB" w:sz="4"/>
+              <w:bottom w:val="single" w:color="E5E7EB" w:sz="4"/>
+              <w:right w:val="single" w:color="E5E7EB" w:sz="4"/>
+            </w:tcBorders>
+            <w:shd w:fill="FFFFFF" w:val="clear"/>
+            <w:tcMar>
+              <w:top w:type="dxa" w:w="80"/>
+              <w:left w:type="dxa" w:w="120"/>
+              <w:bottom w:type="dxa" w:w="80"/>
+              <w:right w:type="dxa" w:w="120"/>
+            </w:tcMar>
+          </w:tcPr>
+          <w:p>
+            <w:pPr>
+              <w:spacing w:after="0" w:before="0"/>
+              <w:jc w:val="left"/>
+            </w:pPr>
+            <w:r>
+              <w:rPr>
+                <w:rFonts w:ascii="Calibri" w:cs="Calibri" w:eastAsia="Calibri" w:hAnsi="Calibri"/>
+                <w:b/>
+                <w:bCs/>
+                <w:i w:val="false"/>
+                <w:iCs w:val="false"/>
+                <w:color w:val="1F2937"/>
+                <w:sz w:val="18"/>
+                <w:szCs w:val="18"/>
+              </w:rPr>
+              <w:t>Retention opt-out and deletion</w:t>
+            </w:r>
+          </w:p>
+        </w:tc>
+        <w:tc>
+          <w:tcPr>
+            <w:tcW w:type="dxa" w:w="6365"/>
+            <w:tcBorders>
+              <w:top w:val="single" w:color="E5E7EB" w:sz="4"/>
+              <w:left w:val="single" w:color="E5E7EB" w:sz="4"/>
+              <w:bottom w:val="single" w:color="E5E7EB" w:sz="4"/>
+              <w:right w:val="single" w:color="E5E7EB" w:sz="4"/>
+            </w:tcBorders>
+            <w:shd w:fill="FFFFFF" w:val="clear"/>
+            <w:tcMar>
+              <w:top w:type="dxa" w:w="80"/>
+              <w:left w:type="dxa" w:w="120"/>
+              <w:bottom w:type="dxa" w:w="80"/>
+              <w:right w:type="dxa" w:w="120"/>
+            </w:tcMar>
+          </w:tcPr>
+          <w:p>
+            <w:pPr>
+              <w:spacing w:after="0" w:before="0"/>
+              <w:jc w:val="left"/>
+            </w:pPr>
+            <w:r>
+              <w:rPr>
+                <w:rFonts w:ascii="Calibri" w:cs="Calibri" w:eastAsia="Calibri" w:hAnsi="Calibri"/>
+                <w:b w:val="false"/>
+                <w:bCs w:val="false"/>
+                <w:i w:val="false"/>
+                <w:iCs w:val="false"/>
+                <w:color w:val="6B7280"/>
+                <w:sz w:val="18"/>
+                <w:szCs w:val="18"/>
+              </w:rPr>
+              <w:t>The wizard’s One-off report option skips saving and deletes the tenant’s history; delete-client-metrics.js (ARCHIVE_ADMIN_KEY, fails closed if unset) deletes it on request afterwards. Report covers state actual retention via the metricsRetained flag</w:t>
             </w:r>
           </w:p>
         </w:tc>
@@ -3209,7 +3743,7 @@
                 <w:sz w:val="17"/>
                 <w:szCs w:val="17"/>
               </w:rPr>
-              <w:t xml:space="preserve">Total licensed users, shared mailboxes, guests, inactive 90d+ (licensed and guest), admin roles, overseas sign-ins, licence assignment</w:t>
+              <w:t>Total licensed users, shared mailboxes, guests, inactive 90d+ (licensed and guest), admin roles, overseas sign-ins, licence assignment, upcoming licence renewals (next 90 days)</w:t>
             </w:r>
           </w:p>
         </w:tc>
@@ -3322,7 +3856,7 @@
                 <w:sz w:val="17"/>
                 <w:szCs w:val="17"/>
               </w:rPr>
-              <w:t xml:space="preserve">Total sites, M365 group sites, comm sites, classic sites, groups, security groups, storage used, inactive 180d+</w:t>
+              <w:t>Total sites by type (M365 Group, Communication, Teams sites, Teams channels, Classic, Other — Classic and Other are hidden when zero), M365 groups, security groups, storage used (binary GB), inactive 180d+</w:t>
             </w:r>
           </w:p>
         </w:tc>
@@ -3359,7 +3893,120 @@
                 <w:sz w:val="17"/>
                 <w:szCs w:val="17"/>
               </w:rPr>
-              <w:t xml:space="preserve">Storage allocation no longer exposed by Graph — only usage shown</w:t>
+              <w:t>Storage allocation no longer exposed by Graph — only usage shown. The usage report lags 24–48 hours and includes hidden channel/system sites, so totals exceed the SharePoint admin center’s Active sites list</w:t>
+            </w:r>
+          </w:p>
+        </w:tc>
+      </w:tr>
+      <w:tr>
+        <w:tc>
+          <w:tcPr>
+            <w:tcW w:type="dxa" w:w="2059"/>
+            <w:tcBorders>
+              <w:top w:val="single" w:color="E5E7EB" w:sz="4"/>
+              <w:left w:val="single" w:color="E5E7EB" w:sz="4"/>
+              <w:bottom w:val="single" w:color="E5E7EB" w:sz="4"/>
+              <w:right w:val="single" w:color="E5E7EB" w:sz="4"/>
+            </w:tcBorders>
+            <w:shd w:fill="FFFFFF" w:val="clear"/>
+            <w:tcMar>
+              <w:top w:type="dxa" w:w="80"/>
+              <w:left w:type="dxa" w:w="120"/>
+              <w:bottom w:type="dxa" w:w="80"/>
+              <w:right w:type="dxa" w:w="120"/>
+            </w:tcMar>
+          </w:tcPr>
+          <w:p>
+            <w:pPr>
+              <w:spacing w:after="0" w:before="0"/>
+              <w:jc w:val="left"/>
+            </w:pPr>
+            <w:r>
+              <w:rPr>
+                <w:rFonts w:ascii="Calibri" w:cs="Calibri" w:eastAsia="Calibri" w:hAnsi="Calibri"/>
+                <w:b/>
+                <w:bCs/>
+                <w:i w:val="false"/>
+                <w:iCs w:val="false"/>
+                <w:color w:val="1A8070"/>
+                <w:sz w:val="17"/>
+                <w:szCs w:val="17"/>
+              </w:rPr>
+              <w:t>Month-on-Month</w:t>
+            </w:r>
+          </w:p>
+        </w:tc>
+        <w:tc>
+          <w:tcPr>
+            <w:tcW w:type="dxa" w:w="4680"/>
+            <w:tcBorders>
+              <w:top w:val="single" w:color="E5E7EB" w:sz="4"/>
+              <w:left w:val="single" w:color="E5E7EB" w:sz="4"/>
+              <w:bottom w:val="single" w:color="E5E7EB" w:sz="4"/>
+              <w:right w:val="single" w:color="E5E7EB" w:sz="4"/>
+            </w:tcBorders>
+            <w:shd w:fill="FFFFFF" w:val="clear"/>
+            <w:tcMar>
+              <w:top w:type="dxa" w:w="80"/>
+              <w:left w:type="dxa" w:w="120"/>
+              <w:bottom w:type="dxa" w:w="80"/>
+              <w:right w:type="dxa" w:w="120"/>
+            </w:tcMar>
+          </w:tcPr>
+          <w:p>
+            <w:pPr>
+              <w:spacing w:after="0" w:before="0"/>
+              <w:jc w:val="left"/>
+            </w:pPr>
+            <w:r>
+              <w:rPr>
+                <w:rFonts w:ascii="Calibri" w:cs="Calibri" w:eastAsia="Calibri" w:hAnsi="Calibri"/>
+                <w:b w:val="false"/>
+                <w:bCs w:val="false"/>
+                <w:i w:val="false"/>
+                <w:iCs w:val="false"/>
+                <w:color w:val="6B7280"/>
+                <w:sz w:val="17"/>
+                <w:szCs w:val="17"/>
+              </w:rPr>
+              <w:t>Total devices, compliant / non-compliant, Secure Score, risky users, licensed users, inactive 90d+, admin roles, SharePoint storage (encryption, guests and site counts are also stored for future use)</w:t>
+            </w:r>
+          </w:p>
+        </w:tc>
+        <w:tc>
+          <w:tcPr>
+            <w:tcW w:type="dxa" w:w="2621"/>
+            <w:tcBorders>
+              <w:top w:val="single" w:color="E5E7EB" w:sz="4"/>
+              <w:left w:val="single" w:color="E5E7EB" w:sz="4"/>
+              <w:bottom w:val="single" w:color="E5E7EB" w:sz="4"/>
+              <w:right w:val="single" w:color="E5E7EB" w:sz="4"/>
+            </w:tcBorders>
+            <w:shd w:fill="FFFFFF" w:val="clear"/>
+            <w:tcMar>
+              <w:top w:type="dxa" w:w="80"/>
+              <w:left w:type="dxa" w:w="120"/>
+              <w:bottom w:type="dxa" w:w="80"/>
+              <w:right w:type="dxa" w:w="120"/>
+            </w:tcMar>
+          </w:tcPr>
+          <w:p>
+            <w:pPr>
+              <w:spacing w:after="0" w:before="0"/>
+              <w:jc w:val="left"/>
+            </w:pPr>
+            <w:r>
+              <w:rPr>
+                <w:rFonts w:ascii="Calibri" w:cs="Calibri" w:eastAsia="Calibri" w:hAnsi="Calibri"/>
+                <w:b w:val="false"/>
+                <w:bCs w:val="false"/>
+                <w:i w:val="false"/>
+                <w:iCs w:val="false"/>
+                <w:color w:val="6B7280"/>
+                <w:sz w:val="17"/>
+                <w:szCs w:val="17"/>
+              </w:rPr>
+              <w:t>Deterministic template sentences, only for changes above a threshold; null (section omitted) when there is no prior month</w:t>
             </w:r>
           </w:p>
         </w:tc>
@@ -3821,7 +4468,7 @@
                 <w:sz w:val="18"/>
                 <w:szCs w:val="18"/>
               </w:rPr>
-              <w:t xml:space="preserve">A full-period and half-period sign-in query run in parallel with each other (after the first 16 calls complete); the half-period result covers tenants where the full-period query times out</w:t>
+              <w:t>A full-period and half-period sign-in query run in parallel with each other (after the first 17 calls complete); the half-period result covers tenants where the full-period query times out</w:t>
             </w:r>
           </w:p>
         </w:tc>
@@ -4202,6 +4849,462 @@
                 <w:szCs w:val="18"/>
               </w:rPr>
               <w:t xml:space="preserve">Treated as maximum inactivity (not excluded) — these are the accounts most likely to be forgotten and unlicensed</w:t>
+            </w:r>
+          </w:p>
+        </w:tc>
+      </w:tr>
+      <w:tr>
+        <w:tc>
+          <w:tcPr>
+            <w:tcW w:type="dxa" w:w="2995"/>
+            <w:tcBorders>
+              <w:top w:val="single" w:color="E5E7EB" w:sz="4"/>
+              <w:left w:val="single" w:color="E5E7EB" w:sz="4"/>
+              <w:bottom w:val="single" w:color="E5E7EB" w:sz="4"/>
+              <w:right w:val="single" w:color="E5E7EB" w:sz="4"/>
+            </w:tcBorders>
+            <w:shd w:fill="FFFFFF" w:val="clear"/>
+            <w:tcMar>
+              <w:top w:type="dxa" w:w="80"/>
+              <w:left w:type="dxa" w:w="120"/>
+              <w:bottom w:type="dxa" w:w="80"/>
+              <w:right w:type="dxa" w:w="120"/>
+            </w:tcMar>
+          </w:tcPr>
+          <w:p>
+            <w:pPr>
+              <w:spacing w:after="0" w:before="0"/>
+              <w:jc w:val="left"/>
+            </w:pPr>
+            <w:r>
+              <w:rPr>
+                <w:rFonts w:ascii="Calibri" w:cs="Calibri" w:eastAsia="Calibri" w:hAnsi="Calibri"/>
+                <w:b/>
+                <w:bCs/>
+                <w:i w:val="false"/>
+                <w:iCs w:val="false"/>
+                <w:color w:val="1F2937"/>
+                <w:sz w:val="18"/>
+                <w:szCs w:val="18"/>
+              </w:rPr>
+              <w:t>SharePoint type from Root Web Template</w:t>
+            </w:r>
+          </w:p>
+        </w:tc>
+        <w:tc>
+          <w:tcPr>
+            <w:tcW w:type="dxa" w:w="6365"/>
+            <w:tcBorders>
+              <w:top w:val="single" w:color="E5E7EB" w:sz="4"/>
+              <w:left w:val="single" w:color="E5E7EB" w:sz="4"/>
+              <w:bottom w:val="single" w:color="E5E7EB" w:sz="4"/>
+              <w:right w:val="single" w:color="E5E7EB" w:sz="4"/>
+            </w:tcBorders>
+            <w:shd w:fill="FFFFFF" w:val="clear"/>
+            <w:tcMar>
+              <w:top w:type="dxa" w:w="80"/>
+              <w:left w:type="dxa" w:w="120"/>
+              <w:bottom w:type="dxa" w:w="80"/>
+              <w:right w:type="dxa" w:w="120"/>
+            </w:tcMar>
+          </w:tcPr>
+          <w:p>
+            <w:pPr>
+              <w:spacing w:after="0" w:before="0"/>
+              <w:jc w:val="left"/>
+            </w:pPr>
+            <w:r>
+              <w:rPr>
+                <w:rFonts w:ascii="Calibri" w:cs="Calibri" w:eastAsia="Calibri" w:hAnsi="Calibri"/>
+                <w:b w:val="false"/>
+                <w:bCs w:val="false"/>
+                <w:i w:val="false"/>
+                <w:iCs w:val="false"/>
+                <w:color w:val="6B7280"/>
+                <w:sz w:val="18"/>
+                <w:szCs w:val="18"/>
+              </w:rPr>
+              <w:t>Matched by prefix/fragment for raw codes and friendly names — an exact match on the bare word never matched real values and dumped every site into one bucket. Microsoft does not document the column’s values, so intune.js returns a per-template breakdown shown on the review step to keep the bucketing verifiable. Storage is the per-site sum; the tenant-wide storage trend report was dropped because it cannot be split by type</w:t>
+            </w:r>
+          </w:p>
+        </w:tc>
+      </w:tr>
+      <w:tr>
+        <w:tc>
+          <w:tcPr>
+            <w:tcW w:type="dxa" w:w="2995"/>
+            <w:tcBorders>
+              <w:top w:val="single" w:color="E5E7EB" w:sz="4"/>
+              <w:left w:val="single" w:color="E5E7EB" w:sz="4"/>
+              <w:bottom w:val="single" w:color="E5E7EB" w:sz="4"/>
+              <w:right w:val="single" w:color="E5E7EB" w:sz="4"/>
+            </w:tcBorders>
+            <w:shd w:fill="FFFFFF" w:val="clear"/>
+            <w:tcMar>
+              <w:top w:type="dxa" w:w="80"/>
+              <w:left w:type="dxa" w:w="120"/>
+              <w:bottom w:type="dxa" w:w="80"/>
+              <w:right w:type="dxa" w:w="120"/>
+            </w:tcMar>
+          </w:tcPr>
+          <w:p>
+            <w:pPr>
+              <w:spacing w:after="0" w:before="0"/>
+              <w:jc w:val="left"/>
+            </w:pPr>
+            <w:r>
+              <w:rPr>
+                <w:rFonts w:ascii="Calibri" w:cs="Calibri" w:eastAsia="Calibri" w:hAnsi="Calibri"/>
+                <w:b/>
+                <w:bCs/>
+                <w:i w:val="false"/>
+                <w:iCs w:val="false"/>
+                <w:color w:val="1F2937"/>
+                <w:sz w:val="18"/>
+                <w:szCs w:val="18"/>
+              </w:rPr>
+              <w:t>Licence renewals from /directory/subscriptions</w:t>
+            </w:r>
+          </w:p>
+        </w:tc>
+        <w:tc>
+          <w:tcPr>
+            <w:tcW w:type="dxa" w:w="6365"/>
+            <w:tcBorders>
+              <w:top w:val="single" w:color="E5E7EB" w:sz="4"/>
+              <w:left w:val="single" w:color="E5E7EB" w:sz="4"/>
+              <w:bottom w:val="single" w:color="E5E7EB" w:sz="4"/>
+              <w:right w:val="single" w:color="E5E7EB" w:sz="4"/>
+            </w:tcBorders>
+            <w:shd w:fill="FFFFFF" w:val="clear"/>
+            <w:tcMar>
+              <w:top w:type="dxa" w:w="80"/>
+              <w:left w:type="dxa" w:w="120"/>
+              <w:bottom w:type="dxa" w:w="80"/>
+              <w:right w:type="dxa" w:w="120"/>
+            </w:tcMar>
+          </w:tcPr>
+          <w:p>
+            <w:pPr>
+              <w:spacing w:after="0" w:before="0"/>
+              <w:jc w:val="left"/>
+            </w:pPr>
+            <w:r>
+              <w:rPr>
+                <w:rFonts w:ascii="Calibri" w:cs="Calibri" w:eastAsia="Calibri" w:hAnsi="Calibri"/>
+                <w:b w:val="false"/>
+                <w:bCs w:val="false"/>
+                <w:i w:val="false"/>
+                <w:iCs w:val="false"/>
+                <w:color w:val="6B7280"/>
+                <w:sz w:val="18"/>
+                <w:szCs w:val="18"/>
+              </w:rPr>
+              <w:t>Only Enabled, non-trial records are used — Microsoft leaves superseded Suspended / LockedOut records behind after each renewal. Billing frequency is not exposed, so Monthly vs Annual/Multi-year is inferred from days to renewal (35-day cut-off); renewals 0–90 days away are shown</w:t>
+            </w:r>
+          </w:p>
+        </w:tc>
+      </w:tr>
+      <w:tr>
+        <w:tc>
+          <w:tcPr>
+            <w:tcW w:type="dxa" w:w="2995"/>
+            <w:tcBorders>
+              <w:top w:val="single" w:color="E5E7EB" w:sz="4"/>
+              <w:left w:val="single" w:color="E5E7EB" w:sz="4"/>
+              <w:bottom w:val="single" w:color="E5E7EB" w:sz="4"/>
+              <w:right w:val="single" w:color="E5E7EB" w:sz="4"/>
+            </w:tcBorders>
+            <w:shd w:fill="FFFFFF" w:val="clear"/>
+            <w:tcMar>
+              <w:top w:type="dxa" w:w="80"/>
+              <w:left w:type="dxa" w:w="120"/>
+              <w:bottom w:type="dxa" w:w="80"/>
+              <w:right w:type="dxa" w:w="120"/>
+            </w:tcMar>
+          </w:tcPr>
+          <w:p>
+            <w:pPr>
+              <w:spacing w:after="0" w:before="0"/>
+              <w:jc w:val="left"/>
+            </w:pPr>
+            <w:r>
+              <w:rPr>
+                <w:rFonts w:ascii="Calibri" w:cs="Calibri" w:eastAsia="Calibri" w:hAnsi="Calibri"/>
+                <w:b/>
+                <w:bCs/>
+                <w:i w:val="false"/>
+                <w:iCs w:val="false"/>
+                <w:color w:val="1F2937"/>
+                <w:sz w:val="18"/>
+                <w:szCs w:val="18"/>
+              </w:rPr>
+              <w:t>Month-on-month commentary is deterministic</w:t>
+            </w:r>
+          </w:p>
+        </w:tc>
+        <w:tc>
+          <w:tcPr>
+            <w:tcW w:type="dxa" w:w="6365"/>
+            <w:tcBorders>
+              <w:top w:val="single" w:color="E5E7EB" w:sz="4"/>
+              <w:left w:val="single" w:color="E5E7EB" w:sz="4"/>
+              <w:bottom w:val="single" w:color="E5E7EB" w:sz="4"/>
+              <w:right w:val="single" w:color="E5E7EB" w:sz="4"/>
+            </w:tcBorders>
+            <w:shd w:fill="FFFFFF" w:val="clear"/>
+            <w:tcMar>
+              <w:top w:type="dxa" w:w="80"/>
+              <w:left w:type="dxa" w:w="120"/>
+              <w:bottom w:type="dxa" w:w="80"/>
+              <w:right w:type="dxa" w:w="120"/>
+            </w:tcMar>
+          </w:tcPr>
+          <w:p>
+            <w:pPr>
+              <w:spacing w:after="0" w:before="0"/>
+              <w:jc w:val="left"/>
+            </w:pPr>
+            <w:r>
+              <w:rPr>
+                <w:rFonts w:ascii="Calibri" w:cs="Calibri" w:eastAsia="Calibri" w:hAnsi="Calibri"/>
+                <w:b w:val="false"/>
+                <w:bCs w:val="false"/>
+                <w:i w:val="false"/>
+                <w:iCs w:val="false"/>
+                <w:color w:val="6B7280"/>
+                <w:sz w:val="18"/>
+                <w:szCs w:val="18"/>
+              </w:rPr>
+              <w:t>Template sentences built from computed deltas — no AI-generated text — so every statement traces to a number in the report. A tightly constrained AI wording pass is the planned upgrade if the phrasing becomes repetitive</w:t>
+            </w:r>
+          </w:p>
+        </w:tc>
+      </w:tr>
+      <w:tr>
+        <w:tc>
+          <w:tcPr>
+            <w:tcW w:type="dxa" w:w="2995"/>
+            <w:tcBorders>
+              <w:top w:val="single" w:color="E5E7EB" w:sz="4"/>
+              <w:left w:val="single" w:color="E5E7EB" w:sz="4"/>
+              <w:bottom w:val="single" w:color="E5E7EB" w:sz="4"/>
+              <w:right w:val="single" w:color="E5E7EB" w:sz="4"/>
+            </w:tcBorders>
+            <w:shd w:fill="FFFFFF" w:val="clear"/>
+            <w:tcMar>
+              <w:top w:type="dxa" w:w="80"/>
+              <w:left w:type="dxa" w:w="120"/>
+              <w:bottom w:type="dxa" w:w="80"/>
+              <w:right w:type="dxa" w:w="120"/>
+            </w:tcMar>
+          </w:tcPr>
+          <w:p>
+            <w:pPr>
+              <w:spacing w:after="0" w:before="0"/>
+              <w:jc w:val="left"/>
+            </w:pPr>
+            <w:r>
+              <w:rPr>
+                <w:rFonts w:ascii="Calibri" w:cs="Calibri" w:eastAsia="Calibri" w:hAnsi="Calibri"/>
+                <w:b/>
+                <w:bCs/>
+                <w:i w:val="false"/>
+                <w:iCs w:val="false"/>
+                <w:color w:val="1F2937"/>
+                <w:sz w:val="18"/>
+                <w:szCs w:val="18"/>
+              </w:rPr>
+              <w:t>Netlify Blobs for the metrics archive</w:t>
+            </w:r>
+          </w:p>
+        </w:tc>
+        <w:tc>
+          <w:tcPr>
+            <w:tcW w:type="dxa" w:w="6365"/>
+            <w:tcBorders>
+              <w:top w:val="single" w:color="E5E7EB" w:sz="4"/>
+              <w:left w:val="single" w:color="E5E7EB" w:sz="4"/>
+              <w:bottom w:val="single" w:color="E5E7EB" w:sz="4"/>
+              <w:right w:val="single" w:color="E5E7EB" w:sz="4"/>
+            </w:tcBorders>
+            <w:shd w:fill="FFFFFF" w:val="clear"/>
+            <w:tcMar>
+              <w:top w:type="dxa" w:w="80"/>
+              <w:left w:type="dxa" w:w="120"/>
+              <w:bottom w:type="dxa" w:w="80"/>
+              <w:right w:type="dxa" w:w="120"/>
+            </w:tcMar>
+          </w:tcPr>
+          <w:p>
+            <w:pPr>
+              <w:spacing w:after="0" w:before="0"/>
+              <w:jc w:val="left"/>
+            </w:pPr>
+            <w:r>
+              <w:rPr>
+                <w:rFonts w:ascii="Calibri" w:cs="Calibri" w:eastAsia="Calibri" w:hAnsi="Calibri"/>
+                <w:b w:val="false"/>
+                <w:bCs w:val="false"/>
+                <w:i w:val="false"/>
+                <w:iCs w:val="false"/>
+                <w:color w:val="6B7280"/>
+                <w:sz w:val="18"/>
+                <w:szCs w:val="18"/>
+              </w:rPr>
+              <w:t>Chosen over a SharePoint/Graph-based store: no extra app registration or secret to create, hold or rotate; scoped to the site automatically; encrypted. The archive key is the client’s Entra tenant ID, present on every call, so it works for any repeat run</w:t>
+            </w:r>
+          </w:p>
+        </w:tc>
+      </w:tr>
+      <w:tr>
+        <w:tc>
+          <w:tcPr>
+            <w:tcW w:type="dxa" w:w="2995"/>
+            <w:tcBorders>
+              <w:top w:val="single" w:color="E5E7EB" w:sz="4"/>
+              <w:left w:val="single" w:color="E5E7EB" w:sz="4"/>
+              <w:bottom w:val="single" w:color="E5E7EB" w:sz="4"/>
+              <w:right w:val="single" w:color="E5E7EB" w:sz="4"/>
+            </w:tcBorders>
+            <w:shd w:fill="FFFFFF" w:val="clear"/>
+            <w:tcMar>
+              <w:top w:type="dxa" w:w="80"/>
+              <w:left w:type="dxa" w:w="120"/>
+              <w:bottom w:type="dxa" w:w="80"/>
+              <w:right w:type="dxa" w:w="120"/>
+            </w:tcMar>
+          </w:tcPr>
+          <w:p>
+            <w:pPr>
+              <w:spacing w:after="0" w:before="0"/>
+              <w:jc w:val="left"/>
+            </w:pPr>
+            <w:r>
+              <w:rPr>
+                <w:rFonts w:ascii="Calibri" w:cs="Calibri" w:eastAsia="Calibri" w:hAnsi="Calibri"/>
+                <w:b/>
+                <w:bCs/>
+                <w:i w:val="false"/>
+                <w:iCs w:val="false"/>
+                <w:color w:val="1F2937"/>
+                <w:sz w:val="18"/>
+                <w:szCs w:val="18"/>
+              </w:rPr>
+              <w:t>Cover retention wording is per run</w:t>
+            </w:r>
+          </w:p>
+        </w:tc>
+        <w:tc>
+          <w:tcPr>
+            <w:tcW w:type="dxa" w:w="6365"/>
+            <w:tcBorders>
+              <w:top w:val="single" w:color="E5E7EB" w:sz="4"/>
+              <w:left w:val="single" w:color="E5E7EB" w:sz="4"/>
+              <w:bottom w:val="single" w:color="E5E7EB" w:sz="4"/>
+              <w:right w:val="single" w:color="E5E7EB" w:sz="4"/>
+            </w:tcBorders>
+            <w:shd w:fill="FFFFFF" w:val="clear"/>
+            <w:tcMar>
+              <w:top w:type="dxa" w:w="80"/>
+              <w:left w:type="dxa" w:w="120"/>
+              <w:bottom w:type="dxa" w:w="80"/>
+              <w:right w:type="dxa" w:w="120"/>
+            </w:tcMar>
+          </w:tcPr>
+          <w:p>
+            <w:pPr>
+              <w:spacing w:after="0" w:before="0"/>
+              <w:jc w:val="left"/>
+            </w:pPr>
+            <w:r>
+              <w:rPr>
+                <w:rFonts w:ascii="Calibri" w:cs="Calibri" w:eastAsia="Calibri" w:hAnsi="Calibri"/>
+                <w:b w:val="false"/>
+                <w:bCs w:val="false"/>
+                <w:i w:val="false"/>
+                <w:iCs w:val="false"/>
+                <w:color w:val="6B7280"/>
+                <w:sz w:val="18"/>
+                <w:szCs w:val="18"/>
+              </w:rPr>
+              <w:t>metricsRetained is true only if the snapshot was actually saved, so the report cover never over- or under-states retention</w:t>
+            </w:r>
+          </w:p>
+        </w:tc>
+      </w:tr>
+      <w:tr>
+        <w:tc>
+          <w:tcPr>
+            <w:tcW w:type="dxa" w:w="2995"/>
+            <w:tcBorders>
+              <w:top w:val="single" w:color="E5E7EB" w:sz="4"/>
+              <w:left w:val="single" w:color="E5E7EB" w:sz="4"/>
+              <w:bottom w:val="single" w:color="E5E7EB" w:sz="4"/>
+              <w:right w:val="single" w:color="E5E7EB" w:sz="4"/>
+            </w:tcBorders>
+            <w:shd w:fill="FFFFFF" w:val="clear"/>
+            <w:tcMar>
+              <w:top w:type="dxa" w:w="80"/>
+              <w:left w:type="dxa" w:w="120"/>
+              <w:bottom w:type="dxa" w:w="80"/>
+              <w:right w:type="dxa" w:w="120"/>
+            </w:tcMar>
+          </w:tcPr>
+          <w:p>
+            <w:pPr>
+              <w:spacing w:after="0" w:before="0"/>
+              <w:jc w:val="left"/>
+            </w:pPr>
+            <w:r>
+              <w:rPr>
+                <w:rFonts w:ascii="Calibri" w:cs="Calibri" w:eastAsia="Calibri" w:hAnsi="Calibri"/>
+                <w:b/>
+                <w:bCs/>
+                <w:i w:val="false"/>
+                <w:iCs w:val="false"/>
+                <w:color w:val="1F2937"/>
+                <w:sz w:val="18"/>
+                <w:szCs w:val="18"/>
+              </w:rPr>
+              <w:t>Storage in binary gigabytes</w:t>
+            </w:r>
+          </w:p>
+        </w:tc>
+        <w:tc>
+          <w:tcPr>
+            <w:tcW w:type="dxa" w:w="6365"/>
+            <w:tcBorders>
+              <w:top w:val="single" w:color="E5E7EB" w:sz="4"/>
+              <w:left w:val="single" w:color="E5E7EB" w:sz="4"/>
+              <w:bottom w:val="single" w:color="E5E7EB" w:sz="4"/>
+              <w:right w:val="single" w:color="E5E7EB" w:sz="4"/>
+            </w:tcBorders>
+            <w:shd w:fill="FFFFFF" w:val="clear"/>
+            <w:tcMar>
+              <w:top w:type="dxa" w:w="80"/>
+              <w:left w:type="dxa" w:w="120"/>
+              <w:bottom w:type="dxa" w:w="80"/>
+              <w:right w:type="dxa" w:w="120"/>
+            </w:tcMar>
+          </w:tcPr>
+          <w:p>
+            <w:pPr>
+              <w:spacing w:after="0" w:before="0"/>
+              <w:jc w:val="left"/>
+            </w:pPr>
+            <w:r>
+              <w:rPr>
+                <w:rFonts w:ascii="Calibri" w:cs="Calibri" w:eastAsia="Calibri" w:hAnsi="Calibri"/>
+                <w:b w:val="false"/>
+                <w:bCs w:val="false"/>
+                <w:i w:val="false"/>
+                <w:iCs w:val="false"/>
+                <w:color w:val="6B7280"/>
+                <w:sz w:val="18"/>
+                <w:szCs w:val="18"/>
+              </w:rPr>
+              <w:t>All storage figures divide bytes by 2^30 (BYTES_PER_GB in intune.js), the basis the SharePoint admin center and Windows use. Dividing by 1e9 had overstated every total by about 7.4% (e.g. 1,757 GB shown against 1.6 TB in SharePoint admin). Snapshots saved before the fix hold the old figure</w:t>
             </w:r>
           </w:p>
         </w:tc>
@@ -4290,7 +5393,7 @@
           <w:sz w:val="18"/>
           <w:szCs w:val="18"/>
         </w:rPr>
-        <w:t xml:space="preserve">git add -A</w:t>
+        <w:t>git status   (check what changed first), then: git add &lt;the files you changed&gt;   — stage specific files rather than a blind git add -A</w:t>
       </w:r>
     </w:p>
     <w:p>
@@ -4498,6 +5601,82 @@
           <w:szCs w:val="19"/>
         </w:rPr>
         <w:t xml:space="preserve">Linking a GitHub repo to Netlify for continuous deployment itself required one interactive, non-scriptable step (Netlify’s dashboard "Link repository" flow, which installs a deploy key on the GitHub repo) — see DEPLOY.md for the full one-time setup runbook. That step has already been completed for this project.</w:t>
+      </w:r>
+    </w:p>
+    <w:p>
+      <w:pPr>
+        <w:pStyle w:val="Heading3"/>
+        <w:spacing w:after="60" w:before="180"/>
+      </w:pPr>
+      <w:r>
+        <w:rPr>
+          <w:rFonts w:ascii="Calibri" w:cs="Calibri" w:eastAsia="Calibri" w:hAnsi="Calibri"/>
+          <w:b/>
+          <w:bCs/>
+          <w:i w:val="false"/>
+          <w:iCs w:val="false"/>
+          <w:color w:val="1F2937"/>
+          <w:sz w:val="21"/>
+          <w:szCs w:val="21"/>
+        </w:rPr>
+        <w:t>Verifying a deploy, dependency pinning and environment variables</w:t>
+      </w:r>
+    </w:p>
+    <w:p>
+      <w:pPr>
+        <w:spacing w:after="120" w:before="0"/>
+        <w:jc w:val="left"/>
+      </w:pPr>
+      <w:r>
+        <w:rPr>
+          <w:rFonts w:ascii="Calibri" w:cs="Calibri" w:eastAsia="Calibri" w:hAnsi="Calibri"/>
+          <w:b w:val="false"/>
+          <w:bCs w:val="false"/>
+          <w:i w:val="false"/>
+          <w:iCs w:val="false"/>
+          <w:color w:val="1F2937"/>
+          <w:sz w:val="19"/>
+          <w:szCs w:val="19"/>
+        </w:rPr>
+        <w:t>A push is not proof of a deploy: a failed Netlify build leaves the site serving the last good version. After pushing, confirm the deploy reaches the ready state (netlify api listSiteDeploys, or the Deploys tab).</w:t>
+      </w:r>
+    </w:p>
+    <w:p>
+      <w:pPr>
+        <w:spacing w:after="120" w:before="0"/>
+        <w:jc w:val="left"/>
+      </w:pPr>
+      <w:r>
+        <w:rPr>
+          <w:rFonts w:ascii="Calibri" w:cs="Calibri" w:eastAsia="Calibri" w:hAnsi="Calibri"/>
+          <w:b w:val="false"/>
+          <w:bCs w:val="false"/>
+          <w:i w:val="false"/>
+          <w:iCs w:val="false"/>
+          <w:color w:val="1F2937"/>
+          <w:sz w:val="19"/>
+          <w:szCs w:val="19"/>
+        </w:rPr>
+        <w:t>package-lock.json is gitignored, so Netlify installs from package.json alone. @netlify/blobs is pinned to an exact version (11.0.3): a caret range on the newest patch failed to resolve during Netlify’s install step (ETARGET) and silently blocked two consecutive deploys.</w:t>
+      </w:r>
+    </w:p>
+    <w:p>
+      <w:pPr>
+        <w:spacing w:after="120" w:before="0"/>
+        <w:jc w:val="left"/>
+      </w:pPr>
+      <w:r>
+        <w:rPr>
+          <w:rFonts w:ascii="Calibri" w:cs="Calibri" w:eastAsia="Calibri" w:hAnsi="Calibri"/>
+          <w:b w:val="false"/>
+          <w:bCs w:val="false"/>
+          <w:i w:val="false"/>
+          <w:iCs w:val="false"/>
+          <w:color w:val="1F2937"/>
+          <w:sz w:val="19"/>
+          <w:szCs w:val="19"/>
+        </w:rPr>
+        <w:t>Environment variables: REPORT_HUB_SHARED_KEY (auth for clients / report-data), INTUNE_CLIENTS_JSON (report-hub client credentials), and ARCHIVE_ADMIN_KEY (optional — enables delete-client-metrics.js, which refuses every call while it is unset). Netlify Blobs itself needs no variables.</w:t>
       </w:r>
     </w:p>
     <w:p>
@@ -4996,6 +6175,386 @@
                 <w:szCs w:val="18"/>
               </w:rPr>
               <w:t xml:space="preserve">Netlify's built-in site password intercepts all requests including function calls — use an in-app password gate or Netlify Identity instead</w:t>
+            </w:r>
+          </w:p>
+        </w:tc>
+      </w:tr>
+      <w:tr>
+        <w:tc>
+          <w:tcPr>
+            <w:tcW w:type="dxa" w:w="2995"/>
+            <w:tcBorders>
+              <w:top w:val="single" w:color="E5E7EB" w:sz="4"/>
+              <w:left w:val="single" w:color="E5E7EB" w:sz="4"/>
+              <w:bottom w:val="single" w:color="E5E7EB" w:sz="4"/>
+              <w:right w:val="single" w:color="E5E7EB" w:sz="4"/>
+            </w:tcBorders>
+            <w:shd w:fill="F9FAFB" w:val="clear"/>
+            <w:tcMar>
+              <w:top w:type="dxa" w:w="80"/>
+              <w:left w:type="dxa" w:w="120"/>
+              <w:bottom w:type="dxa" w:w="80"/>
+              <w:right w:type="dxa" w:w="120"/>
+            </w:tcMar>
+          </w:tcPr>
+          <w:p>
+            <w:pPr>
+              <w:spacing w:after="0" w:before="0"/>
+              <w:jc w:val="left"/>
+            </w:pPr>
+            <w:r>
+              <w:rPr>
+                <w:rFonts w:ascii="Calibri" w:cs="Calibri" w:eastAsia="Calibri" w:hAnsi="Calibri"/>
+                <w:b/>
+                <w:bCs/>
+                <w:i w:val="false"/>
+                <w:iCs w:val="false"/>
+                <w:color w:val="1F2937"/>
+                <w:sz w:val="18"/>
+                <w:szCs w:val="18"/>
+              </w:rPr>
+              <w:t>Commentary needs a prior month</w:t>
+            </w:r>
+          </w:p>
+        </w:tc>
+        <w:tc>
+          <w:tcPr>
+            <w:tcW w:type="dxa" w:w="6365"/>
+            <w:tcBorders>
+              <w:top w:val="single" w:color="E5E7EB" w:sz="4"/>
+              <w:left w:val="single" w:color="E5E7EB" w:sz="4"/>
+              <w:bottom w:val="single" w:color="E5E7EB" w:sz="4"/>
+              <w:right w:val="single" w:color="E5E7EB" w:sz="4"/>
+            </w:tcBorders>
+            <w:shd w:fill="F9FAFB" w:val="clear"/>
+            <w:tcMar>
+              <w:top w:type="dxa" w:w="80"/>
+              <w:left w:type="dxa" w:w="120"/>
+              <w:bottom w:type="dxa" w:w="80"/>
+              <w:right w:type="dxa" w:w="120"/>
+            </w:tcMar>
+          </w:tcPr>
+          <w:p>
+            <w:pPr>
+              <w:spacing w:after="0" w:before="0"/>
+              <w:jc w:val="left"/>
+            </w:pPr>
+            <w:r>
+              <w:rPr>
+                <w:rFonts w:ascii="Calibri" w:cs="Calibri" w:eastAsia="Calibri" w:hAnsi="Calibri"/>
+                <w:b w:val="false"/>
+                <w:bCs w:val="false"/>
+                <w:i w:val="false"/>
+                <w:iCs w:val="false"/>
+                <w:color w:val="6B7280"/>
+                <w:sz w:val="18"/>
+                <w:szCs w:val="18"/>
+              </w:rPr>
+              <w:t>Month-on-month commentary only appears when the previous calendar month (relative to the report’s To date) was run for that tenant with One-off unticked; a skipped month means no comparison until two consecutive months exist</w:t>
+            </w:r>
+          </w:p>
+        </w:tc>
+      </w:tr>
+      <w:tr>
+        <w:tc>
+          <w:tcPr>
+            <w:tcW w:type="dxa" w:w="2995"/>
+            <w:tcBorders>
+              <w:top w:val="single" w:color="E5E7EB" w:sz="4"/>
+              <w:left w:val="single" w:color="E5E7EB" w:sz="4"/>
+              <w:bottom w:val="single" w:color="E5E7EB" w:sz="4"/>
+              <w:right w:val="single" w:color="E5E7EB" w:sz="4"/>
+            </w:tcBorders>
+            <w:shd w:fill="F9FAFB" w:val="clear"/>
+            <w:tcMar>
+              <w:top w:type="dxa" w:w="80"/>
+              <w:left w:type="dxa" w:w="120"/>
+              <w:bottom w:type="dxa" w:w="80"/>
+              <w:right w:type="dxa" w:w="120"/>
+            </w:tcMar>
+          </w:tcPr>
+          <w:p>
+            <w:pPr>
+              <w:spacing w:after="0" w:before="0"/>
+              <w:jc w:val="left"/>
+            </w:pPr>
+            <w:r>
+              <w:rPr>
+                <w:rFonts w:ascii="Calibri" w:cs="Calibri" w:eastAsia="Calibri" w:hAnsi="Calibri"/>
+                <w:b/>
+                <w:bCs/>
+                <w:i w:val="false"/>
+                <w:iCs w:val="false"/>
+                <w:color w:val="1F2937"/>
+                <w:sz w:val="18"/>
+                <w:szCs w:val="18"/>
+              </w:rPr>
+              <w:t>SharePoint counts vs the admin center</w:t>
+            </w:r>
+          </w:p>
+        </w:tc>
+        <w:tc>
+          <w:tcPr>
+            <w:tcW w:type="dxa" w:w="6365"/>
+            <w:tcBorders>
+              <w:top w:val="single" w:color="E5E7EB" w:sz="4"/>
+              <w:left w:val="single" w:color="E5E7EB" w:sz="4"/>
+              <w:bottom w:val="single" w:color="E5E7EB" w:sz="4"/>
+              <w:right w:val="single" w:color="E5E7EB" w:sz="4"/>
+            </w:tcBorders>
+            <w:shd w:fill="F9FAFB" w:val="clear"/>
+            <w:tcMar>
+              <w:top w:type="dxa" w:w="80"/>
+              <w:left w:type="dxa" w:w="120"/>
+              <w:bottom w:type="dxa" w:w="80"/>
+              <w:right w:type="dxa" w:w="120"/>
+            </w:tcMar>
+          </w:tcPr>
+          <w:p>
+            <w:pPr>
+              <w:spacing w:after="0" w:before="0"/>
+              <w:jc w:val="left"/>
+            </w:pPr>
+            <w:r>
+              <w:rPr>
+                <w:rFonts w:ascii="Calibri" w:cs="Calibri" w:eastAsia="Calibri" w:hAnsi="Calibri"/>
+                <w:b w:val="false"/>
+                <w:bCs w:val="false"/>
+                <w:i w:val="false"/>
+                <w:iCs w:val="false"/>
+                <w:color w:val="6B7280"/>
+                <w:sz w:val="18"/>
+                <w:szCs w:val="18"/>
+              </w:rPr>
+              <w:t>The usage report lags 24–48 hours and includes hidden Teams-channel and system sites the Active sites list hides, so totals differ. The Root Web Template value format is undocumented — check the review-step breakdown</w:t>
+            </w:r>
+          </w:p>
+        </w:tc>
+      </w:tr>
+      <w:tr>
+        <w:tc>
+          <w:tcPr>
+            <w:tcW w:type="dxa" w:w="2995"/>
+            <w:tcBorders>
+              <w:top w:val="single" w:color="E5E7EB" w:sz="4"/>
+              <w:left w:val="single" w:color="E5E7EB" w:sz="4"/>
+              <w:bottom w:val="single" w:color="E5E7EB" w:sz="4"/>
+              <w:right w:val="single" w:color="E5E7EB" w:sz="4"/>
+            </w:tcBorders>
+            <w:shd w:fill="F9FAFB" w:val="clear"/>
+            <w:tcMar>
+              <w:top w:type="dxa" w:w="80"/>
+              <w:left w:type="dxa" w:w="120"/>
+              <w:bottom w:type="dxa" w:w="80"/>
+              <w:right w:type="dxa" w:w="120"/>
+            </w:tcMar>
+          </w:tcPr>
+          <w:p>
+            <w:pPr>
+              <w:spacing w:after="0" w:before="0"/>
+              <w:jc w:val="left"/>
+            </w:pPr>
+            <w:r>
+              <w:rPr>
+                <w:rFonts w:ascii="Calibri" w:cs="Calibri" w:eastAsia="Calibri" w:hAnsi="Calibri"/>
+                <w:b/>
+                <w:bCs/>
+                <w:i w:val="false"/>
+                <w:iCs w:val="false"/>
+                <w:color w:val="1F2937"/>
+                <w:sz w:val="18"/>
+                <w:szCs w:val="18"/>
+              </w:rPr>
+              <w:t>Saved credentials sit in browser storage</w:t>
+            </w:r>
+          </w:p>
+        </w:tc>
+        <w:tc>
+          <w:tcPr>
+            <w:tcW w:type="dxa" w:w="6365"/>
+            <w:tcBorders>
+              <w:top w:val="single" w:color="E5E7EB" w:sz="4"/>
+              <w:left w:val="single" w:color="E5E7EB" w:sz="4"/>
+              <w:bottom w:val="single" w:color="E5E7EB" w:sz="4"/>
+              <w:right w:val="single" w:color="E5E7EB" w:sz="4"/>
+            </w:tcBorders>
+            <w:shd w:fill="F9FAFB" w:val="clear"/>
+            <w:tcMar>
+              <w:top w:type="dxa" w:w="80"/>
+              <w:left w:type="dxa" w:w="120"/>
+              <w:bottom w:type="dxa" w:w="80"/>
+              <w:right w:type="dxa" w:w="120"/>
+            </w:tcMar>
+          </w:tcPr>
+          <w:p>
+            <w:pPr>
+              <w:spacing w:after="0" w:before="0"/>
+              <w:jc w:val="left"/>
+            </w:pPr>
+            <w:r>
+              <w:rPr>
+                <w:rFonts w:ascii="Calibri" w:cs="Calibri" w:eastAsia="Calibri" w:hAnsi="Calibri"/>
+                <w:b w:val="false"/>
+                <w:bCs w:val="false"/>
+                <w:i w:val="false"/>
+                <w:iCs w:val="false"/>
+                <w:color w:val="6B7280"/>
+                <w:sz w:val="18"/>
+                <w:szCs w:val="18"/>
+              </w:rPr>
+              <w:t>Client secrets saved through the wizard are held in that browser’s local storage in plain text, on that device, until deleted</w:t>
+            </w:r>
+          </w:p>
+        </w:tc>
+      </w:tr>
+      <w:tr>
+        <w:tc>
+          <w:tcPr>
+            <w:tcW w:type="dxa" w:w="2995"/>
+            <w:tcBorders>
+              <w:top w:val="single" w:color="E5E7EB" w:sz="4"/>
+              <w:left w:val="single" w:color="E5E7EB" w:sz="4"/>
+              <w:bottom w:val="single" w:color="E5E7EB" w:sz="4"/>
+              <w:right w:val="single" w:color="E5E7EB" w:sz="4"/>
+            </w:tcBorders>
+            <w:shd w:fill="F9FAFB" w:val="clear"/>
+            <w:tcMar>
+              <w:top w:type="dxa" w:w="80"/>
+              <w:left w:type="dxa" w:w="120"/>
+              <w:bottom w:type="dxa" w:w="80"/>
+              <w:right w:type="dxa" w:w="120"/>
+            </w:tcMar>
+          </w:tcPr>
+          <w:p>
+            <w:pPr>
+              <w:spacing w:after="0" w:before="0"/>
+              <w:jc w:val="left"/>
+            </w:pPr>
+            <w:r>
+              <w:rPr>
+                <w:rFonts w:ascii="Calibri" w:cs="Calibri" w:eastAsia="Calibri" w:hAnsi="Calibri"/>
+                <w:b/>
+                <w:bCs/>
+                <w:i w:val="false"/>
+                <w:iCs w:val="false"/>
+                <w:color w:val="1F2937"/>
+                <w:sz w:val="18"/>
+                <w:szCs w:val="18"/>
+              </w:rPr>
+              <w:t>Renewal dates are inferred</w:t>
+            </w:r>
+          </w:p>
+        </w:tc>
+        <w:tc>
+          <w:tcPr>
+            <w:tcW w:type="dxa" w:w="6365"/>
+            <w:tcBorders>
+              <w:top w:val="single" w:color="E5E7EB" w:sz="4"/>
+              <w:left w:val="single" w:color="E5E7EB" w:sz="4"/>
+              <w:bottom w:val="single" w:color="E5E7EB" w:sz="4"/>
+              <w:right w:val="single" w:color="E5E7EB" w:sz="4"/>
+            </w:tcBorders>
+            <w:shd w:fill="F9FAFB" w:val="clear"/>
+            <w:tcMar>
+              <w:top w:type="dxa" w:w="80"/>
+              <w:left w:type="dxa" w:w="120"/>
+              <w:bottom w:type="dxa" w:w="80"/>
+              <w:right w:type="dxa" w:w="120"/>
+            </w:tcMar>
+          </w:tcPr>
+          <w:p>
+            <w:pPr>
+              <w:spacing w:after="0" w:before="0"/>
+              <w:jc w:val="left"/>
+            </w:pPr>
+            <w:r>
+              <w:rPr>
+                <w:rFonts w:ascii="Calibri" w:cs="Calibri" w:eastAsia="Calibri" w:hAnsi="Calibri"/>
+                <w:b w:val="false"/>
+                <w:bCs w:val="false"/>
+                <w:i w:val="false"/>
+                <w:iCs w:val="false"/>
+                <w:color w:val="6B7280"/>
+                <w:sz w:val="18"/>
+                <w:szCs w:val="18"/>
+              </w:rPr>
+              <w:t>Graph exposes nextLifecycleDateTime but not billing frequency or auto-renew; Monthly vs Annual/Multi-year is inferred from days to renewal</w:t>
+            </w:r>
+          </w:p>
+        </w:tc>
+      </w:tr>
+      <w:tr>
+        <w:tc>
+          <w:tcPr>
+            <w:tcW w:type="dxa" w:w="2995"/>
+            <w:tcBorders>
+              <w:top w:val="single" w:color="E5E7EB" w:sz="4"/>
+              <w:left w:val="single" w:color="E5E7EB" w:sz="4"/>
+              <w:bottom w:val="single" w:color="E5E7EB" w:sz="4"/>
+              <w:right w:val="single" w:color="E5E7EB" w:sz="4"/>
+            </w:tcBorders>
+            <w:shd w:fill="F9FAFB" w:val="clear"/>
+            <w:tcMar>
+              <w:top w:type="dxa" w:w="80"/>
+              <w:left w:type="dxa" w:w="120"/>
+              <w:bottom w:type="dxa" w:w="80"/>
+              <w:right w:type="dxa" w:w="120"/>
+            </w:tcMar>
+          </w:tcPr>
+          <w:p>
+            <w:pPr>
+              <w:spacing w:after="0" w:before="0"/>
+              <w:jc w:val="left"/>
+            </w:pPr>
+            <w:r>
+              <w:rPr>
+                <w:rFonts w:ascii="Calibri" w:cs="Calibri" w:eastAsia="Calibri" w:hAnsi="Calibri"/>
+                <w:b/>
+                <w:bCs/>
+                <w:i w:val="false"/>
+                <w:iCs w:val="false"/>
+                <w:color w:val="1F2937"/>
+                <w:sz w:val="18"/>
+                <w:szCs w:val="18"/>
+              </w:rPr>
+              <w:t>Dependency advisories</w:t>
+            </w:r>
+          </w:p>
+        </w:tc>
+        <w:tc>
+          <w:tcPr>
+            <w:tcW w:type="dxa" w:w="6365"/>
+            <w:tcBorders>
+              <w:top w:val="single" w:color="E5E7EB" w:sz="4"/>
+              <w:left w:val="single" w:color="E5E7EB" w:sz="4"/>
+              <w:bottom w:val="single" w:color="E5E7EB" w:sz="4"/>
+              <w:right w:val="single" w:color="E5E7EB" w:sz="4"/>
+            </w:tcBorders>
+            <w:shd w:fill="F9FAFB" w:val="clear"/>
+            <w:tcMar>
+              <w:top w:type="dxa" w:w="80"/>
+              <w:left w:type="dxa" w:w="120"/>
+              <w:bottom w:type="dxa" w:w="80"/>
+              <w:right w:type="dxa" w:w="120"/>
+            </w:tcMar>
+          </w:tcPr>
+          <w:p>
+            <w:pPr>
+              <w:spacing w:after="0" w:before="0"/>
+              <w:jc w:val="left"/>
+            </w:pPr>
+            <w:r>
+              <w:rPr>
+                <w:rFonts w:ascii="Calibri" w:cs="Calibri" w:eastAsia="Calibri" w:hAnsi="Calibri"/>
+                <w:b w:val="false"/>
+                <w:bCs w:val="false"/>
+                <w:i w:val="false"/>
+                <w:iCs w:val="false"/>
+                <w:color w:val="6B7280"/>
+                <w:sz w:val="18"/>
+                <w:szCs w:val="18"/>
+              </w:rPr>
+              <w:t>npm audit reports advisories in jspdf’s dompurify dependency (not exercised by the server-side PDF export); the fix is a breaking jspdf major upgrade, still pending</w:t>
             </w:r>
           </w:p>
         </w:tc>

</xml_diff>

<commit_message>
Docs: Teams count, no review step, diagnostics panel, 20 Graph calls
Co-Authored-By: Claude Sonnet 5.5 <noreply@anthropic.com>
</commit_message>
<xml_diff>
--- a/docs/Intune_Report_Architecture.docx
+++ b/docs/Intune_Report_Architecture.docx
@@ -1024,7 +1024,7 @@
           <w:sz w:val="19"/>
           <w:szCs w:val="19"/>
         </w:rPr>
-        <w:t xml:space="preserve">A single HTML file containing all markup, CSS, and JavaScript. There is no build step or bundler — the file is served as-is by Netlify. It implements a 4-page wizard-style flow:</w:t>
+        <w:t>A single HTML file containing all markup, CSS, and JavaScript. There is no build step or bundler — the file is served as-is by Netlify. It implements a 3-page wizard-style flow:</w:t>
       </w:r>
     </w:p>
     <w:p>
@@ -1093,7 +1093,7 @@
           <w:sz w:val="19"/>
           <w:szCs w:val="19"/>
         </w:rPr>
-        <w:t>Page 3 — review the auto-pulled KPIs (including a review-only Site templates detected table) and add manual commentary</w:t>
+        <w:t>Page 3 — the report is built automatically after the data is pulled (the former review step was removed). Full on-screen report, with Export to Word and browser print-to-PDF, and a collapsed, non-exported SharePoint template diagnostics panel (raw template values and their bucket); the header text links back to the start page</w:t>
       </w:r>
     </w:p>
     <w:p>
@@ -1116,7 +1116,70 @@
           <w:sz w:val="19"/>
           <w:szCs w:val="19"/>
         </w:rPr>
-        <w:t>Page 4 — full on-screen report, with Export to Word and browser print-to-PDF; the header text links back to the start page</w:t>
+        <w:t>index.html renders its on-screen report with its own code (renderPreview fills the diagnostics panel, buildReport builds the final report), separate from export-docx.js and export-pdf.js — any report-content change must be made in all four places</w:t>
+      </w:r>
+    </w:p>
+    <w:p>
+      <w:pPr>
+        <w:spacing w:after="120" w:before="0"/>
+        <w:jc w:val="left"/>
+      </w:pPr>
+    </w:p>
+    <w:p>
+      <w:pPr>
+        <w:pStyle w:val="Heading2"/>
+        <w:spacing w:after="80" w:before="240"/>
+      </w:pPr>
+      <w:r>
+        <w:rPr>
+          <w:rFonts w:ascii="Calibri" w:cs="Calibri" w:eastAsia="Calibri" w:hAnsi="Calibri"/>
+          <w:b/>
+          <w:bCs/>
+          <w:i w:val="false"/>
+          <w:iCs w:val="false"/>
+          <w:color w:val="1F2937"/>
+          <w:sz w:val="24"/>
+          <w:szCs w:val="24"/>
+        </w:rPr>
+        <w:t xml:space="preserve">3.2 Back end — Netlify Functions</w:t>
+      </w:r>
+    </w:p>
+    <w:p>
+      <w:pPr>
+        <w:pStyle w:val="Heading3"/>
+        <w:spacing w:after="60" w:before="180"/>
+      </w:pPr>
+      <w:r>
+        <w:rPr>
+          <w:rFonts w:ascii="Calibri" w:cs="Calibri" w:eastAsia="Calibri" w:hAnsi="Calibri"/>
+          <w:b/>
+          <w:bCs/>
+          <w:i w:val="false"/>
+          <w:iCs w:val="false"/>
+          <w:color w:val="1F2937"/>
+          <w:sz w:val="21"/>
+          <w:szCs w:val="21"/>
+        </w:rPr>
+        <w:t xml:space="preserve">netlify/functions/intune.js</w:t>
+      </w:r>
+    </w:p>
+    <w:p>
+      <w:pPr>
+        <w:spacing w:after="120" w:before="0"/>
+        <w:jc w:val="left"/>
+      </w:pPr>
+      <w:r>
+        <w:rPr>
+          <w:rFonts w:ascii="Calibri" w:cs="Calibri" w:eastAsia="Calibri" w:hAnsi="Calibri"/>
+          <w:b w:val="false"/>
+          <w:bCs w:val="false"/>
+          <w:i w:val="false"/>
+          <w:iCs w:val="false"/>
+          <w:color w:val="1F2937"/>
+          <w:sz w:val="19"/>
+          <w:szCs w:val="19"/>
+        </w:rPr>
+        <w:t>The data-gathering function. Accepts tenant credentials and a date range, authenticates against Microsoft Entra ID using the client credentials flow, then issues 18 parallel Graph API calls in a first batch, followed by 2 more parallel sign-in-log calls (full-period and half-period fallback) in a second batch — 20 real Graph API calls in total — to build a single structured JSON payload of 50+ metrics.</w:t>
       </w:r>
     </w:p>
     <w:p>
@@ -1139,70 +1202,7 @@
           <w:sz w:val="19"/>
           <w:szCs w:val="19"/>
         </w:rPr>
-        <w:t>index.html renders its on-screen report with its own code (renderPreview for the review step, buildReport for the final report), separate from export-docx.js and export-pdf.js — any report-content change must be made in all four places</w:t>
-      </w:r>
-    </w:p>
-    <w:p>
-      <w:pPr>
-        <w:spacing w:after="120" w:before="0"/>
-        <w:jc w:val="left"/>
-      </w:pPr>
-    </w:p>
-    <w:p>
-      <w:pPr>
-        <w:pStyle w:val="Heading2"/>
-        <w:spacing w:after="80" w:before="240"/>
-      </w:pPr>
-      <w:r>
-        <w:rPr>
-          <w:rFonts w:ascii="Calibri" w:cs="Calibri" w:eastAsia="Calibri" w:hAnsi="Calibri"/>
-          <w:b/>
-          <w:bCs/>
-          <w:i w:val="false"/>
-          <w:iCs w:val="false"/>
-          <w:color w:val="1F2937"/>
-          <w:sz w:val="24"/>
-          <w:szCs w:val="24"/>
-        </w:rPr>
-        <w:t xml:space="preserve">3.2 Back end — Netlify Functions</w:t>
-      </w:r>
-    </w:p>
-    <w:p>
-      <w:pPr>
-        <w:pStyle w:val="Heading3"/>
-        <w:spacing w:after="60" w:before="180"/>
-      </w:pPr>
-      <w:r>
-        <w:rPr>
-          <w:rFonts w:ascii="Calibri" w:cs="Calibri" w:eastAsia="Calibri" w:hAnsi="Calibri"/>
-          <w:b/>
-          <w:bCs/>
-          <w:i w:val="false"/>
-          <w:iCs w:val="false"/>
-          <w:color w:val="1F2937"/>
-          <w:sz w:val="21"/>
-          <w:szCs w:val="21"/>
-        </w:rPr>
-        <w:t xml:space="preserve">netlify/functions/intune.js</w:t>
-      </w:r>
-    </w:p>
-    <w:p>
-      <w:pPr>
-        <w:spacing w:after="120" w:before="0"/>
-        <w:jc w:val="left"/>
-      </w:pPr>
-      <w:r>
-        <w:rPr>
-          <w:rFonts w:ascii="Calibri" w:cs="Calibri" w:eastAsia="Calibri" w:hAnsi="Calibri"/>
-          <w:b w:val="false"/>
-          <w:bCs w:val="false"/>
-          <w:i w:val="false"/>
-          <w:iCs w:val="false"/>
-          <w:color w:val="1F2937"/>
-          <w:sz w:val="19"/>
-          <w:szCs w:val="19"/>
-        </w:rPr>
-        <w:t>The data-gathering function. Accepts tenant credentials and a date range, authenticates against Microsoft Entra ID using the client credentials flow, then issues 17 parallel Graph API calls in a first batch, followed by 2 more parallel sign-in-log calls (full-period and half-period fallback) in a second batch — 19 real Graph API calls in total — to build a single structured JSON payload of 50+ metrics.</w:t>
+        <w:t>Sign-in log queries (full period + half-period fallback) run as their own parallel batch after the first 18 calls complete — the half-period result is used only if the full-period query errors or times out</w:t>
       </w:r>
     </w:p>
     <w:p>
@@ -1225,7 +1225,7 @@
           <w:sz w:val="19"/>
           <w:szCs w:val="19"/>
         </w:rPr>
-        <w:t>Sign-in log queries (full period + half-period fallback) run as their own parallel batch after the first 17 calls complete — the half-period result is used only if the full-period query errors or times out</w:t>
+        <w:t xml:space="preserve">Per-IP rate limit: 10 requests / 5 minutes (in-memory, resets on cold start)</w:t>
       </w:r>
     </w:p>
     <w:p>
@@ -1248,7 +1248,7 @@
           <w:sz w:val="19"/>
           <w:szCs w:val="19"/>
         </w:rPr>
-        <w:t xml:space="preserve">Per-IP rate limit: 10 requests / 5 minutes (in-memory, resets on cold start)</w:t>
+        <w:t>Month-on-month commentary: after building the payload it reads the previous calendar month’s summary snapshot from Netlify Blobs (lib/report-archive.js), derives deterministic commentary lines (lib/metrics-commentary.js), then saves this month’s snapshot. Soft-fail throughout — any Blobs problem leaves commentary null rather than failing the report</w:t>
       </w:r>
     </w:p>
     <w:p>
@@ -1271,7 +1271,7 @@
           <w:sz w:val="19"/>
           <w:szCs w:val="19"/>
         </w:rPr>
-        <w:t>Month-on-month commentary: after building the payload it reads the previous calendar month’s summary snapshot from Netlify Blobs (lib/report-archive.js), derives deterministic commentary lines (lib/metrics-commentary.js), then saves this month’s snapshot. Soft-fail throughout — any Blobs problem leaves commentary null rather than failing the report</w:t>
+        <w:t>Retention control: request field retainMetrics=false (the wizard’s One-off report box) skips saving and deletes the tenant’s history; the response carries metricsRetained (true only if the snapshot was actually saved) so exports can disclose retention accurately</w:t>
       </w:r>
     </w:p>
     <w:p>
@@ -1294,7 +1294,7 @@
           <w:sz w:val="19"/>
           <w:szCs w:val="19"/>
         </w:rPr>
-        <w:t>Retention control: request field retainMetrics=false (the wizard’s One-off report box) skips saving and deletes the tenant’s history; the response carries metricsRetained (true only if the snapshot was actually saved) so exports can disclose retention accurately</w:t>
+        <w:t>SharePoint sites are bucketed by Root Web Template using lib/site-templates.js (Group, Communication, Teams channels, Classic, Other; the rare no-group team site STS#3 is counted in Other); the response includes templateBreakdown (raw value → bucket → sites/GB) for the diagnostics panel. sharepoint.teamsCount is separate: the number of Teams-enabled Microsoft 365 Groups, from one Graph call (/groups filtered on resourceProvisioningOptions ‘Team’), or null if unavailable</w:t>
       </w:r>
     </w:p>
     <w:p>
@@ -1317,7 +1317,7 @@
           <w:sz w:val="19"/>
           <w:szCs w:val="19"/>
         </w:rPr>
-        <w:t>SharePoint sites are bucketed by Root Web Template using lib/site-templates.js (Group, Communication, Teams sites, Teams channels, Classic, Other); the response includes templateBreakdown (raw value → bucket → sites/GB) for the review step</w:t>
+        <w:t>Upcoming licence renewals come from /directory/subscriptions (Enabled, non-trial subscriptions renewing within 90 days, labelled Monthly or Annual/Multi-year) — the same Organization.Read.All permission as licence counts, no new consent</w:t>
       </w:r>
     </w:p>
     <w:p>
@@ -1340,7 +1340,51 @@
           <w:sz w:val="19"/>
           <w:szCs w:val="19"/>
         </w:rPr>
-        <w:t>Upcoming licence renewals come from /directory/subscriptions (Enabled, non-trial subscriptions renewing within 90 days, labelled Monthly or Annual/Multi-year) — the same Organization.Read.All permission as licence counts, no new consent</w:t>
+        <w:t xml:space="preserve">Typical response time: 3-8 seconds depending on tenant size</w:t>
+      </w:r>
+    </w:p>
+    <w:p>
+      <w:pPr>
+        <w:spacing w:after="120" w:before="0"/>
+        <w:jc w:val="left"/>
+      </w:pPr>
+    </w:p>
+    <w:p>
+      <w:pPr>
+        <w:pStyle w:val="Heading3"/>
+        <w:spacing w:after="60" w:before="180"/>
+      </w:pPr>
+      <w:r>
+        <w:rPr>
+          <w:rFonts w:ascii="Calibri" w:cs="Calibri" w:eastAsia="Calibri" w:hAnsi="Calibri"/>
+          <w:b/>
+          <w:bCs/>
+          <w:i w:val="false"/>
+          <w:iCs w:val="false"/>
+          <w:color w:val="1F2937"/>
+          <w:sz w:val="21"/>
+          <w:szCs w:val="21"/>
+        </w:rPr>
+        <w:t xml:space="preserve">netlify/functions/export-docx.js</w:t>
+      </w:r>
+    </w:p>
+    <w:p>
+      <w:pPr>
+        <w:spacing w:after="120" w:before="0"/>
+        <w:jc w:val="left"/>
+      </w:pPr>
+      <w:r>
+        <w:rPr>
+          <w:rFonts w:ascii="Calibri" w:cs="Calibri" w:eastAsia="Calibri" w:hAnsi="Calibri"/>
+          <w:b w:val="false"/>
+          <w:bCs w:val="false"/>
+          <w:i w:val="false"/>
+          <w:iCs w:val="false"/>
+          <w:color w:val="1F2937"/>
+          <w:sz w:val="19"/>
+          <w:szCs w:val="19"/>
+        </w:rPr>
+        <w:t xml:space="preserve">Takes the same structured data plus manual commentary fields and generates a formatted Word document (.docx) using the docx npm package, returned to the browser as base64.</w:t>
       </w:r>
     </w:p>
     <w:p>
@@ -1363,51 +1407,7 @@
           <w:sz w:val="19"/>
           <w:szCs w:val="19"/>
         </w:rPr>
-        <w:t xml:space="preserve">Typical response time: 3-8 seconds depending on tenant size</w:t>
-      </w:r>
-    </w:p>
-    <w:p>
-      <w:pPr>
-        <w:spacing w:after="120" w:before="0"/>
-        <w:jc w:val="left"/>
-      </w:pPr>
-    </w:p>
-    <w:p>
-      <w:pPr>
-        <w:pStyle w:val="Heading3"/>
-        <w:spacing w:after="60" w:before="180"/>
-      </w:pPr>
-      <w:r>
-        <w:rPr>
-          <w:rFonts w:ascii="Calibri" w:cs="Calibri" w:eastAsia="Calibri" w:hAnsi="Calibri"/>
-          <w:b/>
-          <w:bCs/>
-          <w:i w:val="false"/>
-          <w:iCs w:val="false"/>
-          <w:color w:val="1F2937"/>
-          <w:sz w:val="21"/>
-          <w:szCs w:val="21"/>
-        </w:rPr>
-        <w:t xml:space="preserve">netlify/functions/export-docx.js</w:t>
-      </w:r>
-    </w:p>
-    <w:p>
-      <w:pPr>
-        <w:spacing w:after="120" w:before="0"/>
-        <w:jc w:val="left"/>
-      </w:pPr>
-      <w:r>
-        <w:rPr>
-          <w:rFonts w:ascii="Calibri" w:cs="Calibri" w:eastAsia="Calibri" w:hAnsi="Calibri"/>
-          <w:b w:val="false"/>
-          <w:bCs w:val="false"/>
-          <w:i w:val="false"/>
-          <w:iCs w:val="false"/>
-          <w:color w:val="1F2937"/>
-          <w:sz w:val="19"/>
-          <w:szCs w:val="19"/>
-        </w:rPr>
-        <w:t xml:space="preserve">Takes the same structured data plus manual commentary fields and generates a formatted Word document (.docx) using the docx npm package, returned to the browser as base64.</w:t>
+        <w:t xml:space="preserve">Per-IP rate limit: 20 requests / 5 minutes</w:t>
       </w:r>
     </w:p>
     <w:p>
@@ -1430,7 +1430,51 @@
           <w:sz w:val="19"/>
           <w:szCs w:val="19"/>
         </w:rPr>
-        <w:t xml:space="preserve">Per-IP rate limit: 20 requests / 5 minutes</w:t>
+        <w:t>Cover page, ten report sections (Executive Summary, Month-on-Month Changes, Device &amp; Asset Management, Security Posture, Patch Status, User Data, SharePoint / MS Teams, Ticketing &amp; Support, Recommendations &amp; Opportunities, Security Risk Register), KPI cards, callouts, tables, and an auto-generated risk register all built as native Word tables and paragraphs — not an HTML-to-Word conversion. Executive Summary, Ticketing &amp; Support, and Recommendations &amp; Opportunities are manual-entry sections; the wizard no longer collects those fields (the review step was removed), so they are omitted, rendered when the account manager fills in the corresponding commentary fields — they carry no Graph-sourced data. Month-on-Month Changes is auto-generated and only rendered when a prior-month snapshot exists</w:t>
+      </w:r>
+    </w:p>
+    <w:p>
+      <w:pPr>
+        <w:spacing w:after="200" w:before="0"/>
+        <w:jc w:val="left"/>
+      </w:pPr>
+    </w:p>
+    <w:p>
+      <w:pPr>
+        <w:pStyle w:val="Heading3"/>
+        <w:spacing w:after="60" w:before="180"/>
+      </w:pPr>
+      <w:r>
+        <w:rPr>
+          <w:rFonts w:ascii="Calibri" w:cs="Calibri" w:eastAsia="Calibri" w:hAnsi="Calibri"/>
+          <w:b/>
+          <w:bCs/>
+          <w:i w:val="false"/>
+          <w:iCs w:val="false"/>
+          <w:color w:val="1F2937"/>
+          <w:sz w:val="21"/>
+          <w:szCs w:val="21"/>
+        </w:rPr>
+        <w:t xml:space="preserve">netlify/functions/export-pdf.js</w:t>
+      </w:r>
+    </w:p>
+    <w:p>
+      <w:pPr>
+        <w:spacing w:after="120" w:before="0"/>
+        <w:jc w:val="left"/>
+      </w:pPr>
+      <w:r>
+        <w:rPr>
+          <w:rFonts w:ascii="Calibri" w:cs="Calibri" w:eastAsia="Calibri" w:hAnsi="Calibri"/>
+          <w:b w:val="false"/>
+          <w:bCs w:val="false"/>
+          <w:i w:val="false"/>
+          <w:iCs w:val="false"/>
+          <w:color w:val="1F2937"/>
+          <w:sz w:val="19"/>
+          <w:szCs w:val="19"/>
+        </w:rPr>
+        <w:t>A second, PDF-native export path mirroring export-docx.js’s full ten-section structure, accepting the same input shape. Built with the jspdf and jspdf-autotable npm packages, Helvetica font only (no custom font files bundled).</w:t>
       </w:r>
     </w:p>
     <w:p>
@@ -1453,51 +1497,7 @@
           <w:sz w:val="19"/>
           <w:szCs w:val="19"/>
         </w:rPr>
-        <w:t>Cover page, ten report sections (Executive Summary, Month-on-Month Changes, Device &amp; Asset Management, Security Posture, Patch Status, User Data, SharePoint / MS Teams, Ticketing &amp; Support, Recommendations &amp; Opportunities, Security Risk Register), KPI cards, callouts, tables, and an auto-generated risk register all built as native Word tables and paragraphs — not an HTML-to-Word conversion. Executive Summary, Ticketing &amp; Support, and Recommendations &amp; Opportunities are manual-entry sections only, rendered when the account manager fills in the corresponding commentary fields — they carry no Graph-sourced data. Month-on-Month Changes is auto-generated and only rendered when a prior-month snapshot exists</w:t>
-      </w:r>
-    </w:p>
-    <w:p>
-      <w:pPr>
-        <w:spacing w:after="200" w:before="0"/>
-        <w:jc w:val="left"/>
-      </w:pPr>
-    </w:p>
-    <w:p>
-      <w:pPr>
-        <w:pStyle w:val="Heading3"/>
-        <w:spacing w:after="60" w:before="180"/>
-      </w:pPr>
-      <w:r>
-        <w:rPr>
-          <w:rFonts w:ascii="Calibri" w:cs="Calibri" w:eastAsia="Calibri" w:hAnsi="Calibri"/>
-          <w:b/>
-          <w:bCs/>
-          <w:i w:val="false"/>
-          <w:iCs w:val="false"/>
-          <w:color w:val="1F2937"/>
-          <w:sz w:val="21"/>
-          <w:szCs w:val="21"/>
-        </w:rPr>
-        <w:t xml:space="preserve">netlify/functions/export-pdf.js</w:t>
-      </w:r>
-    </w:p>
-    <w:p>
-      <w:pPr>
-        <w:spacing w:after="120" w:before="0"/>
-        <w:jc w:val="left"/>
-      </w:pPr>
-      <w:r>
-        <w:rPr>
-          <w:rFonts w:ascii="Calibri" w:cs="Calibri" w:eastAsia="Calibri" w:hAnsi="Calibri"/>
-          <w:b w:val="false"/>
-          <w:bCs w:val="false"/>
-          <w:i w:val="false"/>
-          <w:iCs w:val="false"/>
-          <w:color w:val="1F2937"/>
-          <w:sz w:val="19"/>
-          <w:szCs w:val="19"/>
-        </w:rPr>
-        <w:t>A second, PDF-native export path mirroring export-docx.js’s full ten-section structure, accepting the same input shape. Built with the jspdf and jspdf-autotable npm packages, Helvetica font only (no custom font files bundled).</w:t>
+        <w:t xml:space="preserve">No per-IP rate limiting (unlike intune.js and export-docx.js)</w:t>
       </w:r>
     </w:p>
     <w:p>
@@ -1520,7 +1520,7 @@
           <w:sz w:val="19"/>
           <w:szCs w:val="19"/>
         </w:rPr>
-        <w:t xml:space="preserve">No per-IP rate limiting (unlike intune.js and export-docx.js)</w:t>
+        <w:t>The cover carries a disclaimer whose retention sentence depends on the metricsRetained flag from intune.js: either nothing is retained, or only summary figures are kept for up to 13 months</w:t>
       </w:r>
     </w:p>
     <w:p>
@@ -1543,7 +1543,165 @@
           <w:sz w:val="19"/>
           <w:szCs w:val="19"/>
         </w:rPr>
-        <w:t>The cover carries a disclaimer whose retention sentence depends on the metricsRetained flag from intune.js: either nothing is retained, or only summary figures are kept for up to 13 months</w:t>
+        <w:t xml:space="preserve">Dormant from the app’s own perspective — index.html’s wizard does not call it anywhere; page 4 only offers browser print-to-PDF and Export to Word. Exists for a possible future PDF-export button or other consumers, but is not wired into any UI control today.</w:t>
+      </w:r>
+    </w:p>
+    <w:p>
+      <w:pPr>
+        <w:pStyle w:val="Heading3"/>
+        <w:spacing w:after="60" w:before="180"/>
+      </w:pPr>
+      <w:r>
+        <w:rPr>
+          <w:rFonts w:ascii="Calibri" w:cs="Calibri" w:eastAsia="Calibri" w:hAnsi="Calibri"/>
+          <w:b/>
+          <w:bCs/>
+          <w:i w:val="false"/>
+          <w:iCs w:val="false"/>
+          <w:color w:val="1F2937"/>
+          <w:sz w:val="21"/>
+          <w:szCs w:val="21"/>
+        </w:rPr>
+        <w:t xml:space="preserve">netlify/functions/clients.js</w:t>
+      </w:r>
+    </w:p>
+    <w:p>
+      <w:pPr>
+        <w:spacing w:after="120" w:before="0"/>
+        <w:jc w:val="left"/>
+      </w:pPr>
+      <w:r>
+        <w:rPr>
+          <w:rFonts w:ascii="Calibri" w:cs="Calibri" w:eastAsia="Calibri" w:hAnsi="Calibri"/>
+          <w:b w:val="false"/>
+          <w:bCs w:val="false"/>
+          <w:i w:val="false"/>
+          <w:iCs w:val="false"/>
+          <w:color w:val="1F2937"/>
+          <w:sz w:val="19"/>
+          <w:szCs w:val="19"/>
+        </w:rPr>
+        <w:t xml:space="preserve">Serves report-hub — a separate consumer application, not part of this app’s own browser UI — a stripped-down client picker list: id and display name only, no credentials — sourced from the shared credential store below. Requires a valid x-report-hub-key header (checked against the REPORT_HUB_SHARED_KEY environment variable) since 2026-09 — previously unauthenticated, which let anyone enumerate every configured client id (see Security Model).</w:t>
+      </w:r>
+    </w:p>
+    <w:p>
+      <w:pPr>
+        <w:pStyle w:val="Heading3"/>
+        <w:spacing w:after="60" w:before="180"/>
+      </w:pPr>
+      <w:r>
+        <w:rPr>
+          <w:rFonts w:ascii="Calibri" w:cs="Calibri" w:eastAsia="Calibri" w:hAnsi="Calibri"/>
+          <w:b/>
+          <w:bCs/>
+          <w:i w:val="false"/>
+          <w:iCs w:val="false"/>
+          <w:color w:val="1F2937"/>
+          <w:sz w:val="21"/>
+          <w:szCs w:val="21"/>
+        </w:rPr>
+        <w:t xml:space="preserve">netlify/functions/report-data.js</w:t>
+      </w:r>
+    </w:p>
+    <w:p>
+      <w:pPr>
+        <w:spacing w:after="120" w:before="0"/>
+        <w:jc w:val="left"/>
+      </w:pPr>
+      <w:r>
+        <w:rPr>
+          <w:rFonts w:ascii="Calibri" w:cs="Calibri" w:eastAsia="Calibri" w:hAnsi="Calibri"/>
+          <w:b w:val="false"/>
+          <w:bCs w:val="false"/>
+          <w:i w:val="false"/>
+          <w:iCs w:val="false"/>
+          <w:color w:val="1F2937"/>
+          <w:sz w:val="19"/>
+          <w:szCs w:val="19"/>
+        </w:rPr>
+        <w:t xml:space="preserve">A headless data endpoint for report-hub. Takes a clientId (plus optional from/to) query parameter, looks up that client’s stored Entra ID credentials via lib/clients-store.js, and calls intune.js’s exported handler directly and internally with those credentials — passing its response straight through unchanged. intune.js itself required no modification to support this. Also requires the same x-report-hub-key header since 2026-09 — previously unauthenticated, which let anyone pull any configured client’s complete Graph report by guessing or enumerating its clientId (see Security Model).</w:t>
+      </w:r>
+    </w:p>
+    <w:p>
+      <w:pPr>
+        <w:pStyle w:val="Heading3"/>
+        <w:spacing w:after="60" w:before="180"/>
+      </w:pPr>
+      <w:r>
+        <w:rPr>
+          <w:rFonts w:ascii="Calibri" w:cs="Calibri" w:eastAsia="Calibri" w:hAnsi="Calibri"/>
+          <w:b/>
+          <w:bCs/>
+          <w:i w:val="false"/>
+          <w:iCs w:val="false"/>
+          <w:color w:val="1F2937"/>
+          <w:sz w:val="21"/>
+          <w:szCs w:val="21"/>
+        </w:rPr>
+        <w:t xml:space="preserve">netlify/functions/lib/clients-store.js (shared helper, not a Netlify function)</w:t>
+      </w:r>
+    </w:p>
+    <w:p>
+      <w:pPr>
+        <w:spacing w:after="120" w:before="0"/>
+        <w:jc w:val="left"/>
+      </w:pPr>
+      <w:r>
+        <w:rPr>
+          <w:rFonts w:ascii="Calibri" w:cs="Calibri" w:eastAsia="Calibri" w:hAnsi="Calibri"/>
+          <w:b w:val="false"/>
+          <w:bCs w:val="false"/>
+          <w:i w:val="false"/>
+          <w:iCs w:val="false"/>
+          <w:color w:val="1F2937"/>
+          <w:sz w:val="19"/>
+          <w:szCs w:val="19"/>
+        </w:rPr>
+        <w:t xml:space="preserve">Not itself invoked as an HTTP endpoint — a shared internal module used by clients.js and report-data.js. Reads a single Netlify environment variable, INTUNE_CLIENTS_JSON (a JSON array of {id, displayName, tenantId, clientId, clientSecret} objects), and exposes lookup and credential-stripping helpers. This is the only server-side credential storage in the whole application, and it is strictly additive: the browser wizard’s existing per-session, paste-your-own-credentials flow (index.html → intune.js) is completely unaffected and does not require a client to be listed here at all.</w:t>
+      </w:r>
+    </w:p>
+    <w:p>
+      <w:pPr>
+        <w:spacing w:after="200" w:before="0"/>
+        <w:jc w:val="left"/>
+      </w:pPr>
+    </w:p>
+    <w:p>
+      <w:pPr>
+        <w:pStyle w:val="Heading3"/>
+        <w:spacing w:after="60" w:before="180"/>
+      </w:pPr>
+      <w:r>
+        <w:rPr>
+          <w:rFonts w:ascii="Calibri" w:cs="Calibri" w:eastAsia="Calibri" w:hAnsi="Calibri"/>
+          <w:b/>
+          <w:bCs/>
+          <w:i w:val="false"/>
+          <w:iCs w:val="false"/>
+          <w:color w:val="1F2937"/>
+          <w:sz w:val="21"/>
+          <w:szCs w:val="21"/>
+        </w:rPr>
+        <w:t xml:space="preserve">scripts/add-client.js (local dev helper, not deployed)</w:t>
+      </w:r>
+    </w:p>
+    <w:p>
+      <w:pPr>
+        <w:spacing w:after="120" w:before="0"/>
+        <w:jc w:val="left"/>
+      </w:pPr>
+      <w:r>
+        <w:rPr>
+          <w:rFonts w:ascii="Calibri" w:cs="Calibri" w:eastAsia="Calibri" w:hAnsi="Calibri"/>
+          <w:b w:val="false"/>
+          <w:bCs w:val="false"/>
+          <w:i w:val="false"/>
+          <w:iCs w:val="false"/>
+          <w:color w:val="1F2937"/>
+          <w:sz w:val="19"/>
+          <w:szCs w:val="19"/>
+        </w:rPr>
+        <w:t xml:space="preserve">A Node CLI script for safely adding or updating one client entry in the local .env’s INTUNE_CLIENTS_JSON — the same environment variable lib/clients-store.js reads in production. Not a Netlify function and not part of the deployed site; run locally only, via node scripts/add-client.js --id &lt;short-id&gt; --name "&lt;Display Name&gt;" [--tenant] [--client] [--secret].</w:t>
       </w:r>
     </w:p>
     <w:p>
@@ -1566,165 +1724,7 @@
           <w:sz w:val="19"/>
           <w:szCs w:val="19"/>
         </w:rPr>
-        <w:t xml:space="preserve">Dormant from the app’s own perspective — index.html’s wizard does not call it anywhere; page 4 only offers browser print-to-PDF and Export to Word. Exists for a possible future PDF-export button or other consumers, but is not wired into any UI control today.</w:t>
-      </w:r>
-    </w:p>
-    <w:p>
-      <w:pPr>
-        <w:pStyle w:val="Heading3"/>
-        <w:spacing w:after="60" w:before="180"/>
-      </w:pPr>
-      <w:r>
-        <w:rPr>
-          <w:rFonts w:ascii="Calibri" w:cs="Calibri" w:eastAsia="Calibri" w:hAnsi="Calibri"/>
-          <w:b/>
-          <w:bCs/>
-          <w:i w:val="false"/>
-          <w:iCs w:val="false"/>
-          <w:color w:val="1F2937"/>
-          <w:sz w:val="21"/>
-          <w:szCs w:val="21"/>
-        </w:rPr>
-        <w:t xml:space="preserve">netlify/functions/clients.js</w:t>
-      </w:r>
-    </w:p>
-    <w:p>
-      <w:pPr>
-        <w:spacing w:after="120" w:before="0"/>
-        <w:jc w:val="left"/>
-      </w:pPr>
-      <w:r>
-        <w:rPr>
-          <w:rFonts w:ascii="Calibri" w:cs="Calibri" w:eastAsia="Calibri" w:hAnsi="Calibri"/>
-          <w:b w:val="false"/>
-          <w:bCs w:val="false"/>
-          <w:i w:val="false"/>
-          <w:iCs w:val="false"/>
-          <w:color w:val="1F2937"/>
-          <w:sz w:val="19"/>
-          <w:szCs w:val="19"/>
-        </w:rPr>
-        <w:t xml:space="preserve">Serves report-hub — a separate consumer application, not part of this app’s own browser UI — a stripped-down client picker list: id and display name only, no credentials — sourced from the shared credential store below. Requires a valid x-report-hub-key header (checked against the REPORT_HUB_SHARED_KEY environment variable) since 2026-09 — previously unauthenticated, which let anyone enumerate every configured client id (see Security Model).</w:t>
-      </w:r>
-    </w:p>
-    <w:p>
-      <w:pPr>
-        <w:pStyle w:val="Heading3"/>
-        <w:spacing w:after="60" w:before="180"/>
-      </w:pPr>
-      <w:r>
-        <w:rPr>
-          <w:rFonts w:ascii="Calibri" w:cs="Calibri" w:eastAsia="Calibri" w:hAnsi="Calibri"/>
-          <w:b/>
-          <w:bCs/>
-          <w:i w:val="false"/>
-          <w:iCs w:val="false"/>
-          <w:color w:val="1F2937"/>
-          <w:sz w:val="21"/>
-          <w:szCs w:val="21"/>
-        </w:rPr>
-        <w:t xml:space="preserve">netlify/functions/report-data.js</w:t>
-      </w:r>
-    </w:p>
-    <w:p>
-      <w:pPr>
-        <w:spacing w:after="120" w:before="0"/>
-        <w:jc w:val="left"/>
-      </w:pPr>
-      <w:r>
-        <w:rPr>
-          <w:rFonts w:ascii="Calibri" w:cs="Calibri" w:eastAsia="Calibri" w:hAnsi="Calibri"/>
-          <w:b w:val="false"/>
-          <w:bCs w:val="false"/>
-          <w:i w:val="false"/>
-          <w:iCs w:val="false"/>
-          <w:color w:val="1F2937"/>
-          <w:sz w:val="19"/>
-          <w:szCs w:val="19"/>
-        </w:rPr>
-        <w:t xml:space="preserve">A headless data endpoint for report-hub. Takes a clientId (plus optional from/to) query parameter, looks up that client’s stored Entra ID credentials via lib/clients-store.js, and calls intune.js’s exported handler directly and internally with those credentials — passing its response straight through unchanged. intune.js itself required no modification to support this. Also requires the same x-report-hub-key header since 2026-09 — previously unauthenticated, which let anyone pull any configured client’s complete Graph report by guessing or enumerating its clientId (see Security Model).</w:t>
-      </w:r>
-    </w:p>
-    <w:p>
-      <w:pPr>
-        <w:pStyle w:val="Heading3"/>
-        <w:spacing w:after="60" w:before="180"/>
-      </w:pPr>
-      <w:r>
-        <w:rPr>
-          <w:rFonts w:ascii="Calibri" w:cs="Calibri" w:eastAsia="Calibri" w:hAnsi="Calibri"/>
-          <w:b/>
-          <w:bCs/>
-          <w:i w:val="false"/>
-          <w:iCs w:val="false"/>
-          <w:color w:val="1F2937"/>
-          <w:sz w:val="21"/>
-          <w:szCs w:val="21"/>
-        </w:rPr>
-        <w:t xml:space="preserve">netlify/functions/lib/clients-store.js (shared helper, not a Netlify function)</w:t>
-      </w:r>
-    </w:p>
-    <w:p>
-      <w:pPr>
-        <w:spacing w:after="120" w:before="0"/>
-        <w:jc w:val="left"/>
-      </w:pPr>
-      <w:r>
-        <w:rPr>
-          <w:rFonts w:ascii="Calibri" w:cs="Calibri" w:eastAsia="Calibri" w:hAnsi="Calibri"/>
-          <w:b w:val="false"/>
-          <w:bCs w:val="false"/>
-          <w:i w:val="false"/>
-          <w:iCs w:val="false"/>
-          <w:color w:val="1F2937"/>
-          <w:sz w:val="19"/>
-          <w:szCs w:val="19"/>
-        </w:rPr>
-        <w:t xml:space="preserve">Not itself invoked as an HTTP endpoint — a shared internal module used by clients.js and report-data.js. Reads a single Netlify environment variable, INTUNE_CLIENTS_JSON (a JSON array of {id, displayName, tenantId, clientId, clientSecret} objects), and exposes lookup and credential-stripping helpers. This is the only server-side credential storage in the whole application, and it is strictly additive: the browser wizard’s existing per-session, paste-your-own-credentials flow (index.html → intune.js) is completely unaffected and does not require a client to be listed here at all.</w:t>
-      </w:r>
-    </w:p>
-    <w:p>
-      <w:pPr>
-        <w:spacing w:after="200" w:before="0"/>
-        <w:jc w:val="left"/>
-      </w:pPr>
-    </w:p>
-    <w:p>
-      <w:pPr>
-        <w:pStyle w:val="Heading3"/>
-        <w:spacing w:after="60" w:before="180"/>
-      </w:pPr>
-      <w:r>
-        <w:rPr>
-          <w:rFonts w:ascii="Calibri" w:cs="Calibri" w:eastAsia="Calibri" w:hAnsi="Calibri"/>
-          <w:b/>
-          <w:bCs/>
-          <w:i w:val="false"/>
-          <w:iCs w:val="false"/>
-          <w:color w:val="1F2937"/>
-          <w:sz w:val="21"/>
-          <w:szCs w:val="21"/>
-        </w:rPr>
-        <w:t xml:space="preserve">scripts/add-client.js (local dev helper, not deployed)</w:t>
-      </w:r>
-    </w:p>
-    <w:p>
-      <w:pPr>
-        <w:spacing w:after="120" w:before="0"/>
-        <w:jc w:val="left"/>
-      </w:pPr>
-      <w:r>
-        <w:rPr>
-          <w:rFonts w:ascii="Calibri" w:cs="Calibri" w:eastAsia="Calibri" w:hAnsi="Calibri"/>
-          <w:b w:val="false"/>
-          <w:bCs w:val="false"/>
-          <w:i w:val="false"/>
-          <w:iCs w:val="false"/>
-          <w:color w:val="1F2937"/>
-          <w:sz w:val="19"/>
-          <w:szCs w:val="19"/>
-        </w:rPr>
-        <w:t xml:space="preserve">A Node CLI script for safely adding or updating one client entry in the local .env’s INTUNE_CLIENTS_JSON — the same environment variable lib/clients-store.js reads in production. Not a Netlify function and not part of the deployed site; run locally only, via node scripts/add-client.js --id &lt;short-id&gt; --name "&lt;Display Name&gt;" [--tenant] [--client] [--secret].</w:t>
+        <w:t xml:space="preserve">Omitted --tenant/--client/--secret values are written as a REPLACE_ME placeholder, so the command (and a pasted session transcript) never has to contain a real secret — fill placeholders in by hand afterward</w:t>
       </w:r>
     </w:p>
     <w:p>
@@ -1747,7 +1747,7 @@
           <w:sz w:val="19"/>
           <w:szCs w:val="19"/>
         </w:rPr>
-        <w:t xml:space="preserve">Omitted --tenant/--client/--secret values are written as a REPLACE_ME placeholder, so the command (and a pasted session transcript) never has to contain a real secret — fill placeholders in by hand afterward</w:t>
+        <w:t xml:space="preserve">Re-running with the same --id updates that entry in place rather than duplicating it</w:t>
       </w:r>
     </w:p>
     <w:p>
@@ -1770,7 +1770,83 @@
           <w:sz w:val="19"/>
           <w:szCs w:val="19"/>
         </w:rPr>
-        <w:t xml:space="preserve">Re-running with the same --id updates that entry in place rather than duplicating it</w:t>
+        <w:t xml:space="preserve">Only updates the local .env — production’s separate copy of INTUNE_CLIENTS_JSON (Netlify Site settings → Environment variables) must still be updated by hand; the script prints the final JSON specifically so it can be pasted there</w:t>
+      </w:r>
+    </w:p>
+    <w:p>
+      <w:pPr>
+        <w:pStyle w:val="Heading3"/>
+        <w:spacing w:after="60" w:before="180"/>
+      </w:pPr>
+      <w:r>
+        <w:rPr>
+          <w:rFonts w:ascii="Calibri" w:cs="Calibri" w:eastAsia="Calibri" w:hAnsi="Calibri"/>
+          <w:b/>
+          <w:bCs/>
+          <w:i w:val="false"/>
+          <w:iCs w:val="false"/>
+          <w:color w:val="1F2937"/>
+          <w:sz w:val="21"/>
+          <w:szCs w:val="21"/>
+        </w:rPr>
+        <w:t>netlify/functions/delete-client-metrics.js</w:t>
+      </w:r>
+    </w:p>
+    <w:p>
+      <w:pPr>
+        <w:spacing w:after="120" w:before="0"/>
+        <w:jc w:val="left"/>
+      </w:pPr>
+      <w:r>
+        <w:rPr>
+          <w:rFonts w:ascii="Calibri" w:cs="Calibri" w:eastAsia="Calibri" w:hAnsi="Calibri"/>
+          <w:b w:val="false"/>
+          <w:bCs w:val="false"/>
+          <w:i w:val="false"/>
+          <w:iCs w:val="false"/>
+          <w:color w:val="1F2937"/>
+          <w:sz w:val="19"/>
+          <w:szCs w:val="19"/>
+        </w:rPr>
+        <w:t>An admin-only endpoint that deletes every stored month-on-month snapshot for one tenant without running another report — for a client who asks for their history to be removed after the fact, when the app registration that proved tenant ownership has typically already been deleted. POST with an x-admin-key header (checked against ARCHIVE_ADMIN_KEY; every call is refused while that variable is unset) and a tenantId. Not linked from any UI — invoked manually, e.g. with curl.</w:t>
+      </w:r>
+    </w:p>
+    <w:p>
+      <w:pPr>
+        <w:pStyle w:val="Heading3"/>
+        <w:spacing w:after="60" w:before="180"/>
+      </w:pPr>
+      <w:r>
+        <w:rPr>
+          <w:rFonts w:ascii="Calibri" w:cs="Calibri" w:eastAsia="Calibri" w:hAnsi="Calibri"/>
+          <w:b/>
+          <w:bCs/>
+          <w:i w:val="false"/>
+          <w:iCs w:val="false"/>
+          <w:color w:val="1F2937"/>
+          <w:sz w:val="21"/>
+          <w:szCs w:val="21"/>
+        </w:rPr>
+        <w:t>netlify/functions/lib — metrics archive helpers (not Netlify functions)</w:t>
+      </w:r>
+    </w:p>
+    <w:p>
+      <w:pPr>
+        <w:spacing w:after="120" w:before="0"/>
+        <w:jc w:val="left"/>
+      </w:pPr>
+      <w:r>
+        <w:rPr>
+          <w:rFonts w:ascii="Calibri" w:cs="Calibri" w:eastAsia="Calibri" w:hAnsi="Calibri"/>
+          <w:b w:val="false"/>
+          <w:bCs w:val="false"/>
+          <w:i w:val="false"/>
+          <w:iCs w:val="false"/>
+          <w:color w:val="1F2937"/>
+          <w:sz w:val="19"/>
+          <w:szCs w:val="19"/>
+        </w:rPr>
+        <w:t>Shared internal modules:</w:t>
       </w:r>
     </w:p>
     <w:p>
@@ -1793,83 +1869,7 @@
           <w:sz w:val="19"/>
           <w:szCs w:val="19"/>
         </w:rPr>
-        <w:t xml:space="preserve">Only updates the local .env — production’s separate copy of INTUNE_CLIENTS_JSON (Netlify Site settings → Environment variables) must still be updated by hand; the script prints the final JSON specifically so it can be pasted there</w:t>
-      </w:r>
-    </w:p>
-    <w:p>
-      <w:pPr>
-        <w:pStyle w:val="Heading3"/>
-        <w:spacing w:after="60" w:before="180"/>
-      </w:pPr>
-      <w:r>
-        <w:rPr>
-          <w:rFonts w:ascii="Calibri" w:cs="Calibri" w:eastAsia="Calibri" w:hAnsi="Calibri"/>
-          <w:b/>
-          <w:bCs/>
-          <w:i w:val="false"/>
-          <w:iCs w:val="false"/>
-          <w:color w:val="1F2937"/>
-          <w:sz w:val="21"/>
-          <w:szCs w:val="21"/>
-        </w:rPr>
-        <w:t>netlify/functions/delete-client-metrics.js</w:t>
-      </w:r>
-    </w:p>
-    <w:p>
-      <w:pPr>
-        <w:spacing w:after="120" w:before="0"/>
-        <w:jc w:val="left"/>
-      </w:pPr>
-      <w:r>
-        <w:rPr>
-          <w:rFonts w:ascii="Calibri" w:cs="Calibri" w:eastAsia="Calibri" w:hAnsi="Calibri"/>
-          <w:b w:val="false"/>
-          <w:bCs w:val="false"/>
-          <w:i w:val="false"/>
-          <w:iCs w:val="false"/>
-          <w:color w:val="1F2937"/>
-          <w:sz w:val="19"/>
-          <w:szCs w:val="19"/>
-        </w:rPr>
-        <w:t>An admin-only endpoint that deletes every stored month-on-month snapshot for one tenant without running another report — for a client who asks for their history to be removed after the fact, when the app registration that proved tenant ownership has typically already been deleted. POST with an x-admin-key header (checked against ARCHIVE_ADMIN_KEY; every call is refused while that variable is unset) and a tenantId. Not linked from any UI — invoked manually, e.g. with curl.</w:t>
-      </w:r>
-    </w:p>
-    <w:p>
-      <w:pPr>
-        <w:pStyle w:val="Heading3"/>
-        <w:spacing w:after="60" w:before="180"/>
-      </w:pPr>
-      <w:r>
-        <w:rPr>
-          <w:rFonts w:ascii="Calibri" w:cs="Calibri" w:eastAsia="Calibri" w:hAnsi="Calibri"/>
-          <w:b/>
-          <w:bCs/>
-          <w:i w:val="false"/>
-          <w:iCs w:val="false"/>
-          <w:color w:val="1F2937"/>
-          <w:sz w:val="21"/>
-          <w:szCs w:val="21"/>
-        </w:rPr>
-        <w:t>netlify/functions/lib — metrics archive helpers (not Netlify functions)</w:t>
-      </w:r>
-    </w:p>
-    <w:p>
-      <w:pPr>
-        <w:spacing w:after="120" w:before="0"/>
-        <w:jc w:val="left"/>
-      </w:pPr>
-      <w:r>
-        <w:rPr>
-          <w:rFonts w:ascii="Calibri" w:cs="Calibri" w:eastAsia="Calibri" w:hAnsi="Calibri"/>
-          <w:b w:val="false"/>
-          <w:bCs w:val="false"/>
-          <w:i w:val="false"/>
-          <w:iCs w:val="false"/>
-          <w:color w:val="1F2937"/>
-          <w:sz w:val="19"/>
-          <w:szCs w:val="19"/>
-        </w:rPr>
-        <w:t>Shared internal modules:</w:t>
+        <w:t>report-archive.js — reads, writes, prunes (rolling 13 months) and deletes snapshots in the Netlify Blobs store msp-report-metrics, keyed tenantId/YYYY-MM. Runs inside the Functions runtime with no credentials to manage. Every function is soft-fail</w:t>
       </w:r>
     </w:p>
     <w:p>
@@ -1892,7 +1892,7 @@
           <w:sz w:val="19"/>
           <w:szCs w:val="19"/>
         </w:rPr>
-        <w:t>report-archive.js — reads, writes, prunes (rolling 13 months) and deletes snapshots in the Netlify Blobs store msp-report-metrics, keyed tenantId/YYYY-MM. Runs inside the Functions runtime with no credentials to manage. Every function is soft-fail</w:t>
+        <w:t>metrics-commentary.js — snapshot() extracts the tracked figures from a report payload; buildCommentary() compares two snapshots and returns template sentences for changes above a threshold, or null when there is no prior month</w:t>
       </w:r>
     </w:p>
     <w:p>
@@ -1915,7 +1915,7 @@
           <w:sz w:val="19"/>
           <w:szCs w:val="19"/>
         </w:rPr>
-        <w:t>metrics-commentary.js — snapshot() extracts the tracked figures from a report payload; buildCommentary() compares two snapshots and returns template sentences for changes above a threshold, or null when there is no prior month</w:t>
+        <w:t>site-templates.js — classifySiteTemplate() buckets a SharePoint site by its Root Web Template value, matching both raw codes (GROUP#0, STS#3, TEAMCHANNEL#1) and friendlier titles with spaces (e.g. “Site Page Publishing”)</w:t>
       </w:r>
     </w:p>
     <w:p>
@@ -1938,7 +1938,35 @@
           <w:sz w:val="19"/>
           <w:szCs w:val="19"/>
         </w:rPr>
-        <w:t>site-templates.js — classifySiteTemplate() buckets a SharePoint site by its Root Web Template value, matching both raw codes (GROUP#0, STS#3, TEAMCHANNEL#1) and friendlier titles</w:t>
+        <w:t>require-admin-key.js / require-report-hub-key.js — fail-closed shared-secret gates for delete-client-metrics.js and for clients.js / report-data.js respectively</w:t>
+      </w:r>
+    </w:p>
+    <w:p>
+      <w:pPr>
+        <w:spacing w:after="200" w:before="0"/>
+        <w:jc w:val="left"/>
+      </w:pPr>
+    </w:p>
+    <w:p>
+      <w:pPr>
+        <w:pStyle w:val="Heading1"/>
+        <w:pBdr>
+          <w:bottom w:val="single" w:color="0D7CC4" w:sz="8"/>
+        </w:pBdr>
+        <w:spacing w:after="120" w:before="360"/>
+      </w:pPr>
+      <w:r>
+        <w:rPr>
+          <w:rFonts w:ascii="Calibri" w:cs="Calibri" w:eastAsia="Calibri" w:hAnsi="Calibri"/>
+          <w:b/>
+          <w:bCs/>
+          <w:i w:val="false"/>
+          <w:iCs w:val="false"/>
+          <w:color w:val="0D7CC4"/>
+          <w:sz w:val="30"/>
+          <w:szCs w:val="30"/>
+        </w:rPr>
+        <w:t xml:space="preserve">4. Data Flow — Step by Step</w:t>
       </w:r>
     </w:p>
     <w:p>
@@ -1961,35 +1989,7 @@
           <w:sz w:val="19"/>
           <w:szCs w:val="19"/>
         </w:rPr>
-        <w:t>require-admin-key.js / require-report-hub-key.js — fail-closed shared-secret gates for delete-client-metrics.js and for clients.js / report-data.js respectively</w:t>
-      </w:r>
-    </w:p>
-    <w:p>
-      <w:pPr>
-        <w:spacing w:after="200" w:before="0"/>
-        <w:jc w:val="left"/>
-      </w:pPr>
-    </w:p>
-    <w:p>
-      <w:pPr>
-        <w:pStyle w:val="Heading1"/>
-        <w:pBdr>
-          <w:bottom w:val="single" w:color="0D7CC4" w:sz="8"/>
-        </w:pBdr>
-        <w:spacing w:after="120" w:before="360"/>
-      </w:pPr>
-      <w:r>
-        <w:rPr>
-          <w:rFonts w:ascii="Calibri" w:cs="Calibri" w:eastAsia="Calibri" w:hAnsi="Calibri"/>
-          <w:b/>
-          <w:bCs/>
-          <w:i w:val="false"/>
-          <w:iCs w:val="false"/>
-          <w:color w:val="0D7CC4"/>
-          <w:sz w:val="30"/>
-          <w:szCs w:val="30"/>
-        </w:rPr>
-        <w:t xml:space="preserve">4. Data Flow — Step by Step</w:t>
+        <w:t xml:space="preserve">1. Account manager enters Tenant ID, Client ID, and Client Secret in the browser</w:t>
       </w:r>
     </w:p>
     <w:p>
@@ -2012,7 +2012,7 @@
           <w:sz w:val="19"/>
           <w:szCs w:val="19"/>
         </w:rPr>
-        <w:t xml:space="preserve">1. Account manager enters Tenant ID, Client ID, and Client Secret in the browser</w:t>
+        <w:t>2. Browser POSTs credentials + date range (and the One-off flag) to /.netlify/functions/intune</w:t>
       </w:r>
     </w:p>
     <w:p>
@@ -2035,7 +2035,7 @@
           <w:sz w:val="19"/>
           <w:szCs w:val="19"/>
         </w:rPr>
-        <w:t>2. Browser POSTs credentials + date range (and the One-off flag) to /.netlify/functions/intune</w:t>
+        <w:t xml:space="preserve">3. Function requests an OAuth token from https://login.microsoftonline.com/{tenantId}/oauth2/v2.0/token</w:t>
       </w:r>
     </w:p>
     <w:p>
@@ -2058,30 +2058,7 @@
           <w:sz w:val="19"/>
           <w:szCs w:val="19"/>
         </w:rPr>
-        <w:t xml:space="preserve">3. Function requests an OAuth token from https://login.microsoftonline.com/{tenantId}/oauth2/v2.0/token</w:t>
-      </w:r>
-    </w:p>
-    <w:p>
-      <w:pPr>
-        <w:pStyle w:val="ListParagraph"/>
-        <w:numPr>
-          <w:ilvl w:val="0"/>
-          <w:numId w:val="1"/>
-        </w:numPr>
-        <w:spacing w:after="60" w:before="40"/>
-      </w:pPr>
-      <w:r>
-        <w:rPr>
-          <w:rFonts w:ascii="Calibri" w:cs="Calibri" w:eastAsia="Calibri" w:hAnsi="Calibri"/>
-          <w:b w:val="false"/>
-          <w:bCs w:val="false"/>
-          <w:i w:val="false"/>
-          <w:iCs w:val="false"/>
-          <w:color w:val="1F2937"/>
-          <w:sz w:val="19"/>
-          <w:szCs w:val="19"/>
-        </w:rPr>
-        <w:t>4. Function issues 17 parallel calls to Microsoft Graph (https://graph.microsoft.com/v1.0/...), followed by 2 more parallel sign-in-log calls (19 total)</w:t>
+        <w:t>4. Function issues 18 parallel calls to Microsoft Graph (https://graph.microsoft.com/v1.0/...), followed by 2 more parallel sign-in-log calls (20 total)</w:t>
       </w:r>
     </w:p>
     <w:p>
@@ -3856,7 +3833,7 @@
                 <w:sz w:val="17"/>
                 <w:szCs w:val="17"/>
               </w:rPr>
-              <w:t>Total sites by type (M365 Group, Communication, Teams sites, Teams channels, Classic, Other — Classic and Other are hidden when zero), M365 groups, security groups, storage used (binary GB), inactive 180d+</w:t>
+              <w:t>Total sites by type (M365 Group, Communication, Teams channels, Classic, Other — Classic and Other are hidden when zero), number of Teams, M365 groups, security groups, storage used (binary GB), inactive sites and channels 180 days +</w:t>
             </w:r>
           </w:p>
         </w:tc>
@@ -4468,7 +4445,7 @@
                 <w:sz w:val="18"/>
                 <w:szCs w:val="18"/>
               </w:rPr>
-              <w:t>A full-period and half-period sign-in query run in parallel with each other (after the first 17 calls complete); the half-period result covers tenants where the full-period query times out</w:t>
+              <w:t>A full-period and half-period sign-in query run in parallel with each other (after the first 18 calls complete); the half-period result covers tenants where the full-period query times out</w:t>
             </w:r>
           </w:p>
         </w:tc>
@@ -4924,7 +4901,7 @@
                 <w:sz w:val="18"/>
                 <w:szCs w:val="18"/>
               </w:rPr>
-              <w:t>Matched by prefix/fragment for raw codes and friendly names — an exact match on the bare word never matched real values and dumped every site into one bucket. Microsoft does not document the column’s values, so intune.js returns a per-template breakdown shown on the review step to keep the bucketing verifiable. Storage is the per-site sum; the tenant-wide storage trend report was dropped because it cannot be split by type</w:t>
+              <w:t>Matched by prefix/fragment for raw codes and friendly names — an exact match on the bare word never matched real values and dumped every site into one bucket. Microsoft does not document the column’s values, so intune.js returns a per-template breakdown shown in the diagnostics panel to keep the bucketing verifiable. Storage is the per-site sum; the tenant-wide storage trend report was dropped because it cannot be split by type</w:t>
             </w:r>
           </w:p>
         </w:tc>
@@ -6326,7 +6303,7 @@
                 <w:sz w:val="18"/>
                 <w:szCs w:val="18"/>
               </w:rPr>
-              <w:t>The usage report lags 24–48 hours and includes hidden Teams-channel and system sites the Active sites list hides, so totals differ. The Root Web Template value format is undocumented — check the review-step breakdown</w:t>
+              <w:t>The usage report lags 24–48 hours and includes hidden Teams-channel and system sites the Active sites list hides, so totals differ. The Root Web Template value format is undocumented — check the diagnostics panel</w:t>
             </w:r>
           </w:p>
         </w:tc>

</xml_diff>

<commit_message>
Reports: inactive-sites callout in all outputs, Security groups always shown last, PDF SharePoint block kept together, drop unused Graph calls, NaN guard; docs updated
Co-Authored-By: Claude Sonnet 5.5 <noreply@anthropic.com>
</commit_message>
<xml_diff>
--- a/docs/Intune_Report_Architecture.docx
+++ b/docs/Intune_Report_Architecture.docx
@@ -1179,7 +1179,7 @@
           <w:sz w:val="19"/>
           <w:szCs w:val="19"/>
         </w:rPr>
-        <w:t>The data-gathering function. Accepts tenant credentials and a date range, authenticates against Microsoft Entra ID using the client credentials flow, then issues 18 parallel Graph API calls in a first batch, followed by 2 more parallel sign-in-log calls (full-period and half-period fallback) in a second batch — 20 real Graph API calls in total — to build a single structured JSON payload of 50+ metrics.</w:t>
+        <w:t>The data-gathering function. Accepts tenant credentials and a date range, authenticates against Microsoft Entra ID using the client credentials flow, then issues 17 parallel Graph API calls in a first batch, followed by 2 more parallel sign-in-log calls (full-period and half-period fallback) in a second batch — 19 real Graph API calls in total — to build a single structured JSON payload of 50+ metrics.</w:t>
       </w:r>
     </w:p>
     <w:p>
@@ -1202,7 +1202,7 @@
           <w:sz w:val="19"/>
           <w:szCs w:val="19"/>
         </w:rPr>
-        <w:t>Sign-in log queries (full period + half-period fallback) run as their own parallel batch after the first 18 calls complete — the half-period result is used only if the full-period query errors or times out</w:t>
+        <w:t>Sign-in log queries (full period + half-period fallback) run as their own parallel batch after the first 17 calls complete — the half-period result is used only if the full-period query errors or times out</w:t>
       </w:r>
     </w:p>
     <w:p>
@@ -1294,7 +1294,7 @@
           <w:sz w:val="19"/>
           <w:szCs w:val="19"/>
         </w:rPr>
-        <w:t>SharePoint sites are bucketed by Root Web Template using lib/site-templates.js (Group, Communication, Teams channels, Classic, Other; the rare no-group team site STS#3 is counted in Other); the response includes templateBreakdown (raw value → bucket → sites/GB) for the diagnostics panel. sharepoint.teamsCount is separate: the number of Teams-enabled Microsoft 365 Groups, from one Graph call (/groups filtered on resourceProvisioningOptions ‘Team’), or null if unavailable</w:t>
+        <w:t>SharePoint sites are bucketed by Root Web Template using lib/site-templates.js (Group, Communication, Teams channels, Classic, Other; the rare no-group team site STS#3 is counted in Other); the response includes templateBreakdown (raw value → bucket → sites/GB) and otherSites (per-site detail for the Other bucket) for the diagnostics panel. Usage-report entries with no template, no last activity and under 0.05 GB are skipped entirely (excludedBlankCount reports how many)</w:t>
       </w:r>
     </w:p>
     <w:p>
@@ -2058,7 +2058,7 @@
           <w:sz w:val="19"/>
           <w:szCs w:val="19"/>
         </w:rPr>
-        <w:t>4. Function issues 18 parallel calls to Microsoft Graph (https://graph.microsoft.com/v1.0/...), followed by 2 more parallel sign-in-log calls (20 total)</w:t>
+        <w:t>4. Function issues 17 parallel calls to Microsoft Graph (https://graph.microsoft.com/v1.0/...), followed by 2 more parallel sign-in-log calls (19 total)</w:t>
       </w:r>
     </w:p>
     <w:p>
@@ -3833,7 +3833,7 @@
                 <w:sz w:val="17"/>
                 <w:szCs w:val="17"/>
               </w:rPr>
-              <w:t>Total sites by type (M365 Group, Communication, Teams channels, Classic, Other — Classic and Other are hidden when zero), number of Teams, M365 groups, security groups, storage used (binary GB), inactive sites and channels 180 days +</w:t>
+              <w:t>Total sites by type (M365 Group, Communication, Teams channels, Classic, Other — Classic and Other are hidden when zero), security groups, storage used (binary GB), inactive sites and channels 180 days + (with a warning callout when above zero)</w:t>
             </w:r>
           </w:p>
         </w:tc>
@@ -4445,7 +4445,7 @@
                 <w:sz w:val="18"/>
                 <w:szCs w:val="18"/>
               </w:rPr>
-              <w:t>A full-period and half-period sign-in query run in parallel with each other (after the first 18 calls complete); the half-period result covers tenants where the full-period query times out</w:t>
+              <w:t>A full-period and half-period sign-in query run in parallel with each other (after the first 17 calls complete); the half-period result covers tenants where the full-period query times out</w:t>
             </w:r>
           </w:p>
         </w:tc>

</xml_diff>

<commit_message>
Remove unused SharePoint storage-trend report request; Architecture doc: current Graph call and sign-in descriptions
Co-Authored-By: Claude Sonnet 5.5 <noreply@anthropic.com>
</commit_message>
<xml_diff>
--- a/docs/Intune_Report_Architecture.docx
+++ b/docs/Intune_Report_Architecture.docx
@@ -1179,7 +1179,7 @@
           <w:sz w:val="19"/>
           <w:szCs w:val="19"/>
         </w:rPr>
-        <w:t>The data-gathering function. Accepts tenant credentials and a date range, authenticates against Microsoft Entra ID using the client credentials flow, then issues 17 parallel Graph API calls in a first batch, followed by 2 more parallel sign-in-log calls (full-period and half-period fallback) in a second batch — 19 real Graph API calls in total — to build a single structured JSON payload of 50+ metrics.</w:t>
+        <w:t>The data-gathering function. Accepts tenant credentials and a date range, authenticates against Microsoft Entra ID using the client credentials flow, then issues 15 parallel Graph API calls for devices, security, users, licences and SharePoint, while the sign-in log is read at the same time as four parallel date slices (each paged until complete, within a shared 9-second budget) — to build a single structured JSON payload of 50+ metrics. The SharePoint tenant-wide storage-trend report is no longer requested (nothing used its data); storage is the per-site sum from the usage detail report.</w:t>
       </w:r>
     </w:p>
     <w:p>
@@ -1202,7 +1202,7 @@
           <w:sz w:val="19"/>
           <w:szCs w:val="19"/>
         </w:rPr>
-        <w:t>Sign-in log queries (full period + half-period fallback) run as their own parallel batch after the first 17 calls complete — the half-period result is used only if the full-period query errors or times out</w:t>
+        <w:t>Sign-in log queries start together with the first batch of calls: the report period is split into four date slices, fetched in parallel and paged with @odata.nextLink; Graph throttling (HTTP 429) is honoured via Retry-After. Only slices that finish count as ‘days checked’, so a partial result is reported as partial</w:t>
       </w:r>
     </w:p>
     <w:p>
@@ -2058,7 +2058,7 @@
           <w:sz w:val="19"/>
           <w:szCs w:val="19"/>
         </w:rPr>
-        <w:t>4. Function issues 17 parallel calls to Microsoft Graph (https://graph.microsoft.com/v1.0/...), followed by 2 more parallel sign-in-log calls (19 total)</w:t>
+        <w:t>4. Function issues 15 parallel calls to Microsoft Graph (https://graph.microsoft.com/v1.0/...) and, at the same time, the sign-in log slices</w:t>
       </w:r>
     </w:p>
     <w:p>
@@ -4445,7 +4445,7 @@
                 <w:sz w:val="18"/>
                 <w:szCs w:val="18"/>
               </w:rPr>
-              <w:t>A full-period and half-period sign-in query run in parallel with each other (after the first 17 calls complete); the half-period result covers tenants where the full-period query times out</w:t>
+              <w:t>Four date slices run in parallel with each other and with the first batch of calls; each is paged within a shared 9-second budget, and results report how many days were fully checked</w:t>
             </w:r>
           </w:p>
         </w:tc>

</xml_diff>

<commit_message>
Documentation audit fixes: README, DEPLOY, env/config examples, User/Setup/Architecture docs and PDFs, prospect PDFs; drop unused jspdf-autotable; AU/NZ/MY wording in risk text
Co-Authored-By: Claude Sonnet 5.5 <noreply@anthropic.com>
</commit_message>
<xml_diff>
--- a/docs/Intune_Report_Architecture.docx
+++ b/docs/Intune_Report_Architecture.docx
@@ -406,7 +406,7 @@
                 <w:sz w:val="18"/>
                 <w:szCs w:val="18"/>
               </w:rPr>
-              <w:t xml:space="preserve">Netlify (free tier)</w:t>
+              <w:t>Netlify (Pro plan; default 10-second function timeout, no override set)</w:t>
             </w:r>
           </w:p>
         </w:tc>
@@ -634,7 +634,7 @@
                 <w:sz w:val="18"/>
                 <w:szCs w:val="18"/>
               </w:rPr>
-              <w:t xml:space="preserve">Microsoft Graph API v1.0</w:t>
+              <w:t>Microsoft Graph (app-only, read-only): v1.0, plus /beta for managed devices, users and app-protection policies</w:t>
             </w:r>
           </w:p>
         </w:tc>
@@ -1093,7 +1093,7 @@
           <w:sz w:val="19"/>
           <w:szCs w:val="19"/>
         </w:rPr>
-        <w:t>Page 3 — the report is built automatically after the data is pulled (the former review step was removed). Full on-screen report, with Export to Word and browser print-to-PDF, and a collapsed, non-exported SharePoint template diagnostics panel (raw template values and their bucket); the header text links back to the start page</w:t>
+        <w:t>Page 3 — the report is built automatically after the data is pulled (the former review step was removed). Full on-screen report, with Export to Word, browser print-to-PDF and Copy text, and a collapsed, non-exported Diagnostics panel (raw SharePoint template values and their bucket, the sites counted as Other with a CSV download, at-risk accounts, sign-in query diagnostics and any shared-gateway IPs left out); the header text links back to the start page Hidden markup for the former review page remains in index.html but is unreachable.</w:t>
       </w:r>
     </w:p>
     <w:p>
@@ -1430,7 +1430,7 @@
           <w:sz w:val="19"/>
           <w:szCs w:val="19"/>
         </w:rPr>
-        <w:t>Cover page, ten report sections (Executive Summary, Month-on-Month Changes, Device &amp; Asset Management, Security Posture, Patch Status, User Data, SharePoint / MS Teams, Ticketing &amp; Support, Recommendations &amp; Opportunities, Security Risk Register), KPI cards, callouts, tables, and an auto-generated risk register all built as native Word tables and paragraphs — not an HTML-to-Word conversion. Executive Summary, Ticketing &amp; Support, and Recommendations &amp; Opportunities are manual-entry sections; the wizard no longer collects those fields (the review step was removed), so they are omitted, rendered when the account manager fills in the corresponding commentary fields — they carry no Graph-sourced data. Month-on-Month Changes is auto-generated and only rendered when a prior-month snapshot exists</w:t>
+        <w:t>Cover page, ten report sections (Executive Summary, Month-on-Month Changes, Device &amp; Asset Management, Security Posture, Patch Status, User Data, SharePoint / MS Teams, Ticketing &amp; Support, Recommendations &amp; Opportunities, Security Risk Register), KPI cards, callouts, tables, and an auto-generated risk register all built as native Word tables and paragraphs — not an HTML-to-Word conversion. Executive Summary, Ticketing &amp; Support, and Recommendations &amp; Opportunities are manual-entry sections; the wizard no longer collects those fields (the review step was removed), so they are omitted (they carry no Graph-sourced data). Month-on-Month Changes is auto-generated and only rendered when a prior-month snapshot exists. The Word export uses Calibri.</w:t>
       </w:r>
     </w:p>
     <w:p>
@@ -1474,7 +1474,7 @@
           <w:sz w:val="19"/>
           <w:szCs w:val="19"/>
         </w:rPr>
-        <w:t>A second, PDF-native export path mirroring export-docx.js’s full ten-section structure, accepting the same input shape. Built with the jspdf and jspdf-autotable npm packages, Helvetica font only (no custom font files bundled).</w:t>
+        <w:t>A second, PDF-native export path mirroring export-docx.js’s full ten-section structure, accepting the same input shape. Built with the jspdf npm package (tables and cards are drawn directly), Helvetica font only (no custom font files bundled).</w:t>
       </w:r>
     </w:p>
     <w:p>
@@ -1520,7 +1520,7 @@
           <w:sz w:val="19"/>
           <w:szCs w:val="19"/>
         </w:rPr>
-        <w:t>The cover carries a disclaimer whose retention sentence depends on the metricsRetained flag from intune.js: either nothing is retained, or only summary figures are kept for up to 13 months</w:t>
+        <w:t>The cover carries a disclaimer whose retention sentence depends on the metricsRetained flag from intune.js: either nothing is retained, or only summary figures are kept for up to 13 months Note: the on-screen report and the Word export carry no disclaimer or retention statement of their own.</w:t>
       </w:r>
     </w:p>
     <w:p>
@@ -1543,7 +1543,7 @@
           <w:sz w:val="19"/>
           <w:szCs w:val="19"/>
         </w:rPr>
-        <w:t xml:space="preserve">Dormant from the app’s own perspective — index.html’s wizard does not call it anywhere; page 4 only offers browser print-to-PDF and Export to Word. Exists for a possible future PDF-export button or other consumers, but is not wired into any UI control today.</w:t>
+        <w:t>Dormant from the app’s own perspective — index.html’s wizard does not call it anywhere; the report page only offers browser print-to-PDF, Export to Word and Copy text. Exists for a possible future PDF-export button or other consumers, but is not wired into any UI control today.</w:t>
       </w:r>
     </w:p>
     <w:p>
@@ -1619,7 +1619,7 @@
           <w:sz w:val="19"/>
           <w:szCs w:val="19"/>
         </w:rPr>
-        <w:t xml:space="preserve">A headless data endpoint for report-hub. Takes a clientId (plus optional from/to) query parameter, looks up that client’s stored Entra ID credentials via lib/clients-store.js, and calls intune.js’s exported handler directly and internally with those credentials — passing its response straight through unchanged. intune.js itself required no modification to support this. Also requires the same x-report-hub-key header since 2026-09 — previously unauthenticated, which let anyone pull any configured client’s complete Graph report by guessing or enumerating its clientId (see Security Model).</w:t>
+        <w:t>A headless data endpoint for report-hub. Takes a clientId (plus optional from/to) query parameter, looks up that client’s stored Entra ID credentials via lib/clients-store.js, and calls intune.js’s exported handler directly and internally with those credentials — passing its response straight through unchanged. intune.js itself required no modification to support this. Also requires the same x-report-hub-key header since 2026-09 — previously unauthenticated, which let anyone pull any configured client’s complete Graph report by guessing or enumerating its clientId (see Security Model). Report-hub runs always retain the month-on-month figures (this endpoint never sends the one-off flag) and honour the optional per-client skipOverseas flag.</w:t>
       </w:r>
     </w:p>
     <w:p>
@@ -1657,7 +1657,7 @@
           <w:sz w:val="19"/>
           <w:szCs w:val="19"/>
         </w:rPr>
-        <w:t xml:space="preserve">Not itself invoked as an HTTP endpoint — a shared internal module used by clients.js and report-data.js. Reads a single Netlify environment variable, INTUNE_CLIENTS_JSON (a JSON array of {id, displayName, tenantId, clientId, clientSecret} objects), and exposes lookup and credential-stripping helpers. This is the only server-side credential storage in the whole application, and it is strictly additive: the browser wizard’s existing per-session, paste-your-own-credentials flow (index.html → intune.js) is completely unaffected and does not require a client to be listed here at all.</w:t>
+        <w:t>Not itself invoked as an HTTP endpoint — a shared internal module used by clients.js and report-data.js. Reads a single Netlify environment variable, INTUNE_CLIENTS_JSON (a JSON array of {id, displayName, tenantId, clientId, clientSecret, optional skipOverseas} objects), and exposes lookup and credential-stripping helpers. This is the only server-side credential storage in the whole application, and it is strictly additive: the browser wizard’s existing per-session, paste-your-own-credentials flow (index.html → intune.js) is completely unaffected and does not require a client to be listed here at all.</w:t>
       </w:r>
     </w:p>
     <w:p>
@@ -1938,35 +1938,7 @@
           <w:sz w:val="19"/>
           <w:szCs w:val="19"/>
         </w:rPr>
-        <w:t>require-admin-key.js / require-report-hub-key.js — fail-closed shared-secret gates for delete-client-metrics.js and for clients.js / report-data.js respectively</w:t>
-      </w:r>
-    </w:p>
-    <w:p>
-      <w:pPr>
-        <w:spacing w:after="200" w:before="0"/>
-        <w:jc w:val="left"/>
-      </w:pPr>
-    </w:p>
-    <w:p>
-      <w:pPr>
-        <w:pStyle w:val="Heading1"/>
-        <w:pBdr>
-          <w:bottom w:val="single" w:color="0D7CC4" w:sz="8"/>
-        </w:pBdr>
-        <w:spacing w:after="120" w:before="360"/>
-      </w:pPr>
-      <w:r>
-        <w:rPr>
-          <w:rFonts w:ascii="Calibri" w:cs="Calibri" w:eastAsia="Calibri" w:hAnsi="Calibri"/>
-          <w:b/>
-          <w:bCs/>
-          <w:i w:val="false"/>
-          <w:iCs w:val="false"/>
-          <w:color w:val="0D7CC4"/>
-          <w:sz w:val="30"/>
-          <w:szCs w:val="30"/>
-        </w:rPr>
-        <w:t xml:space="preserve">4. Data Flow — Step by Step</w:t>
+        <w:t>licence-prices.js — approximate per-seat licence prices, used only to order the licence list by estimated spend (prices are never shown); sortLicences() orders paid before free</w:t>
       </w:r>
     </w:p>
     <w:p>
@@ -1989,7 +1961,35 @@
           <w:sz w:val="19"/>
           <w:szCs w:val="19"/>
         </w:rPr>
-        <w:t xml:space="preserve">1. Account manager enters Tenant ID, Client ID, and Client Secret in the browser</w:t>
+        <w:t>require-admin-key.js / require-report-hub-key.js — fail-closed shared-secret gates for delete-client-metrics.js and for clients.js / report-data.js respectively</w:t>
+      </w:r>
+    </w:p>
+    <w:p>
+      <w:pPr>
+        <w:spacing w:after="200" w:before="0"/>
+        <w:jc w:val="left"/>
+      </w:pPr>
+    </w:p>
+    <w:p>
+      <w:pPr>
+        <w:pStyle w:val="Heading1"/>
+        <w:pBdr>
+          <w:bottom w:val="single" w:color="0D7CC4" w:sz="8"/>
+        </w:pBdr>
+        <w:spacing w:after="120" w:before="360"/>
+      </w:pPr>
+      <w:r>
+        <w:rPr>
+          <w:rFonts w:ascii="Calibri" w:cs="Calibri" w:eastAsia="Calibri" w:hAnsi="Calibri"/>
+          <w:b/>
+          <w:bCs/>
+          <w:i w:val="false"/>
+          <w:iCs w:val="false"/>
+          <w:color w:val="0D7CC4"/>
+          <w:sz w:val="30"/>
+          <w:szCs w:val="30"/>
+        </w:rPr>
+        <w:t xml:space="preserve">4. Data Flow — Step by Step</w:t>
       </w:r>
     </w:p>
     <w:p>
@@ -2012,7 +2012,7 @@
           <w:sz w:val="19"/>
           <w:szCs w:val="19"/>
         </w:rPr>
-        <w:t>2. Browser POSTs credentials + date range (and the One-off flag) to /.netlify/functions/intune</w:t>
+        <w:t xml:space="preserve">1. Account manager enters Tenant ID, Client ID, and Client Secret in the browser</w:t>
       </w:r>
     </w:p>
     <w:p>
@@ -2035,7 +2035,7 @@
           <w:sz w:val="19"/>
           <w:szCs w:val="19"/>
         </w:rPr>
-        <w:t xml:space="preserve">3. Function requests an OAuth token from https://login.microsoftonline.com/{tenantId}/oauth2/v2.0/token</w:t>
+        <w:t>2. Browser POSTs credentials + date range (and the One-off flag) to /.netlify/functions/intune</w:t>
       </w:r>
     </w:p>
     <w:p>
@@ -2058,7 +2058,30 @@
           <w:sz w:val="19"/>
           <w:szCs w:val="19"/>
         </w:rPr>
-        <w:t>4. Function issues 15 parallel calls to Microsoft Graph (https://graph.microsoft.com/v1.0/...) and, at the same time, the sign-in log slices</w:t>
+        <w:t xml:space="preserve">3. Function requests an OAuth token from https://login.microsoftonline.com/{tenantId}/oauth2/v2.0/token</w:t>
+      </w:r>
+    </w:p>
+    <w:p>
+      <w:pPr>
+        <w:pStyle w:val="ListParagraph"/>
+        <w:numPr>
+          <w:ilvl w:val="0"/>
+          <w:numId w:val="1"/>
+        </w:numPr>
+        <w:spacing w:after="60" w:before="40"/>
+      </w:pPr>
+      <w:r>
+        <w:rPr>
+          <w:rFonts w:ascii="Calibri" w:cs="Calibri" w:eastAsia="Calibri" w:hAnsi="Calibri"/>
+          <w:b w:val="false"/>
+          <w:bCs w:val="false"/>
+          <w:i w:val="false"/>
+          <w:iCs w:val="false"/>
+          <w:color w:val="1F2937"/>
+          <w:sz w:val="19"/>
+          <w:szCs w:val="19"/>
+        </w:rPr>
+        <w:t>4. Function issues 15 parallel calls to Microsoft Graph (https://graph.microsoft.com/v1.0/..., plus /beta for managed devices, users and app-protection policies) and, at the same time, the sign-in log slices</w:t>
       </w:r>
     </w:p>
     <w:p>
@@ -3607,7 +3630,7 @@
                 <w:sz w:val="17"/>
                 <w:szCs w:val="17"/>
               </w:rPr>
-              <w:t xml:space="preserve">Secure Score, Conditional Access enforced/report-only, risky users, compliance policies, app protection, security defaults, key policy status, auth methods</w:t>
+              <w:t>Secure Score, Conditional Access enforced/report-only, risky users, compliance policies, app protection, key policy status, auth methods (Security Defaults is read only for one risk-register rule; it is no longer shown in the report)</w:t>
             </w:r>
           </w:p>
         </w:tc>
@@ -4408,7 +4431,7 @@
                 <w:sz w:val="18"/>
                 <w:szCs w:val="18"/>
               </w:rPr>
-              <w:t xml:space="preserve">Sign-in queries run as a parallel fallback pair</w:t>
+              <w:t>Sign-in log read in four parallel paged slices</w:t>
             </w:r>
           </w:p>
         </w:tc>
@@ -4446,6 +4469,462 @@
                 <w:szCs w:val="18"/>
               </w:rPr>
               <w:t>Four date slices run in parallel with each other and with the first batch of calls; each is paged within a shared 9-second budget, and results report how many days were fully checked</w:t>
+            </w:r>
+          </w:p>
+        </w:tc>
+      </w:tr>
+      <w:tr>
+        <w:tc>
+          <w:tcPr>
+            <w:tcW w:type="dxa" w:w="2995"/>
+            <w:tcBorders>
+              <w:top w:val="single" w:color="E5E7EB" w:sz="4"/>
+              <w:left w:val="single" w:color="E5E7EB" w:sz="4"/>
+              <w:bottom w:val="single" w:color="E5E7EB" w:sz="4"/>
+              <w:right w:val="single" w:color="E5E7EB" w:sz="4"/>
+            </w:tcBorders>
+            <w:shd w:fill="F9FAFB" w:val="clear"/>
+            <w:tcMar>
+              <w:top w:type="dxa" w:w="80"/>
+              <w:left w:type="dxa" w:w="120"/>
+              <w:bottom w:type="dxa" w:w="80"/>
+              <w:right w:type="dxa" w:w="120"/>
+            </w:tcMar>
+          </w:tcPr>
+          <w:p>
+            <w:pPr>
+              <w:spacing w:after="0" w:before="0"/>
+              <w:jc w:val="left"/>
+            </w:pPr>
+            <w:r>
+              <w:rPr>
+                <w:rFonts w:ascii="Calibri" w:cs="Calibri" w:eastAsia="Calibri" w:hAnsi="Calibri"/>
+                <w:b/>
+                <w:bCs/>
+                <w:i w:val="false"/>
+                <w:iCs w:val="false"/>
+                <w:color w:val="1F2937"/>
+                <w:sz w:val="18"/>
+                <w:szCs w:val="18"/>
+              </w:rPr>
+              <w:t>Interactive sign-ins only</w:t>
+            </w:r>
+          </w:p>
+        </w:tc>
+        <w:tc>
+          <w:tcPr>
+            <w:tcW w:type="dxa" w:w="6365"/>
+            <w:tcBorders>
+              <w:top w:val="single" w:color="E5E7EB" w:sz="4"/>
+              <w:left w:val="single" w:color="E5E7EB" w:sz="4"/>
+              <w:bottom w:val="single" w:color="E5E7EB" w:sz="4"/>
+              <w:right w:val="single" w:color="E5E7EB" w:sz="4"/>
+            </w:tcBorders>
+            <w:shd w:fill="F9FAFB" w:val="clear"/>
+            <w:tcMar>
+              <w:top w:type="dxa" w:w="80"/>
+              <w:left w:type="dxa" w:w="120"/>
+              <w:bottom w:type="dxa" w:w="80"/>
+              <w:right w:type="dxa" w:w="120"/>
+            </w:tcMar>
+          </w:tcPr>
+          <w:p>
+            <w:pPr>
+              <w:spacing w:after="0" w:before="0"/>
+              <w:jc w:val="left"/>
+            </w:pPr>
+            <w:r>
+              <w:rPr>
+                <w:rFonts w:ascii="Calibri" w:cs="Calibri" w:eastAsia="Calibri" w:hAnsi="Calibri"/>
+                <w:b w:val="false"/>
+                <w:bCs w:val="false"/>
+                <w:i w:val="false"/>
+                <w:iCs w:val="false"/>
+                <w:color w:val="6B7280"/>
+                <w:sz w:val="18"/>
+                <w:szCs w:val="18"/>
+              </w:rPr>
+              <w:t>Only successful interactive sign-ins count as overseas logins; background token refreshes are ignored.</w:t>
+            </w:r>
+          </w:p>
+        </w:tc>
+      </w:tr>
+      <w:tr>
+        <w:tc>
+          <w:tcPr>
+            <w:tcW w:type="dxa" w:w="2995"/>
+            <w:tcBorders>
+              <w:top w:val="single" w:color="E5E7EB" w:sz="4"/>
+              <w:left w:val="single" w:color="E5E7EB" w:sz="4"/>
+              <w:bottom w:val="single" w:color="E5E7EB" w:sz="4"/>
+              <w:right w:val="single" w:color="E5E7EB" w:sz="4"/>
+            </w:tcBorders>
+            <w:shd w:fill="F9FAFB" w:val="clear"/>
+            <w:tcMar>
+              <w:top w:type="dxa" w:w="80"/>
+              <w:left w:type="dxa" w:w="120"/>
+              <w:bottom w:type="dxa" w:w="80"/>
+              <w:right w:type="dxa" w:w="120"/>
+            </w:tcMar>
+          </w:tcPr>
+          <w:p>
+            <w:pPr>
+              <w:spacing w:after="0" w:before="0"/>
+              <w:jc w:val="left"/>
+            </w:pPr>
+            <w:r>
+              <w:rPr>
+                <w:rFonts w:ascii="Calibri" w:cs="Calibri" w:eastAsia="Calibri" w:hAnsi="Calibri"/>
+                <w:b/>
+                <w:bCs/>
+                <w:i w:val="false"/>
+                <w:iCs w:val="false"/>
+                <w:color w:val="1F2937"/>
+                <w:sz w:val="18"/>
+                <w:szCs w:val="18"/>
+              </w:rPr>
+              <w:t>Shared-gateway exclusion</w:t>
+            </w:r>
+          </w:p>
+        </w:tc>
+        <w:tc>
+          <w:tcPr>
+            <w:tcW w:type="dxa" w:w="6365"/>
+            <w:tcBorders>
+              <w:top w:val="single" w:color="E5E7EB" w:sz="4"/>
+              <w:left w:val="single" w:color="E5E7EB" w:sz="4"/>
+              <w:bottom w:val="single" w:color="E5E7EB" w:sz="4"/>
+              <w:right w:val="single" w:color="E5E7EB" w:sz="4"/>
+            </w:tcBorders>
+            <w:shd w:fill="F9FAFB" w:val="clear"/>
+            <w:tcMar>
+              <w:top w:type="dxa" w:w="80"/>
+              <w:left w:type="dxa" w:w="120"/>
+              <w:bottom w:type="dxa" w:w="80"/>
+              <w:right w:type="dxa" w:w="120"/>
+            </w:tcMar>
+          </w:tcPr>
+          <w:p>
+            <w:pPr>
+              <w:spacing w:after="0" w:before="0"/>
+              <w:jc w:val="left"/>
+            </w:pPr>
+            <w:r>
+              <w:rPr>
+                <w:rFonts w:ascii="Calibri" w:cs="Calibri" w:eastAsia="Calibri" w:hAnsi="Calibri"/>
+                <w:b w:val="false"/>
+                <w:bCs w:val="false"/>
+                <w:i w:val="false"/>
+                <w:iCs w:val="false"/>
+                <w:color w:val="6B7280"/>
+                <w:sz w:val="18"/>
+                <w:szCs w:val="18"/>
+              </w:rPr>
+              <w:t>An overseas IP address used by five or more different people (a company VPN or gateway such as NordLayer) is left out of the overseas count and reported separately, so a gateway cannot flood the metric. The number of sign-ins and IP addresses left out is always shown.</w:t>
+            </w:r>
+          </w:p>
+        </w:tc>
+      </w:tr>
+      <w:tr>
+        <w:tc>
+          <w:tcPr>
+            <w:tcW w:type="dxa" w:w="2995"/>
+            <w:tcBorders>
+              <w:top w:val="single" w:color="E5E7EB" w:sz="4"/>
+              <w:left w:val="single" w:color="E5E7EB" w:sz="4"/>
+              <w:bottom w:val="single" w:color="E5E7EB" w:sz="4"/>
+              <w:right w:val="single" w:color="E5E7EB" w:sz="4"/>
+            </w:tcBorders>
+            <w:shd w:fill="F9FAFB" w:val="clear"/>
+            <w:tcMar>
+              <w:top w:type="dxa" w:w="80"/>
+              <w:left w:type="dxa" w:w="120"/>
+              <w:bottom w:type="dxa" w:w="80"/>
+              <w:right w:type="dxa" w:w="120"/>
+            </w:tcMar>
+          </w:tcPr>
+          <w:p>
+            <w:pPr>
+              <w:spacing w:after="0" w:before="0"/>
+              <w:jc w:val="left"/>
+            </w:pPr>
+            <w:r>
+              <w:rPr>
+                <w:rFonts w:ascii="Calibri" w:cs="Calibri" w:eastAsia="Calibri" w:hAnsi="Calibri"/>
+                <w:b/>
+                <w:bCs/>
+                <w:i w:val="false"/>
+                <w:iCs w:val="false"/>
+                <w:color w:val="1F2937"/>
+                <w:sz w:val="18"/>
+                <w:szCs w:val="18"/>
+              </w:rPr>
+              <w:t>Country filter asked of Graph</w:t>
+            </w:r>
+          </w:p>
+        </w:tc>
+        <w:tc>
+          <w:tcPr>
+            <w:tcW w:type="dxa" w:w="6365"/>
+            <w:tcBorders>
+              <w:top w:val="single" w:color="E5E7EB" w:sz="4"/>
+              <w:left w:val="single" w:color="E5E7EB" w:sz="4"/>
+              <w:bottom w:val="single" w:color="E5E7EB" w:sz="4"/>
+              <w:right w:val="single" w:color="E5E7EB" w:sz="4"/>
+            </w:tcBorders>
+            <w:shd w:fill="F9FAFB" w:val="clear"/>
+            <w:tcMar>
+              <w:top w:type="dxa" w:w="80"/>
+              <w:left w:type="dxa" w:w="120"/>
+              <w:bottom w:type="dxa" w:w="80"/>
+              <w:right w:type="dxa" w:w="120"/>
+            </w:tcMar>
+          </w:tcPr>
+          <w:p>
+            <w:pPr>
+              <w:spacing w:after="0" w:before="0"/>
+              <w:jc w:val="left"/>
+            </w:pPr>
+            <w:r>
+              <w:rPr>
+                <w:rFonts w:ascii="Calibri" w:cs="Calibri" w:eastAsia="Calibri" w:hAnsi="Calibri"/>
+                <w:b w:val="false"/>
+                <w:bCs w:val="false"/>
+                <w:i w:val="false"/>
+                <w:iCs w:val="false"/>
+                <w:color w:val="6B7280"/>
+                <w:sz w:val="18"/>
+                <w:szCs w:val="18"/>
+              </w:rPr>
+              <w:t>AU/NZ/MY are excluded in the Graph filter itself to shrink the data; if Graph rejects the filter the slice retries without it automatically. One constant (SI_COUNTRY_FILTER in intune.js) turns it off.</w:t>
+            </w:r>
+          </w:p>
+        </w:tc>
+      </w:tr>
+      <w:tr>
+        <w:tc>
+          <w:tcPr>
+            <w:tcW w:type="dxa" w:w="2995"/>
+            <w:tcBorders>
+              <w:top w:val="single" w:color="E5E7EB" w:sz="4"/>
+              <w:left w:val="single" w:color="E5E7EB" w:sz="4"/>
+              <w:bottom w:val="single" w:color="E5E7EB" w:sz="4"/>
+              <w:right w:val="single" w:color="E5E7EB" w:sz="4"/>
+            </w:tcBorders>
+            <w:shd w:fill="F9FAFB" w:val="clear"/>
+            <w:tcMar>
+              <w:top w:type="dxa" w:w="80"/>
+              <w:left w:type="dxa" w:w="120"/>
+              <w:bottom w:type="dxa" w:w="80"/>
+              <w:right w:type="dxa" w:w="120"/>
+            </w:tcMar>
+          </w:tcPr>
+          <w:p>
+            <w:pPr>
+              <w:spacing w:after="0" w:before="0"/>
+              <w:jc w:val="left"/>
+            </w:pPr>
+            <w:r>
+              <w:rPr>
+                <w:rFonts w:ascii="Calibri" w:cs="Calibri" w:eastAsia="Calibri" w:hAnsi="Calibri"/>
+                <w:b/>
+                <w:bCs/>
+                <w:i w:val="false"/>
+                <w:iCs w:val="false"/>
+                <w:color w:val="1F2937"/>
+                <w:sz w:val="18"/>
+                <w:szCs w:val="18"/>
+              </w:rPr>
+              <w:t>Per-client overseas opt-out</w:t>
+            </w:r>
+          </w:p>
+        </w:tc>
+        <w:tc>
+          <w:tcPr>
+            <w:tcW w:type="dxa" w:w="6365"/>
+            <w:tcBorders>
+              <w:top w:val="single" w:color="E5E7EB" w:sz="4"/>
+              <w:left w:val="single" w:color="E5E7EB" w:sz="4"/>
+              <w:bottom w:val="single" w:color="E5E7EB" w:sz="4"/>
+              <w:right w:val="single" w:color="E5E7EB" w:sz="4"/>
+            </w:tcBorders>
+            <w:shd w:fill="F9FAFB" w:val="clear"/>
+            <w:tcMar>
+              <w:top w:type="dxa" w:w="80"/>
+              <w:left w:type="dxa" w:w="120"/>
+              <w:bottom w:type="dxa" w:w="80"/>
+              <w:right w:type="dxa" w:w="120"/>
+            </w:tcMar>
+          </w:tcPr>
+          <w:p>
+            <w:pPr>
+              <w:spacing w:after="0" w:before="0"/>
+              <w:jc w:val="left"/>
+            </w:pPr>
+            <w:r>
+              <w:rPr>
+                <w:rFonts w:ascii="Calibri" w:cs="Calibri" w:eastAsia="Calibri" w:hAnsi="Calibri"/>
+                <w:b w:val="false"/>
+                <w:bCs w:val="false"/>
+                <w:i w:val="false"/>
+                <w:iCs w:val="false"/>
+                <w:color w:val="6B7280"/>
+                <w:sz w:val="18"/>
+                <w:szCs w:val="18"/>
+              </w:rPr>
+              <w:t>skipOverseas (a saved-client tick box, or an optional field in INTUNE_CLIENTS_JSON) skips the sign-in query entirely and leaves the overseas section out of the report.</w:t>
+            </w:r>
+          </w:p>
+        </w:tc>
+      </w:tr>
+      <w:tr>
+        <w:tc>
+          <w:tcPr>
+            <w:tcW w:type="dxa" w:w="2995"/>
+            <w:tcBorders>
+              <w:top w:val="single" w:color="E5E7EB" w:sz="4"/>
+              <w:left w:val="single" w:color="E5E7EB" w:sz="4"/>
+              <w:bottom w:val="single" w:color="E5E7EB" w:sz="4"/>
+              <w:right w:val="single" w:color="E5E7EB" w:sz="4"/>
+            </w:tcBorders>
+            <w:shd w:fill="F9FAFB" w:val="clear"/>
+            <w:tcMar>
+              <w:top w:type="dxa" w:w="80"/>
+              <w:left w:type="dxa" w:w="120"/>
+              <w:bottom w:type="dxa" w:w="80"/>
+              <w:right w:type="dxa" w:w="120"/>
+            </w:tcMar>
+          </w:tcPr>
+          <w:p>
+            <w:pPr>
+              <w:spacing w:after="0" w:before="0"/>
+              <w:jc w:val="left"/>
+            </w:pPr>
+            <w:r>
+              <w:rPr>
+                <w:rFonts w:ascii="Calibri" w:cs="Calibri" w:eastAsia="Calibri" w:hAnsi="Calibri"/>
+                <w:b/>
+                <w:bCs/>
+                <w:i w:val="false"/>
+                <w:iCs w:val="false"/>
+                <w:color w:val="1F2937"/>
+                <w:sz w:val="18"/>
+                <w:szCs w:val="18"/>
+              </w:rPr>
+              <w:t>Compliance % definition</w:t>
+            </w:r>
+          </w:p>
+        </w:tc>
+        <w:tc>
+          <w:tcPr>
+            <w:tcW w:type="dxa" w:w="6365"/>
+            <w:tcBorders>
+              <w:top w:val="single" w:color="E5E7EB" w:sz="4"/>
+              <w:left w:val="single" w:color="E5E7EB" w:sz="4"/>
+              <w:bottom w:val="single" w:color="E5E7EB" w:sz="4"/>
+              <w:right w:val="single" w:color="E5E7EB" w:sz="4"/>
+            </w:tcBorders>
+            <w:shd w:fill="F9FAFB" w:val="clear"/>
+            <w:tcMar>
+              <w:top w:type="dxa" w:w="80"/>
+              <w:left w:type="dxa" w:w="120"/>
+              <w:bottom w:type="dxa" w:w="80"/>
+              <w:right w:type="dxa" w:w="120"/>
+            </w:tcMar>
+          </w:tcPr>
+          <w:p>
+            <w:pPr>
+              <w:spacing w:after="0" w:before="0"/>
+              <w:jc w:val="left"/>
+            </w:pPr>
+            <w:r>
+              <w:rPr>
+                <w:rFonts w:ascii="Calibri" w:cs="Calibri" w:eastAsia="Calibri" w:hAnsi="Calibri"/>
+                <w:b w:val="false"/>
+                <w:bCs w:val="false"/>
+                <w:i w:val="false"/>
+                <w:iCs w:val="false"/>
+                <w:color w:val="6B7280"/>
+                <w:sz w:val="18"/>
+                <w:szCs w:val="18"/>
+              </w:rPr>
+              <w:t>Devices compliant % = compliant ÷ (compliant + non-compliant): devices not evaluated are excluded. Ring colours: green ≥ 80%, orange 60–79%, red &lt; 60% (Secure Score: green ≥ 70, orange 50–69, red &lt; 50).</w:t>
+            </w:r>
+          </w:p>
+        </w:tc>
+      </w:tr>
+      <w:tr>
+        <w:tc>
+          <w:tcPr>
+            <w:tcW w:type="dxa" w:w="2995"/>
+            <w:tcBorders>
+              <w:top w:val="single" w:color="E5E7EB" w:sz="4"/>
+              <w:left w:val="single" w:color="E5E7EB" w:sz="4"/>
+              <w:bottom w:val="single" w:color="E5E7EB" w:sz="4"/>
+              <w:right w:val="single" w:color="E5E7EB" w:sz="4"/>
+            </w:tcBorders>
+            <w:shd w:fill="F9FAFB" w:val="clear"/>
+            <w:tcMar>
+              <w:top w:type="dxa" w:w="80"/>
+              <w:left w:type="dxa" w:w="120"/>
+              <w:bottom w:type="dxa" w:w="80"/>
+              <w:right w:type="dxa" w:w="120"/>
+            </w:tcMar>
+          </w:tcPr>
+          <w:p>
+            <w:pPr>
+              <w:spacing w:after="0" w:before="0"/>
+              <w:jc w:val="left"/>
+            </w:pPr>
+            <w:r>
+              <w:rPr>
+                <w:rFonts w:ascii="Calibri" w:cs="Calibri" w:eastAsia="Calibri" w:hAnsi="Calibri"/>
+                <w:b/>
+                <w:bCs/>
+                <w:i w:val="false"/>
+                <w:iCs w:val="false"/>
+                <w:color w:val="1F2937"/>
+                <w:sz w:val="18"/>
+                <w:szCs w:val="18"/>
+              </w:rPr>
+              <w:t>Licence ordering and colours</w:t>
+            </w:r>
+          </w:p>
+        </w:tc>
+        <w:tc>
+          <w:tcPr>
+            <w:tcW w:type="dxa" w:w="6365"/>
+            <w:tcBorders>
+              <w:top w:val="single" w:color="E5E7EB" w:sz="4"/>
+              <w:left w:val="single" w:color="E5E7EB" w:sz="4"/>
+              <w:bottom w:val="single" w:color="E5E7EB" w:sz="4"/>
+              <w:right w:val="single" w:color="E5E7EB" w:sz="4"/>
+            </w:tcBorders>
+            <w:shd w:fill="F9FAFB" w:val="clear"/>
+            <w:tcMar>
+              <w:top w:type="dxa" w:w="80"/>
+              <w:left w:type="dxa" w:w="120"/>
+              <w:bottom w:type="dxa" w:w="80"/>
+              <w:right w:type="dxa" w:w="120"/>
+            </w:tcMar>
+          </w:tcPr>
+          <w:p>
+            <w:pPr>
+              <w:spacing w:after="0" w:before="0"/>
+              <w:jc w:val="left"/>
+            </w:pPr>
+            <w:r>
+              <w:rPr>
+                <w:rFonts w:ascii="Calibri" w:cs="Calibri" w:eastAsia="Calibri" w:hAnsi="Calibri"/>
+                <w:b w:val="false"/>
+                <w:bCs w:val="false"/>
+                <w:i w:val="false"/>
+                <w:iCs w:val="false"/>
+                <w:color w:val="6B7280"/>
+                <w:sz w:val="18"/>
+                <w:szCs w:val="18"/>
+              </w:rPr>
+              <w:t>lib/licence-prices.js holds approximate per-seat prices used only to order paid licences by estimated spend (never displayed). Anything with “trial” in its name is treated as free. A bar is red only when over-assigned, blue at exactly 100%, orange at 90% or more; a licence with no purchased units shows n / n.</w:t>
             </w:r>
           </w:p>
         </w:tc>
@@ -5886,7 +6365,7 @@
                 <w:sz w:val="18"/>
                 <w:szCs w:val="18"/>
               </w:rPr>
-              <w:t xml:space="preserve">10-second function timeout</w:t>
+              <w:t>Netlify function timeout (10 seconds by default)</w:t>
             </w:r>
           </w:p>
         </w:tc>
@@ -5923,7 +6402,7 @@
                 <w:sz w:val="18"/>
                 <w:szCs w:val="18"/>
               </w:rPr>
-              <w:t xml:space="preserve">Netlify free tier hard limit — very large tenants may see the sign-in log query time out and fall back to a shorter window</w:t>
+              <w:t>The site is on the Pro plan with no timeout override, so the 10-second default applies (up to 26 s is possible as a site setting, not enabled). The sign-in read has its own 9-second budget; date slices that don't finish are reported as ‘not checked’ rather than falling back to a shorter window</w:t>
             </w:r>
           </w:p>
         </w:tc>
@@ -6075,7 +6554,7 @@
                 <w:sz w:val="18"/>
                 <w:szCs w:val="18"/>
               </w:rPr>
-              <w:t xml:space="preserve">30 days by default, 90 days with Entra ID P2</w:t>
+              <w:t>30 days with Entra ID P1/P2, 7 days on free tenants. Older sign-ins cannot be retrieved and the report says so</w:t>
             </w:r>
           </w:p>
         </w:tc>

</xml_diff>

<commit_message>
Cover disclaimer + retention statement on the on-screen report and Word export (shared wording with the PDF cover); docs updated
Co-Authored-By: Claude Sonnet 5.5 <noreply@anthropic.com>
</commit_message>
<xml_diff>
--- a/docs/Intune_Report_Architecture.docx
+++ b/docs/Intune_Report_Architecture.docx
@@ -1520,7 +1520,7 @@
           <w:sz w:val="19"/>
           <w:szCs w:val="19"/>
         </w:rPr>
-        <w:t>The cover carries a disclaimer whose retention sentence depends on the metricsRetained flag from intune.js: either nothing is retained, or only summary figures are kept for up to 13 months Note: the on-screen report and the Word export carry no disclaimer or retention statement of their own.</w:t>
+        <w:t>The cover carries a disclaimer whose retention sentence depends on the metricsRetained flag from intune.js: either nothing is retained, or only summary figures are kept for up to 13 months The same cover disclaimer (one shared text in lib/report-disclaimer.js) also appears on the on-screen report and the Word export, so print-to-PDF carries it too; index.html keeps its own copy of the wording, which must be kept in sync.</w:t>
       </w:r>
     </w:p>
     <w:p>
@@ -1939,6 +1939,29 @@
           <w:szCs w:val="19"/>
         </w:rPr>
         <w:t>licence-prices.js — approximate per-seat licence prices, used only to order the licence list by estimated spend (prices are never shown); sortLicences() orders paid before free</w:t>
+      </w:r>
+    </w:p>
+    <w:p>
+      <w:pPr>
+        <w:pStyle w:val="ListParagraph"/>
+        <w:numPr>
+          <w:ilvl w:val="0"/>
+          <w:numId w:val="1"/>
+        </w:numPr>
+        <w:spacing w:after="60" w:before="40"/>
+      </w:pPr>
+      <w:r>
+        <w:rPr>
+          <w:rFonts w:ascii="Calibri" w:cs="Calibri" w:eastAsia="Calibri" w:hAnsi="Calibri"/>
+          <w:b w:val="false"/>
+          <w:bCs w:val="false"/>
+          <w:i w:val="false"/>
+          <w:iCs w:val="false"/>
+          <w:color w:val="1F2937"/>
+          <w:sz w:val="19"/>
+          <w:szCs w:val="19"/>
+        </w:rPr>
+        <w:t>report-disclaimer.js — the cover disclaimer and retention wording (driven by metricsRetained) shared by export-pdf.js and export-docx.js; index.html carries a synchronised copy for the on-screen report</w:t>
       </w:r>
     </w:p>
     <w:p>

</xml_diff>

<commit_message>
Docs: security safeguards, tested XSS escaping and known remaining exposure
Co-Authored-By: Claude Sonnet 5.5 <noreply@anthropic.com>
</commit_message>
<xml_diff>
--- a/docs/Intune_Report_Architecture.docx
+++ b/docs/Intune_Report_Architecture.docx
@@ -2849,7 +2849,7 @@
                 <w:sz w:val="18"/>
                 <w:szCs w:val="18"/>
               </w:rPr>
-              <w:t xml:space="preserve">Restrictive CSP in netlify.toml — script-src and style-src limited to self plus unsafe-inline for the SPA; connect-src limited to self, login.microsoftonline.com, and any *.netlify.app subdomain (to support Netlify deploy previews)</w:t>
+              <w:t>CSP in netlify.toml: script-src and style-src are limited to self plus unsafe-inline (the single-page app still uses inline scripts and click handlers, so this cannot yet be removed); connect-src is 'self' only (the page only ever calls its own site; Microsoft is called from the server); base-uri 'self', object-src 'none', form-action 'self' and frame-ancestors 'none'. Because inline scripts are allowed, preventing injection by escaping (next row) is the real protection</w:t>
             </w:r>
           </w:p>
         </w:tc>
@@ -2925,7 +2925,311 @@
                 <w:sz w:val="18"/>
                 <w:szCs w:val="18"/>
               </w:rPr>
-              <w:t>In-memory per-IP limits on intune.js (10 requests/5 min) and export-docx.js (20 requests/5 min) to reduce abuse risk. export-pdf.js, clients.js, report-data.js, and delete-client-metrics.js currently have no rate limiting</w:t>
+              <w:t>In-memory per-IP limits on intune.js (10 requests/5 min) and export-docx.js (20 requests/5 min) to reduce abuse risk, keyed on Netlify’s own x-nf-client-connection-ip header (X-Forwarded-For is client-supplied and was spoofable, so it is not used). export-pdf.js, clients.js, report-data.js, and delete-client-metrics.js currently have no rate limiting</w:t>
+            </w:r>
+          </w:p>
+        </w:tc>
+      </w:tr>
+      <w:tr>
+        <w:tc>
+          <w:tcPr>
+            <w:tcW w:type="dxa" w:w="2995"/>
+            <w:tcBorders>
+              <w:top w:val="single" w:color="E5E7EB" w:sz="4"/>
+              <w:left w:val="single" w:color="E5E7EB" w:sz="4"/>
+              <w:bottom w:val="single" w:color="E5E7EB" w:sz="4"/>
+              <w:right w:val="single" w:color="E5E7EB" w:sz="4"/>
+            </w:tcBorders>
+            <w:shd w:fill="FFFFFF" w:val="clear"/>
+            <w:tcMar>
+              <w:top w:type="dxa" w:w="80"/>
+              <w:left w:type="dxa" w:w="120"/>
+              <w:bottom w:type="dxa" w:w="80"/>
+              <w:right w:type="dxa" w:w="120"/>
+            </w:tcMar>
+          </w:tcPr>
+          <w:p>
+            <w:pPr>
+              <w:spacing w:after="0" w:before="0"/>
+              <w:jc w:val="left"/>
+            </w:pPr>
+            <w:r>
+              <w:rPr>
+                <w:rFonts w:ascii="Calibri" w:cs="Calibri" w:eastAsia="Calibri" w:hAnsi="Calibri"/>
+                <w:b/>
+                <w:bCs/>
+                <w:i w:val="false"/>
+                <w:iCs w:val="false"/>
+                <w:color w:val="1F2937"/>
+                <w:sz w:val="18"/>
+                <w:szCs w:val="18"/>
+              </w:rPr>
+              <w:t>Output escaping (XSS)</w:t>
+            </w:r>
+          </w:p>
+        </w:tc>
+        <w:tc>
+          <w:tcPr>
+            <w:tcW w:type="dxa" w:w="6365"/>
+            <w:tcBorders>
+              <w:top w:val="single" w:color="E5E7EB" w:sz="4"/>
+              <w:left w:val="single" w:color="E5E7EB" w:sz="4"/>
+              <w:bottom w:val="single" w:color="E5E7EB" w:sz="4"/>
+              <w:right w:val="single" w:color="E5E7EB" w:sz="4"/>
+            </w:tcBorders>
+            <w:shd w:fill="FFFFFF" w:val="clear"/>
+            <w:tcMar>
+              <w:top w:type="dxa" w:w="80"/>
+              <w:left w:type="dxa" w:w="120"/>
+              <w:bottom w:type="dxa" w:w="80"/>
+              <w:right w:type="dxa" w:w="120"/>
+            </w:tcMar>
+          </w:tcPr>
+          <w:p>
+            <w:pPr>
+              <w:spacing w:after="0" w:before="0"/>
+              <w:jc w:val="left"/>
+            </w:pPr>
+            <w:r>
+              <w:rPr>
+                <w:rFonts w:ascii="Calibri" w:cs="Calibri" w:eastAsia="Calibri" w:hAnsi="Calibri"/>
+                <w:b w:val="false"/>
+                <w:bCs w:val="false"/>
+                <w:i w:val="false"/>
+                <w:iCs w:val="false"/>
+                <w:color w:val="6B7280"/>
+                <w:sz w:val="18"/>
+                <w:szCs w:val="18"/>
+              </w:rPr>
+              <w:t>Every string that comes from a client tenant (device, user, group and site names, error text) is escaped before it is placed in the page: the report uses esc(), and the Diagnostics panel is built by buildDiagnosticsHtml() where every dynamic value goes through E(). The error banner escapes its message. The CSV download neutralises cells starting with = + - @ so spreadsheets do not run them as formulas. Tested by injecting a script payload into every text field of a sample result: nothing executed. The former review-page renderer, which did not escape, was removed. Saved client secrets live in the browser’s local storage, which is why this matters</w:t>
+            </w:r>
+          </w:p>
+        </w:tc>
+      </w:tr>
+      <w:tr>
+        <w:tc>
+          <w:tcPr>
+            <w:tcW w:type="dxa" w:w="2995"/>
+            <w:tcBorders>
+              <w:top w:val="single" w:color="E5E7EB" w:sz="4"/>
+              <w:left w:val="single" w:color="E5E7EB" w:sz="4"/>
+              <w:bottom w:val="single" w:color="E5E7EB" w:sz="4"/>
+              <w:right w:val="single" w:color="E5E7EB" w:sz="4"/>
+            </w:tcBorders>
+            <w:shd w:fill="FFFFFF" w:val="clear"/>
+            <w:tcMar>
+              <w:top w:type="dxa" w:w="80"/>
+              <w:left w:type="dxa" w:w="120"/>
+              <w:bottom w:type="dxa" w:w="80"/>
+              <w:right w:type="dxa" w:w="120"/>
+            </w:tcMar>
+          </w:tcPr>
+          <w:p>
+            <w:pPr>
+              <w:spacing w:after="0" w:before="0"/>
+              <w:jc w:val="left"/>
+            </w:pPr>
+            <w:r>
+              <w:rPr>
+                <w:rFonts w:ascii="Calibri" w:cs="Calibri" w:eastAsia="Calibri" w:hAnsi="Calibri"/>
+                <w:b/>
+                <w:bCs/>
+                <w:i w:val="false"/>
+                <w:iCs w:val="false"/>
+                <w:color w:val="1F2937"/>
+                <w:sz w:val="18"/>
+                <w:szCs w:val="18"/>
+              </w:rPr>
+              <w:t>Shared-secret comparison</w:t>
+            </w:r>
+          </w:p>
+        </w:tc>
+        <w:tc>
+          <w:tcPr>
+            <w:tcW w:type="dxa" w:w="6365"/>
+            <w:tcBorders>
+              <w:top w:val="single" w:color="E5E7EB" w:sz="4"/>
+              <w:left w:val="single" w:color="E5E7EB" w:sz="4"/>
+              <w:bottom w:val="single" w:color="E5E7EB" w:sz="4"/>
+              <w:right w:val="single" w:color="E5E7EB" w:sz="4"/>
+            </w:tcBorders>
+            <w:shd w:fill="FFFFFF" w:val="clear"/>
+            <w:tcMar>
+              <w:top w:type="dxa" w:w="80"/>
+              <w:left w:type="dxa" w:w="120"/>
+              <w:bottom w:type="dxa" w:w="80"/>
+              <w:right w:type="dxa" w:w="120"/>
+            </w:tcMar>
+          </w:tcPr>
+          <w:p>
+            <w:pPr>
+              <w:spacing w:after="0" w:before="0"/>
+              <w:jc w:val="left"/>
+            </w:pPr>
+            <w:r>
+              <w:rPr>
+                <w:rFonts w:ascii="Calibri" w:cs="Calibri" w:eastAsia="Calibri" w:hAnsi="Calibri"/>
+                <w:b w:val="false"/>
+                <w:bCs w:val="false"/>
+                <w:i w:val="false"/>
+                <w:iCs w:val="false"/>
+                <w:color w:val="6B7280"/>
+                <w:sz w:val="18"/>
+                <w:szCs w:val="18"/>
+              </w:rPr>
+              <w:t>The x-report-hub-key and x-admin-key checks use a constant-time comparison (lib/safe-equal.js: both values hashed, then crypto.timingSafeEqual)</w:t>
+            </w:r>
+          </w:p>
+        </w:tc>
+      </w:tr>
+      <w:tr>
+        <w:tc>
+          <w:tcPr>
+            <w:tcW w:type="dxa" w:w="2995"/>
+            <w:tcBorders>
+              <w:top w:val="single" w:color="E5E7EB" w:sz="4"/>
+              <w:left w:val="single" w:color="E5E7EB" w:sz="4"/>
+              <w:bottom w:val="single" w:color="E5E7EB" w:sz="4"/>
+              <w:right w:val="single" w:color="E5E7EB" w:sz="4"/>
+            </w:tcBorders>
+            <w:shd w:fill="FFFFFF" w:val="clear"/>
+            <w:tcMar>
+              <w:top w:type="dxa" w:w="80"/>
+              <w:left w:type="dxa" w:w="120"/>
+              <w:bottom w:type="dxa" w:w="80"/>
+              <w:right w:type="dxa" w:w="120"/>
+            </w:tcMar>
+          </w:tcPr>
+          <w:p>
+            <w:pPr>
+              <w:spacing w:after="0" w:before="0"/>
+              <w:jc w:val="left"/>
+            </w:pPr>
+            <w:r>
+              <w:rPr>
+                <w:rFonts w:ascii="Calibri" w:cs="Calibri" w:eastAsia="Calibri" w:hAnsi="Calibri"/>
+                <w:b/>
+                <w:bCs/>
+                <w:i w:val="false"/>
+                <w:iCs w:val="false"/>
+                <w:color w:val="1F2937"/>
+                <w:sz w:val="18"/>
+                <w:szCs w:val="18"/>
+              </w:rPr>
+              <w:t>Cross-origin access (CORS)</w:t>
+            </w:r>
+          </w:p>
+        </w:tc>
+        <w:tc>
+          <w:tcPr>
+            <w:tcW w:type="dxa" w:w="6365"/>
+            <w:tcBorders>
+              <w:top w:val="single" w:color="E5E7EB" w:sz="4"/>
+              <w:left w:val="single" w:color="E5E7EB" w:sz="4"/>
+              <w:bottom w:val="single" w:color="E5E7EB" w:sz="4"/>
+              <w:right w:val="single" w:color="E5E7EB" w:sz="4"/>
+            </w:tcBorders>
+            <w:shd w:fill="FFFFFF" w:val="clear"/>
+            <w:tcMar>
+              <w:top w:type="dxa" w:w="80"/>
+              <w:left w:type="dxa" w:w="120"/>
+              <w:bottom w:type="dxa" w:w="80"/>
+              <w:right w:type="dxa" w:w="120"/>
+            </w:tcMar>
+          </w:tcPr>
+          <w:p>
+            <w:pPr>
+              <w:spacing w:after="0" w:before="0"/>
+              <w:jc w:val="left"/>
+            </w:pPr>
+            <w:r>
+              <w:rPr>
+                <w:rFonts w:ascii="Calibri" w:cs="Calibri" w:eastAsia="Calibri" w:hAnsi="Calibri"/>
+                <w:b w:val="false"/>
+                <w:bCs w:val="false"/>
+                <w:i w:val="false"/>
+                <w:iCs w:val="false"/>
+                <w:color w:val="6B7280"/>
+                <w:sz w:val="18"/>
+                <w:szCs w:val="18"/>
+              </w:rPr>
+              <w:t>The browser app is same-origin, so the functions only allow https://integricitymsp.netlify.app as an origin; report-hub calls them server-to-server, which CORS does not affect</w:t>
+            </w:r>
+          </w:p>
+        </w:tc>
+      </w:tr>
+      <w:tr>
+        <w:tc>
+          <w:tcPr>
+            <w:tcW w:type="dxa" w:w="2995"/>
+            <w:tcBorders>
+              <w:top w:val="single" w:color="E5E7EB" w:sz="4"/>
+              <w:left w:val="single" w:color="E5E7EB" w:sz="4"/>
+              <w:bottom w:val="single" w:color="E5E7EB" w:sz="4"/>
+              <w:right w:val="single" w:color="E5E7EB" w:sz="4"/>
+            </w:tcBorders>
+            <w:shd w:fill="FFFFFF" w:val="clear"/>
+            <w:tcMar>
+              <w:top w:type="dxa" w:w="80"/>
+              <w:left w:type="dxa" w:w="120"/>
+              <w:bottom w:type="dxa" w:w="80"/>
+              <w:right w:type="dxa" w:w="120"/>
+            </w:tcMar>
+          </w:tcPr>
+          <w:p>
+            <w:pPr>
+              <w:spacing w:after="0" w:before="0"/>
+              <w:jc w:val="left"/>
+            </w:pPr>
+            <w:r>
+              <w:rPr>
+                <w:rFonts w:ascii="Calibri" w:cs="Calibri" w:eastAsia="Calibri" w:hAnsi="Calibri"/>
+                <w:b/>
+                <w:bCs/>
+                <w:i w:val="false"/>
+                <w:iCs w:val="false"/>
+                <w:color w:val="1F2937"/>
+                <w:sz w:val="18"/>
+                <w:szCs w:val="18"/>
+              </w:rPr>
+              <w:t>Known remaining exposure</w:t>
+            </w:r>
+          </w:p>
+        </w:tc>
+        <w:tc>
+          <w:tcPr>
+            <w:tcW w:type="dxa" w:w="6365"/>
+            <w:tcBorders>
+              <w:top w:val="single" w:color="E5E7EB" w:sz="4"/>
+              <w:left w:val="single" w:color="E5E7EB" w:sz="4"/>
+              <w:bottom w:val="single" w:color="E5E7EB" w:sz="4"/>
+              <w:right w:val="single" w:color="E5E7EB" w:sz="4"/>
+            </w:tcBorders>
+            <w:shd w:fill="FFFFFF" w:val="clear"/>
+            <w:tcMar>
+              <w:top w:type="dxa" w:w="80"/>
+              <w:left w:type="dxa" w:w="120"/>
+              <w:bottom w:type="dxa" w:w="80"/>
+              <w:right w:type="dxa" w:w="120"/>
+            </w:tcMar>
+          </w:tcPr>
+          <w:p>
+            <w:pPr>
+              <w:spacing w:after="0" w:before="0"/>
+              <w:jc w:val="left"/>
+            </w:pPr>
+            <w:r>
+              <w:rPr>
+                <w:rFonts w:ascii="Calibri" w:cs="Calibri" w:eastAsia="Calibri" w:hAnsi="Calibri"/>
+                <w:b w:val="false"/>
+                <w:bCs w:val="false"/>
+                <w:i w:val="false"/>
+                <w:iCs w:val="false"/>
+                <w:color w:val="6B7280"/>
+                <w:sz w:val="18"/>
+                <w:szCs w:val="18"/>
+              </w:rPr>
+              <w:t>(1) The whole repo root is published (publish = "."), so function source, README/DEPLOY and the docs folder are downloadable; no secrets are in them, but they should move under a dedicated public folder. (2) intune, export-docx and export-pdf are open endpoints (anyone can use them as a Graph proxy with their own credentials); the rate limit is the only brake and resets on cold start. (3) unsafe-inline remains in the CSP. (4) Saved client secrets are in browser local storage in plain text. (5) npm audit reports dompurify advisories pulled in by jspdf; the server-side export does not use the affected feature</w:t>
             </w:r>
           </w:p>
         </w:tc>

</xml_diff>

<commit_message>
Publish only public/ (index.html + logos): function source, docs, scripts and package.json no longer downloadable; server.js serves public/ with traversal guard; docs updated
Co-Authored-By: Claude Sonnet 5.5 <noreply@anthropic.com>
</commit_message>
<xml_diff>
--- a/docs/Intune_Report_Architecture.docx
+++ b/docs/Intune_Report_Architecture.docx
@@ -1024,7 +1024,7 @@
           <w:sz w:val="19"/>
           <w:szCs w:val="19"/>
         </w:rPr>
-        <w:t>A single HTML file containing all markup, CSS, and JavaScript. There is no build step or bundler — the file is served as-is by Netlify. It implements a 3-page wizard-style flow:</w:t>
+        <w:t>A single HTML file containing all markup, CSS, and JavaScript. There is no build step or bundler — the file (public/index.html) is served as-is by Netlify. It implements a 3-page wizard-style flow:</w:t>
       </w:r>
     </w:p>
     <w:p>
@@ -3192,7 +3192,7 @@
                 <w:sz w:val="18"/>
                 <w:szCs w:val="18"/>
               </w:rPr>
-              <w:t>Known remaining exposure</w:t>
+              <w:t>Published files</w:t>
             </w:r>
           </w:p>
         </w:tc>
@@ -3229,7 +3229,83 @@
                 <w:sz w:val="18"/>
                 <w:szCs w:val="18"/>
               </w:rPr>
-              <w:t>(1) The whole repo root is published (publish = "."), so function source, README/DEPLOY and the docs folder are downloadable; no secrets are in them, but they should move under a dedicated public folder. (2) intune, export-docx and export-pdf are open endpoints (anyone can use them as a Graph proxy with their own credentials); the rate limit is the only brake and resets on cold start. (3) unsafe-inline remains in the CSP. (4) Saved client secrets are in browser local storage in plain text. (5) npm audit reports dompurify advisories pulled in by jspdf; the server-side export does not use the affected feature</w:t>
+              <w:t>netlify.toml sets publish = "public": only public/index.html and the logo .b64 files are served. Function source, the docs folder, scripts, package.json and README/DEPLOY are outside it and return 404 on the live site. Netlify Functions are deployed from netlify/functions regardless of the publish folder, and server.js (local dev) mirrors this by serving only public/</w:t>
+            </w:r>
+          </w:p>
+        </w:tc>
+      </w:tr>
+      <w:tr>
+        <w:tc>
+          <w:tcPr>
+            <w:tcW w:type="dxa" w:w="2995"/>
+            <w:tcBorders>
+              <w:top w:val="single" w:color="E5E7EB" w:sz="4"/>
+              <w:left w:val="single" w:color="E5E7EB" w:sz="4"/>
+              <w:bottom w:val="single" w:color="E5E7EB" w:sz="4"/>
+              <w:right w:val="single" w:color="E5E7EB" w:sz="4"/>
+            </w:tcBorders>
+            <w:shd w:fill="FFFFFF" w:val="clear"/>
+            <w:tcMar>
+              <w:top w:type="dxa" w:w="80"/>
+              <w:left w:type="dxa" w:w="120"/>
+              <w:bottom w:type="dxa" w:w="80"/>
+              <w:right w:type="dxa" w:w="120"/>
+            </w:tcMar>
+          </w:tcPr>
+          <w:p>
+            <w:pPr>
+              <w:spacing w:after="0" w:before="0"/>
+              <w:jc w:val="left"/>
+            </w:pPr>
+            <w:r>
+              <w:rPr>
+                <w:rFonts w:ascii="Calibri" w:cs="Calibri" w:eastAsia="Calibri" w:hAnsi="Calibri"/>
+                <w:b/>
+                <w:bCs/>
+                <w:i w:val="false"/>
+                <w:iCs w:val="false"/>
+                <w:color w:val="1F2937"/>
+                <w:sz w:val="18"/>
+                <w:szCs w:val="18"/>
+              </w:rPr>
+              <w:t>Known remaining exposure</w:t>
+            </w:r>
+          </w:p>
+        </w:tc>
+        <w:tc>
+          <w:tcPr>
+            <w:tcW w:type="dxa" w:w="6365"/>
+            <w:tcBorders>
+              <w:top w:val="single" w:color="E5E7EB" w:sz="4"/>
+              <w:left w:val="single" w:color="E5E7EB" w:sz="4"/>
+              <w:bottom w:val="single" w:color="E5E7EB" w:sz="4"/>
+              <w:right w:val="single" w:color="E5E7EB" w:sz="4"/>
+            </w:tcBorders>
+            <w:shd w:fill="FFFFFF" w:val="clear"/>
+            <w:tcMar>
+              <w:top w:type="dxa" w:w="80"/>
+              <w:left w:type="dxa" w:w="120"/>
+              <w:bottom w:type="dxa" w:w="80"/>
+              <w:right w:type="dxa" w:w="120"/>
+            </w:tcMar>
+          </w:tcPr>
+          <w:p>
+            <w:pPr>
+              <w:spacing w:after="0" w:before="0"/>
+              <w:jc w:val="left"/>
+            </w:pPr>
+            <w:r>
+              <w:rPr>
+                <w:rFonts w:ascii="Calibri" w:cs="Calibri" w:eastAsia="Calibri" w:hAnsi="Calibri"/>
+                <w:b w:val="false"/>
+                <w:bCs w:val="false"/>
+                <w:i w:val="false"/>
+                <w:iCs w:val="false"/>
+                <w:color w:val="6B7280"/>
+                <w:sz w:val="18"/>
+                <w:szCs w:val="18"/>
+              </w:rPr>
+              <w:t>(1) intune, export-docx and export-pdf are open endpoints (anyone can use them as a Graph proxy with their own credentials); the rate limit is the only brake and resets on cold start. (2) unsafe-inline remains in the CSP. (3) Saved client secrets are in browser local storage in plain text. (4) npm audit reports dompurify advisories pulled in by jspdf; the server-side export does not use the affected feature</w:t>
             </w:r>
           </w:p>
         </w:tc>

</xml_diff>

<commit_message>
Docs: staff access key, endpoint gate, payload caps
Co-Authored-By: Claude Sonnet 5.5 <noreply@anthropic.com>
</commit_message>
<xml_diff>
--- a/docs/Intune_Report_Architecture.docx
+++ b/docs/Intune_Report_Architecture.docx
@@ -2925,7 +2925,7 @@
                 <w:sz w:val="18"/>
                 <w:szCs w:val="18"/>
               </w:rPr>
-              <w:t>In-memory per-IP limits on intune.js (10 requests/5 min) and export-docx.js (20 requests/5 min) to reduce abuse risk, keyed on Netlify’s own x-nf-client-connection-ip header (X-Forwarded-For is client-supplied and was spoofable, so it is not used). export-pdf.js, clients.js, report-data.js, and delete-client-metrics.js currently have no rate limiting</w:t>
+              <w:t>In-memory per-IP limits on intune.js (10 requests/5 min), export-docx.js and export-pdf.js (20 requests/5 min each) to reduce abuse risk, keyed on Netlify’s own x-nf-client-connection-ip header (X-Forwarded-For is client-supplied and was spoofable, so it is not used). The limiter resets on cold start, so it is a brake rather than a guarantee. clients.js, report-data.js and delete-client-metrics.js are protected by their shared keys instead</w:t>
             </w:r>
           </w:p>
         </w:tc>
@@ -2964,7 +2964,7 @@
                 <w:sz w:val="18"/>
                 <w:szCs w:val="18"/>
               </w:rPr>
-              <w:t>Output escaping (XSS)</w:t>
+              <w:t>Endpoint access control</w:t>
             </w:r>
           </w:p>
         </w:tc>
@@ -3001,7 +3001,7 @@
                 <w:sz w:val="18"/>
                 <w:szCs w:val="18"/>
               </w:rPr>
-              <w:t>Every string that comes from a client tenant (device, user, group and site names, error text) is escaped before it is placed in the page: the report uses esc(), and the Diagnostics panel is built by buildDiagnosticsHtml() where every dynamic value goes through E(). The error banner escapes its message. The CSV download neutralises cells starting with = + - @ so spreadsheets do not run them as formulas. Tested by injecting a script payload into every text field of a sample result: nothing executed. The former review-page renderer, which did not escape, was removed. Saved client secrets live in the browser’s local storage, which is why this matters</w:t>
+              <w:t>intune.js, export-docx.js and export-pdf.js require either x-app-key equal to APP_ACCESS_KEY (staff browsers; the page asks once per device and asks again if the key is rejected) or x-report-hub-key equal to REPORT_HUB_SHARED_KEY (report-hub, server to server). Compared in constant time (lib/require-app-access.js); the check fails closed, so with neither variable set every call is refused. The two export functions also cap the request body at 600 KB and reject arrays over 5,000 items or nesting over 12 levels (lib/payload-guard.js); real payloads are about 130 KB</w:t>
             </w:r>
           </w:p>
         </w:tc>
@@ -3040,7 +3040,7 @@
                 <w:sz w:val="18"/>
                 <w:szCs w:val="18"/>
               </w:rPr>
-              <w:t>Shared-secret comparison</w:t>
+              <w:t>Output escaping (XSS)</w:t>
             </w:r>
           </w:p>
         </w:tc>
@@ -3077,7 +3077,7 @@
                 <w:sz w:val="18"/>
                 <w:szCs w:val="18"/>
               </w:rPr>
-              <w:t>The x-report-hub-key and x-admin-key checks use a constant-time comparison (lib/safe-equal.js: both values hashed, then crypto.timingSafeEqual)</w:t>
+              <w:t>Every string that comes from a client tenant (device, user, group and site names, error text) is escaped before it is placed in the page: the report uses esc(), and the Diagnostics panel is built by buildDiagnosticsHtml() where every dynamic value goes through E(). The error banner escapes its message. The CSV download neutralises cells starting with = + - @ so spreadsheets do not run them as formulas. Tested by injecting a script payload into every text field of a sample result: nothing executed. The former review-page renderer, which did not escape, was removed. Saved client secrets live in the browser’s local storage, which is why this matters</w:t>
             </w:r>
           </w:p>
         </w:tc>
@@ -3116,7 +3116,7 @@
                 <w:sz w:val="18"/>
                 <w:szCs w:val="18"/>
               </w:rPr>
-              <w:t>Cross-origin access (CORS)</w:t>
+              <w:t>Shared-secret comparison</w:t>
             </w:r>
           </w:p>
         </w:tc>
@@ -3153,7 +3153,7 @@
                 <w:sz w:val="18"/>
                 <w:szCs w:val="18"/>
               </w:rPr>
-              <w:t>The browser app is same-origin, so the functions only allow https://integricitymsp.netlify.app as an origin; report-hub calls them server-to-server, which CORS does not affect</w:t>
+              <w:t>The x-report-hub-key and x-admin-key checks use a constant-time comparison (lib/safe-equal.js: both values hashed, then crypto.timingSafeEqual)</w:t>
             </w:r>
           </w:p>
         </w:tc>
@@ -3192,7 +3192,7 @@
                 <w:sz w:val="18"/>
                 <w:szCs w:val="18"/>
               </w:rPr>
-              <w:t>Published files</w:t>
+              <w:t>Cross-origin access (CORS)</w:t>
             </w:r>
           </w:p>
         </w:tc>
@@ -3229,7 +3229,7 @@
                 <w:sz w:val="18"/>
                 <w:szCs w:val="18"/>
               </w:rPr>
-              <w:t>netlify.toml sets publish = "public": only public/index.html and the logo .b64 files are served. Function source, the docs folder, scripts, package.json and README/DEPLOY are outside it and return 404 on the live site. Netlify Functions are deployed from netlify/functions regardless of the publish folder, and server.js (local dev) mirrors this by serving only public/</w:t>
+              <w:t>The browser app is same-origin, so the functions only allow https://integricitymsp.netlify.app as an origin; report-hub calls them server-to-server, which CORS does not affect</w:t>
             </w:r>
           </w:p>
         </w:tc>
@@ -3268,7 +3268,7 @@
                 <w:sz w:val="18"/>
                 <w:szCs w:val="18"/>
               </w:rPr>
-              <w:t>Known remaining exposure</w:t>
+              <w:t>Published files</w:t>
             </w:r>
           </w:p>
         </w:tc>
@@ -3305,7 +3305,83 @@
                 <w:sz w:val="18"/>
                 <w:szCs w:val="18"/>
               </w:rPr>
-              <w:t>(1) intune, export-docx and export-pdf are open endpoints (anyone can use them as a Graph proxy with their own credentials); the rate limit is the only brake and resets on cold start. (2) unsafe-inline remains in the CSP. (3) Saved client secrets are in browser local storage in plain text. (4) npm audit reports dompurify advisories pulled in by jspdf; the server-side export does not use the affected feature</w:t>
+              <w:t>netlify.toml sets publish = "public": only public/index.html and the logo .b64 files are served. Function source, the docs folder, scripts, package.json and README/DEPLOY are outside it and return 404 on the live site. Netlify Functions are deployed from netlify/functions regardless of the publish folder, and server.js (local dev) mirrors this by serving only public/</w:t>
+            </w:r>
+          </w:p>
+        </w:tc>
+      </w:tr>
+      <w:tr>
+        <w:tc>
+          <w:tcPr>
+            <w:tcW w:type="dxa" w:w="2995"/>
+            <w:tcBorders>
+              <w:top w:val="single" w:color="E5E7EB" w:sz="4"/>
+              <w:left w:val="single" w:color="E5E7EB" w:sz="4"/>
+              <w:bottom w:val="single" w:color="E5E7EB" w:sz="4"/>
+              <w:right w:val="single" w:color="E5E7EB" w:sz="4"/>
+            </w:tcBorders>
+            <w:shd w:fill="FFFFFF" w:val="clear"/>
+            <w:tcMar>
+              <w:top w:type="dxa" w:w="80"/>
+              <w:left w:type="dxa" w:w="120"/>
+              <w:bottom w:type="dxa" w:w="80"/>
+              <w:right w:type="dxa" w:w="120"/>
+            </w:tcMar>
+          </w:tcPr>
+          <w:p>
+            <w:pPr>
+              <w:spacing w:after="0" w:before="0"/>
+              <w:jc w:val="left"/>
+            </w:pPr>
+            <w:r>
+              <w:rPr>
+                <w:rFonts w:ascii="Calibri" w:cs="Calibri" w:eastAsia="Calibri" w:hAnsi="Calibri"/>
+                <w:b/>
+                <w:bCs/>
+                <w:i w:val="false"/>
+                <w:iCs w:val="false"/>
+                <w:color w:val="1F2937"/>
+                <w:sz w:val="18"/>
+                <w:szCs w:val="18"/>
+              </w:rPr>
+              <w:t>Known remaining exposure</w:t>
+            </w:r>
+          </w:p>
+        </w:tc>
+        <w:tc>
+          <w:tcPr>
+            <w:tcW w:type="dxa" w:w="6365"/>
+            <w:tcBorders>
+              <w:top w:val="single" w:color="E5E7EB" w:sz="4"/>
+              <w:left w:val="single" w:color="E5E7EB" w:sz="4"/>
+              <w:bottom w:val="single" w:color="E5E7EB" w:sz="4"/>
+              <w:right w:val="single" w:color="E5E7EB" w:sz="4"/>
+            </w:tcBorders>
+            <w:shd w:fill="FFFFFF" w:val="clear"/>
+            <w:tcMar>
+              <w:top w:type="dxa" w:w="80"/>
+              <w:left w:type="dxa" w:w="120"/>
+              <w:bottom w:type="dxa" w:w="80"/>
+              <w:right w:type="dxa" w:w="120"/>
+            </w:tcMar>
+          </w:tcPr>
+          <w:p>
+            <w:pPr>
+              <w:spacing w:after="0" w:before="0"/>
+              <w:jc w:val="left"/>
+            </w:pPr>
+            <w:r>
+              <w:rPr>
+                <w:rFonts w:ascii="Calibri" w:cs="Calibri" w:eastAsia="Calibri" w:hAnsi="Calibri"/>
+                <w:b w:val="false"/>
+                <w:bCs w:val="false"/>
+                <w:i w:val="false"/>
+                <w:iCs w:val="false"/>
+                <w:color w:val="6B7280"/>
+                <w:sz w:val="18"/>
+                <w:szCs w:val="18"/>
+              </w:rPr>
+              <w:t>(1) Access to intune, export-docx and export-pdf is a shared staff key (APP_ACCESS_KEY, sent as x-app-key), not individual sign-in; anyone holding the key can use the tool, and the key sits in each staff browser’s local storage. Microsoft sign-in is planned to replace it. (2) unsafe-inline remains in the CSP. (3) Saved client secrets are in browser local storage in plain text. (4) npm audit reports dompurify advisories pulled in by jspdf; the server-side export does not use the affected feature</w:t>
             </w:r>
           </w:p>
         </w:tc>
@@ -6535,7 +6611,7 @@
           <w:sz w:val="19"/>
           <w:szCs w:val="19"/>
         </w:rPr>
-        <w:t>Environment variables: REPORT_HUB_SHARED_KEY (auth for clients / report-data), INTUNE_CLIENTS_JSON (report-hub client credentials), and ARCHIVE_ADMIN_KEY (optional — enables delete-client-metrics.js, which refuses every call while it is unset). Netlify Blobs itself needs no variables.</w:t>
+        <w:t>Environment variables: APP_ACCESS_KEY (staff access key for intune / export-docx / export-pdf; every call is refused while unset), REPORT_HUB_SHARED_KEY (auth for clients / report-data, and accepted by the three browser endpoints for report-hub), INTUNE_CLIENTS_JSON (report-hub client credentials), and ARCHIVE_ADMIN_KEY (optional — enables delete-client-metrics.js, which refuses every call while it is unset). Netlify Blobs itself needs no variables.</w:t>
       </w:r>
     </w:p>
     <w:p>

</xml_diff>

<commit_message>
export-docx limit 30; temporary APP_ACCESS_DISABLED switch for the access gate
Co-Authored-By: Claude Sonnet 5.5 <noreply@anthropic.com>
</commit_message>
<xml_diff>
--- a/docs/Intune_Report_Architecture.docx
+++ b/docs/Intune_Report_Architecture.docx
@@ -2925,7 +2925,7 @@
                 <w:sz w:val="18"/>
                 <w:szCs w:val="18"/>
               </w:rPr>
-              <w:t>In-memory per-IP limits on intune.js (10 requests/5 min), export-docx.js (20 requests/5 min) and export-pdf.js (30 requests/5 min) to reduce abuse risk, keyed on Netlify’s own x-nf-client-connection-ip header (X-Forwarded-For is client-supplied and was spoofable, so it is not used). The limiter resets on cold start, so it is a brake rather than a guarantee. clients.js, report-data.js and delete-client-metrics.js are protected by their shared keys instead</w:t>
+              <w:t>In-memory per-IP limits on intune.js (10 requests/5 min), export-docx.js (30 requests/5 min) and export-pdf.js (30 requests/5 min) to reduce abuse risk, keyed on Netlify’s own x-nf-client-connection-ip header (X-Forwarded-For is client-supplied and was spoofable, so it is not used). The limiter resets on cold start, so it is a brake rather than a guarantee. clients.js, report-data.js and delete-client-metrics.js are protected by their shared keys instead</w:t>
             </w:r>
           </w:p>
         </w:tc>
@@ -3001,7 +3001,7 @@
                 <w:sz w:val="18"/>
                 <w:szCs w:val="18"/>
               </w:rPr>
-              <w:t>intune.js, export-docx.js and export-pdf.js require either x-app-key equal to APP_ACCESS_KEY (staff browsers; the page asks once per device and asks again if the key is rejected) or x-report-hub-key equal to REPORT_HUB_SHARED_KEY (report-hub, server to server). Compared in constant time (lib/require-app-access.js); the check fails closed, so with neither variable set every call is refused. The two export functions also cap the request body at 600 KB and reject arrays over 5,000 items or nesting over 12 levels (lib/payload-guard.js); real payloads are about 130 KB</w:t>
+              <w:t>intune.js, export-docx.js and export-pdf.js require either x-app-key equal to APP_ACCESS_KEY (staff browsers; the page asks once per device and asks again if the key is rejected) or x-report-hub-key equal to REPORT_HUB_SHARED_KEY (report-hub, server to server). Compared in constant time (lib/require-app-access.js); the check fails closed, so with neither variable set every call is refused. The two export functions also cap the request body at 600 KB and reject arrays over 5,000 items or nesting over 12 levels (lib/payload-guard.js); real payloads are about 130 KB. TEMPORARY: while the environment variable APP_ACCESS_DISABLED is true the check is skipped and these endpoints are open again (set for operational reasons on 2026-10-27; delete the variable to switch the gate back on)</w:t>
             </w:r>
           </w:p>
         </w:tc>

</xml_diff>